<commit_message>
revise section 2.1 dataset and experiment setup
</commit_message>
<xml_diff>
--- a/word_output/2026.09.18v.docx
+++ b/word_output/2026.09.18v.docx
@@ -8299,7 +8299,7 @@
           <w:color w:val="000000"/>
           <w:szCs w:val="32"/>
         </w:rPr>
-        <w:t xml:space="preserve">2.1 </w:t>
+        <w:t xml:space="preserve">2.1 数据集与实验设置</w:t>
       </w:r>
       <w:r>
         <w:rPr>
@@ -8309,7 +8309,7 @@
           <w:color w:val="000000"/>
           <w:szCs w:val="32"/>
         </w:rPr>
-        <w:t>数据集与运行环境</w:t>
+        <w:t/>
       </w:r>
     </w:p>
     <w:p>
@@ -8317,199 +8317,199 @@
         <w:rPr>
           <w:color w:val="000000"/>
         </w:rPr>
-        <w:t>实验使用</w:t>
-      </w:r>
-      <w:r>
-        <w:rPr>
-          <w:color w:val="000000"/>
-        </w:rPr>
-        <w:t>CESNET TS-Zoo</w:t>
-      </w:r>
-      <w:r>
-        <w:rPr>
-          <w:color w:val="000000"/>
-        </w:rPr>
-        <w:t>公开的</w:t>
-      </w:r>
-      <w:r>
-        <w:rPr>
-          <w:color w:val="000000"/>
-        </w:rPr>
-        <w:t>Abilene</w:t>
-      </w:r>
-      <w:r>
-        <w:rPr>
-          <w:color w:val="000000"/>
-        </w:rPr>
-        <w:t>骨干网</w:t>
-      </w:r>
-      <w:r>
-        <w:rPr>
-          <w:color w:val="000000"/>
-        </w:rPr>
-        <w:t>1 h</w:t>
-      </w:r>
-      <w:r>
-        <w:rPr>
-          <w:color w:val="000000"/>
-        </w:rPr>
-        <w:t>聚合流量矩阵，从字段</w:t>
-      </w:r>
-      <w:r>
-        <w:rPr>
-          <w:color w:val="000000"/>
-        </w:rPr>
-        <w:t>matrix_avg_realOD</w:t>
-      </w:r>
-      <w:r>
-        <w:rPr>
-          <w:color w:val="000000"/>
-        </w:rPr>
-        <w:t>提取</w:t>
-      </w:r>
-      <w:r>
-        <w:rPr>
-          <w:color w:val="000000"/>
-        </w:rPr>
-        <w:t>144</w:t>
-      </w:r>
-      <w:r>
-        <w:rPr>
-          <w:color w:val="000000"/>
-        </w:rPr>
-        <w:t>维有效</w:t>
-      </w:r>
-      <w:r>
-        <w:rPr>
-          <w:color w:val="000000"/>
-        </w:rPr>
-        <w:t>OD</w:t>
-      </w:r>
-      <w:r>
-        <w:rPr>
-          <w:color w:val="000000"/>
-        </w:rPr>
-        <w:t>序列，共</w:t>
-      </w:r>
-      <w:r>
-        <w:rPr>
-          <w:color w:val="000000"/>
-        </w:rPr>
-        <w:t>4656</w:t>
-      </w:r>
-      <w:r>
-        <w:rPr>
-          <w:color w:val="000000"/>
-        </w:rPr>
-        <w:t>个时间点。训练集、验证集和测试集按时间顺序分别包含</w:t>
-      </w:r>
-      <w:r>
-        <w:rPr>
-          <w:color w:val="000000"/>
-        </w:rPr>
-        <w:t>2793</w:t>
-      </w:r>
-      <w:r>
-        <w:rPr>
-          <w:color w:val="000000"/>
-        </w:rPr>
-        <w:t>、</w:t>
-      </w:r>
-      <w:r>
-        <w:rPr>
-          <w:color w:val="000000"/>
-        </w:rPr>
-        <w:t>931</w:t>
-      </w:r>
-      <w:r>
-        <w:rPr>
-          <w:color w:val="000000"/>
-        </w:rPr>
-        <w:t>和</w:t>
-      </w:r>
-      <w:r>
-        <w:rPr>
-          <w:color w:val="000000"/>
-        </w:rPr>
-        <w:t>932</w:t>
-      </w:r>
-      <w:r>
-        <w:rPr>
-          <w:color w:val="000000"/>
-        </w:rPr>
-        <w:t>个时间点。在</w:t>
-      </w:r>
-      <w:r>
-        <w:rPr>
-          <w:color w:val="000000"/>
-        </w:rPr>
-        <w:t>L=96</w:t>
-      </w:r>
-      <w:r>
-        <w:rPr>
-          <w:color w:val="000000"/>
-        </w:rPr>
-        <w:t>、</w:t>
-      </w:r>
-      <w:r>
-        <w:rPr>
-          <w:color w:val="000000"/>
-        </w:rPr>
-        <w:t>H=24</w:t>
-      </w:r>
-      <w:r>
-        <w:rPr>
-          <w:color w:val="000000"/>
-        </w:rPr>
-        <w:t>的条件下，三个集合分别形成</w:t>
-      </w:r>
-      <w:r>
-        <w:rPr>
-          <w:color w:val="000000"/>
-        </w:rPr>
-        <w:t>2674</w:t>
-      </w:r>
-      <w:r>
-        <w:rPr>
-          <w:color w:val="000000"/>
-        </w:rPr>
-        <w:t>、</w:t>
-      </w:r>
-      <w:r>
-        <w:rPr>
-          <w:color w:val="000000"/>
-        </w:rPr>
-        <w:t>812</w:t>
-      </w:r>
-      <w:r>
-        <w:rPr>
-          <w:color w:val="000000"/>
-        </w:rPr>
-        <w:t>和</w:t>
-      </w:r>
-      <w:r>
-        <w:rPr>
-          <w:color w:val="000000"/>
-        </w:rPr>
-        <w:t>813</w:t>
-      </w:r>
-      <w:r>
-        <w:rPr>
-          <w:color w:val="000000"/>
-        </w:rPr>
-        <w:t>个滑动窗口。数据执行</w:t>
-      </w:r>
-      <w:r>
-        <w:rPr>
-          <w:color w:val="000000"/>
-        </w:rPr>
-        <w:t>log(1+x)</w:t>
-      </w:r>
-      <w:r>
-        <w:rPr>
-          <w:color w:val="000000"/>
-        </w:rPr>
-        <w:t>变换，再使用训练集逐变量统计量标准化。</w:t>
+        <w:t>实验使用CESNET TS-Zoo公开的Abilene骨干网1 h聚合流量矩阵，从字段matrix_avg_realOD提取144维有效OD流量序列，共4656个时间点。按照时间顺序以6∶2∶2划分训练集、验证集和测试集，分别包含2793、931和932个时间点。在输入长度L=96、预测长度H=24的条件下，各集合分别形成2674、812和813个滑动窗口。数据预处理与第1.1节一致，先进行log(1+x)变换，再使用训练集统计量按变量标准化；各集合独立构造窗口，不跨越数据集边界。</w:t>
+      </w:r>
+      <w:r>
+        <w:rPr>
+          <w:color w:val="000000"/>
+        </w:rPr>
+        <w:t/>
+      </w:r>
+      <w:r>
+        <w:rPr>
+          <w:color w:val="000000"/>
+        </w:rPr>
+        <w:t/>
+      </w:r>
+      <w:r>
+        <w:rPr>
+          <w:color w:val="000000"/>
+        </w:rPr>
+        <w:t/>
+      </w:r>
+      <w:r>
+        <w:rPr>
+          <w:color w:val="000000"/>
+        </w:rPr>
+        <w:t/>
+      </w:r>
+      <w:r>
+        <w:rPr>
+          <w:color w:val="000000"/>
+        </w:rPr>
+        <w:t/>
+      </w:r>
+      <w:r>
+        <w:rPr>
+          <w:color w:val="000000"/>
+        </w:rPr>
+        <w:t/>
+      </w:r>
+      <w:r>
+        <w:rPr>
+          <w:color w:val="000000"/>
+        </w:rPr>
+        <w:t/>
+      </w:r>
+      <w:r>
+        <w:rPr>
+          <w:color w:val="000000"/>
+        </w:rPr>
+        <w:t/>
+      </w:r>
+      <w:r>
+        <w:rPr>
+          <w:color w:val="000000"/>
+        </w:rPr>
+        <w:t/>
+      </w:r>
+      <w:r>
+        <w:rPr>
+          <w:color w:val="000000"/>
+        </w:rPr>
+        <w:t/>
+      </w:r>
+      <w:r>
+        <w:rPr>
+          <w:color w:val="000000"/>
+        </w:rPr>
+        <w:t/>
+      </w:r>
+      <w:r>
+        <w:rPr>
+          <w:color w:val="000000"/>
+        </w:rPr>
+        <w:t/>
+      </w:r>
+      <w:r>
+        <w:rPr>
+          <w:color w:val="000000"/>
+        </w:rPr>
+        <w:t/>
+      </w:r>
+      <w:r>
+        <w:rPr>
+          <w:color w:val="000000"/>
+        </w:rPr>
+        <w:t/>
+      </w:r>
+      <w:r>
+        <w:rPr>
+          <w:color w:val="000000"/>
+        </w:rPr>
+        <w:t/>
+      </w:r>
+      <w:r>
+        <w:rPr>
+          <w:color w:val="000000"/>
+        </w:rPr>
+        <w:t/>
+      </w:r>
+      <w:r>
+        <w:rPr>
+          <w:color w:val="000000"/>
+        </w:rPr>
+        <w:t/>
+      </w:r>
+      <w:r>
+        <w:rPr>
+          <w:color w:val="000000"/>
+        </w:rPr>
+        <w:t/>
+      </w:r>
+      <w:r>
+        <w:rPr>
+          <w:color w:val="000000"/>
+        </w:rPr>
+        <w:t/>
+      </w:r>
+      <w:r>
+        <w:rPr>
+          <w:color w:val="000000"/>
+        </w:rPr>
+        <w:t/>
+      </w:r>
+      <w:r>
+        <w:rPr>
+          <w:color w:val="000000"/>
+        </w:rPr>
+        <w:t/>
+      </w:r>
+      <w:r>
+        <w:rPr>
+          <w:color w:val="000000"/>
+        </w:rPr>
+        <w:t/>
+      </w:r>
+      <w:r>
+        <w:rPr>
+          <w:color w:val="000000"/>
+        </w:rPr>
+        <w:t/>
+      </w:r>
+      <w:r>
+        <w:rPr>
+          <w:color w:val="000000"/>
+        </w:rPr>
+        <w:t/>
+      </w:r>
+      <w:r>
+        <w:rPr>
+          <w:color w:val="000000"/>
+        </w:rPr>
+        <w:t/>
+      </w:r>
+      <w:r>
+        <w:rPr>
+          <w:color w:val="000000"/>
+        </w:rPr>
+        <w:t/>
+      </w:r>
+      <w:r>
+        <w:rPr>
+          <w:color w:val="000000"/>
+        </w:rPr>
+        <w:t/>
+      </w:r>
+      <w:r>
+        <w:rPr>
+          <w:color w:val="000000"/>
+        </w:rPr>
+        <w:t/>
+      </w:r>
+      <w:r>
+        <w:rPr>
+          <w:color w:val="000000"/>
+        </w:rPr>
+        <w:t/>
+      </w:r>
+      <w:r>
+        <w:rPr>
+          <w:color w:val="000000"/>
+        </w:rPr>
+        <w:t/>
+      </w:r>
+      <w:r>
+        <w:rPr>
+          <w:color w:val="000000"/>
+        </w:rPr>
+        <w:t/>
+      </w:r>
+      <w:r>
+        <w:rPr>
+          <w:color w:val="000000"/>
+        </w:rPr>
+        <w:t/>
       </w:r>
     </w:p>
     <w:p>
@@ -8517,195 +8517,159 @@
         <w:rPr>
           <w:color w:val="000000"/>
         </w:rPr>
-        <w:t>实验模型采用自适应矩估计（</w:t>
-      </w:r>
-      <w:r>
-        <w:rPr>
-          <w:color w:val="000000"/>
-        </w:rPr>
-        <w:t>adaptive moment estimation</w:t>
-      </w:r>
-      <w:r>
-        <w:rPr>
-          <w:color w:val="000000"/>
-        </w:rPr>
-        <w:t>，</w:t>
-      </w:r>
-      <w:r>
-        <w:rPr>
-          <w:color w:val="000000"/>
-        </w:rPr>
-        <w:t>Adam</w:t>
-      </w:r>
-      <w:r>
-        <w:rPr>
-          <w:color w:val="000000"/>
-        </w:rPr>
-        <w:t>）优化器，学习率</w:t>
-      </w:r>
-      <w:r>
-        <w:rPr>
-          <w:color w:val="000000"/>
-        </w:rPr>
-        <w:t>0.001</w:t>
-      </w:r>
-      <w:r>
-        <w:rPr>
-          <w:color w:val="000000"/>
-        </w:rPr>
-        <w:t>，批量大小</w:t>
-      </w:r>
-      <w:r>
-        <w:rPr>
-          <w:color w:val="000000"/>
-        </w:rPr>
-        <w:t>16</w:t>
-      </w:r>
-      <w:r>
-        <w:rPr>
-          <w:color w:val="000000"/>
-        </w:rPr>
-        <w:t>，最多训练</w:t>
-      </w:r>
-      <w:r>
-        <w:rPr>
-          <w:color w:val="000000"/>
-        </w:rPr>
-        <w:t>30</w:t>
-      </w:r>
-      <w:r>
-        <w:rPr>
-          <w:color w:val="000000"/>
-        </w:rPr>
-        <w:t>轮；验证集</w:t>
-      </w:r>
-      <w:r>
-        <w:rPr>
-          <w:color w:val="000000"/>
-        </w:rPr>
-        <w:t>MSE</w:t>
-      </w:r>
-      <w:r>
-        <w:rPr>
-          <w:color w:val="000000"/>
-        </w:rPr>
-        <w:t>连续</w:t>
-      </w:r>
-      <w:r>
-        <w:rPr>
-          <w:color w:val="000000"/>
-        </w:rPr>
-        <w:t>6</w:t>
-      </w:r>
-      <w:r>
-        <w:rPr>
-          <w:color w:val="000000"/>
-        </w:rPr>
-        <w:t>轮未改善时提前停止，并保留验证误差最低的参数。每个配置使用随机种子</w:t>
-      </w:r>
-      <w:r>
-        <w:rPr>
-          <w:color w:val="000000"/>
-        </w:rPr>
-        <w:t>42</w:t>
-      </w:r>
-      <w:r>
-        <w:rPr>
-          <w:color w:val="000000"/>
-        </w:rPr>
-        <w:t>、</w:t>
-      </w:r>
-      <w:r>
-        <w:rPr>
-          <w:color w:val="000000"/>
-        </w:rPr>
-        <w:t>43</w:t>
-      </w:r>
-      <w:r>
-        <w:rPr>
-          <w:color w:val="000000"/>
-        </w:rPr>
-        <w:t>和</w:t>
-      </w:r>
-      <w:r>
-        <w:rPr>
-          <w:color w:val="000000"/>
-        </w:rPr>
-        <w:t>44</w:t>
-      </w:r>
-      <w:r>
-        <w:rPr>
-          <w:color w:val="000000"/>
-        </w:rPr>
-        <w:t>独立训练。实验档案共含</w:t>
-      </w:r>
-      <w:r>
-        <w:rPr>
-          <w:color w:val="000000"/>
-        </w:rPr>
-        <w:t>48</w:t>
-      </w:r>
-      <w:r>
-        <w:rPr>
-          <w:color w:val="000000"/>
-        </w:rPr>
-        <w:t>次正式训练，每次保存评价指标、最佳检查点和预测数组，多尺度模型另保存测试窗口的路由权重。</w:t>
+        <w:t>实验在Windows系统、NVIDIA GTX 1060 6 GB显卡和PyTorch 2.5.1+cu118环境下完成。模型采用Adam优化器，学习率为0.001，批量大小为16，最多训练30轮；当验证集MSE连续6轮未改善时提前停止，并保留验证集MSE最低的模型参数。每个配置分别使用随机种子42、43和44独立训练，共完成48次正式训练。</w:t>
+      </w:r>
+      <w:r>
+        <w:rPr>
+          <w:color w:val="000000"/>
+        </w:rPr>
+        <w:t/>
+      </w:r>
+      <w:r>
+        <w:rPr>
+          <w:color w:val="000000"/>
+        </w:rPr>
+        <w:t/>
+      </w:r>
+      <w:r>
+        <w:rPr>
+          <w:color w:val="000000"/>
+        </w:rPr>
+        <w:t/>
+      </w:r>
+      <w:r>
+        <w:rPr>
+          <w:color w:val="000000"/>
+        </w:rPr>
+        <w:t/>
+      </w:r>
+      <w:r>
+        <w:rPr>
+          <w:color w:val="000000"/>
+        </w:rPr>
+        <w:t/>
+      </w:r>
+      <w:r>
+        <w:rPr>
+          <w:color w:val="000000"/>
+        </w:rPr>
+        <w:t/>
+      </w:r>
+      <w:r>
+        <w:rPr>
+          <w:color w:val="000000"/>
+        </w:rPr>
+        <w:t/>
+      </w:r>
+      <w:r>
+        <w:rPr>
+          <w:color w:val="000000"/>
+        </w:rPr>
+        <w:t/>
+      </w:r>
+      <w:r>
+        <w:rPr>
+          <w:color w:val="000000"/>
+        </w:rPr>
+        <w:t/>
+      </w:r>
+      <w:r>
+        <w:rPr>
+          <w:color w:val="000000"/>
+        </w:rPr>
+        <w:t/>
+      </w:r>
+      <w:r>
+        <w:rPr>
+          <w:color w:val="000000"/>
+        </w:rPr>
+        <w:t/>
+      </w:r>
+      <w:r>
+        <w:rPr>
+          <w:color w:val="000000"/>
+        </w:rPr>
+        <w:t/>
+      </w:r>
+      <w:r>
+        <w:rPr>
+          <w:color w:val="000000"/>
+        </w:rPr>
+        <w:t/>
+      </w:r>
+      <w:r>
+        <w:rPr>
+          <w:color w:val="000000"/>
+        </w:rPr>
+        <w:t/>
+      </w:r>
+      <w:r>
+        <w:rPr>
+          <w:color w:val="000000"/>
+        </w:rPr>
+        <w:t/>
+      </w:r>
+      <w:r>
+        <w:rPr>
+          <w:color w:val="000000"/>
+        </w:rPr>
+        <w:t/>
+      </w:r>
+      <w:r>
+        <w:rPr>
+          <w:color w:val="000000"/>
+        </w:rPr>
+        <w:t/>
+      </w:r>
+      <w:r>
+        <w:rPr>
+          <w:color w:val="000000"/>
+        </w:rPr>
+        <w:t/>
+      </w:r>
+      <w:r>
+        <w:rPr>
+          <w:color w:val="000000"/>
+        </w:rPr>
+        <w:t/>
+      </w:r>
+      <w:r>
+        <w:rPr>
+          <w:color w:val="000000"/>
+        </w:rPr>
+        <w:t/>
+      </w:r>
+      <w:r>
+        <w:rPr>
+          <w:color w:val="000000"/>
+        </w:rPr>
+        <w:t/>
+      </w:r>
+      <w:r>
+        <w:rPr>
+          <w:color w:val="000000"/>
+        </w:rPr>
+        <w:t/>
       </w:r>
     </w:p>
     <w:p>
-      <w:pPr>
-        <w:keepNext/>
-        <w:keepLines/>
-        <w:spacing w:before="80" w:after="20"/>
-        <w:ind w:firstLine="0"/>
-        <w:jc w:val="left"/>
-        <w:outlineLvl w:val="1"/>
-        <w:rPr>
-          <w:rFonts w:eastAsia="黑体"/>
-          <w:b/>
-          <w:bCs/>
-          <w:szCs w:val="32"/>
-        </w:rPr>
-      </w:pPr>
-      <w:r>
-        <w:rPr>
-          <w:rFonts w:ascii="Arial" w:eastAsia="黑体" w:hAnsi="Arial"/>
-          <w:b/>
-          <w:bCs/>
-          <w:color w:val="000000"/>
-          <w:szCs w:val="32"/>
-        </w:rPr>
-        <w:t xml:space="preserve">2.2 </w:t>
-      </w:r>
-      <w:r>
-        <w:rPr>
-          <w:rFonts w:ascii="Arial" w:eastAsia="黑体" w:hAnsi="Arial"/>
-          <w:b/>
-          <w:bCs/>
-          <w:color w:val="000000"/>
-          <w:szCs w:val="32"/>
-        </w:rPr>
-        <w:t>评价指标与统计方法</w:t>
-      </w:r>
-    </w:p>
-    <w:p>
-      <w:r>
-        <w:rPr>
-          <w:color w:val="000000"/>
-        </w:rPr>
-        <w:t>预测性能在标准化空间中评价。设测试集有</w:t>
-      </w:r>
-      <w:r>
-        <w:rPr>
-          <w:color w:val="000000"/>
-        </w:rPr>
-        <w:t>N_te</w:t>
-      </w:r>
-      <w:r>
-        <w:rPr>
-          <w:color w:val="000000"/>
-        </w:rPr>
-        <w:t>个窗口，平均绝对误差和均方根误差分别为</w:t>
+      <w:r>
+        <w:rPr>
+          <w:color w:val="000000"/>
+        </w:rPr>
+        <w:t>采用均方误差（mean squared error，MSE）、平均绝对误差（mean absolute error，MAE）和均方根误差（root mean squared error，RMSE）评价预测性能。设测试集包含N_te个窗口，则MAE和RMSE分别为</w:t>
+      </w:r>
+      <w:r>
+        <w:rPr>
+          <w:color w:val="000000"/>
+        </w:rPr>
+        <w:t/>
+      </w:r>
+      <w:r>
+        <w:rPr>
+          <w:color w:val="000000"/>
+        </w:rPr>
+        <w:t/>
       </w:r>
     </w:p>
     <w:p>
@@ -9105,241 +9069,241 @@
         <w:rPr>
           <w:color w:val="000000"/>
         </w:rPr>
-        <w:t>MSE</w:t>
-      </w:r>
-      <w:r>
-        <w:rPr>
-          <w:color w:val="000000"/>
-        </w:rPr>
-        <w:t>、</w:t>
-      </w:r>
-      <w:r>
-        <w:rPr>
-          <w:color w:val="000000"/>
-        </w:rPr>
-        <w:t>MAE</w:t>
-      </w:r>
-      <w:r>
-        <w:rPr>
-          <w:color w:val="000000"/>
-        </w:rPr>
-        <w:t>和均方根误差（</w:t>
-      </w:r>
-      <w:r>
-        <w:rPr>
-          <w:color w:val="000000"/>
-        </w:rPr>
-        <w:t>root mean squared error</w:t>
-      </w:r>
-      <w:r>
-        <w:rPr>
-          <w:color w:val="000000"/>
-        </w:rPr>
-        <w:t>，</w:t>
-      </w:r>
-      <w:r>
-        <w:rPr>
-          <w:color w:val="000000"/>
-        </w:rPr>
-        <w:t>RMSE</w:t>
-      </w:r>
-      <w:r>
-        <w:rPr>
-          <w:color w:val="000000"/>
-        </w:rPr>
-        <w:t>）均越小越好。由于</w:t>
-      </w:r>
-      <w:r>
-        <w:rPr>
-          <w:color w:val="000000"/>
-        </w:rPr>
-        <w:t>RMSE</w:t>
-      </w:r>
-      <w:r>
-        <w:rPr>
-          <w:color w:val="000000"/>
-        </w:rPr>
-        <w:t>是</w:t>
-      </w:r>
-      <w:r>
-        <w:rPr>
-          <w:color w:val="000000"/>
-        </w:rPr>
-        <w:t>MSE</w:t>
-      </w:r>
-      <w:r>
-        <w:rPr>
-          <w:color w:val="000000"/>
-        </w:rPr>
-        <w:t>的单调变换，正文表格主要列出</w:t>
-      </w:r>
-      <w:r>
-        <w:rPr>
-          <w:color w:val="000000"/>
-        </w:rPr>
-        <w:t>MSE</w:t>
-      </w:r>
-      <w:r>
-        <w:rPr>
-          <w:color w:val="000000"/>
-        </w:rPr>
-        <w:t>和</w:t>
-      </w:r>
-      <w:r>
-        <w:rPr>
-          <w:color w:val="000000"/>
-        </w:rPr>
-        <w:t>MAE</w:t>
-      </w:r>
-      <w:r>
-        <w:rPr>
-          <w:color w:val="000000"/>
-        </w:rPr>
-        <w:t>。每个配置以三个随机种子的均值</w:t>
-      </w:r>
-      <w:r>
-        <w:rPr>
-          <w:color w:val="000000"/>
-        </w:rPr>
-        <w:t>±</w:t>
-      </w:r>
-      <w:r>
-        <w:rPr>
-          <w:color w:val="000000"/>
-        </w:rPr>
-        <w:t>样本标准差报告。统计推断的独立重复单位为随机种子，即每个配置</w:t>
-      </w:r>
-      <w:r>
-        <w:rPr>
-          <w:color w:val="000000"/>
-        </w:rPr>
-        <w:t>n=3</w:t>
-      </w:r>
-      <w:r>
-        <w:rPr>
-          <w:color w:val="000000"/>
-        </w:rPr>
-        <w:t>，不能把</w:t>
-      </w:r>
-      <w:r>
-        <w:rPr>
-          <w:color w:val="000000"/>
-        </w:rPr>
-        <w:t>813</w:t>
-      </w:r>
-      <w:r>
-        <w:rPr>
-          <w:color w:val="000000"/>
-        </w:rPr>
-        <w:t>个测试窗口当作</w:t>
-      </w:r>
-      <w:r>
-        <w:rPr>
-          <w:color w:val="000000"/>
-        </w:rPr>
-        <w:t>813</w:t>
-      </w:r>
-      <w:r>
-        <w:rPr>
-          <w:color w:val="000000"/>
-        </w:rPr>
-        <w:t>次独立重复。固定权重与自适应权重使用相同种子进行双侧配对</w:t>
-      </w:r>
-      <w:r>
-        <w:rPr>
-          <w:color w:val="000000"/>
-        </w:rPr>
-        <w:t>t</w:t>
-      </w:r>
-      <w:r>
-        <w:rPr>
-          <w:color w:val="000000"/>
-        </w:rPr>
-        <w:t>检验，并报告配对差的</w:t>
-      </w:r>
-      <w:r>
-        <w:rPr>
-          <w:color w:val="000000"/>
-        </w:rPr>
-        <w:t>95%</w:t>
-      </w:r>
-      <w:r>
-        <w:rPr>
-          <w:color w:val="000000"/>
-        </w:rPr>
-        <w:t>置信区间（</w:t>
-      </w:r>
-      <w:r>
-        <w:rPr>
-          <w:color w:val="000000"/>
-        </w:rPr>
-        <w:t>confidence interval</w:t>
-      </w:r>
-      <w:r>
-        <w:rPr>
-          <w:color w:val="000000"/>
-        </w:rPr>
-        <w:t>，</w:t>
-      </w:r>
-      <w:r>
-        <w:rPr>
-          <w:color w:val="000000"/>
-        </w:rPr>
-        <w:t>CI</w:t>
-      </w:r>
-      <w:r>
-        <w:rPr>
-          <w:color w:val="000000"/>
-        </w:rPr>
-        <w:t>）及</w:t>
-      </w:r>
-      <w:r>
-        <w:rPr>
-          <w:color w:val="000000"/>
-        </w:rPr>
-        <w:t>Cohen's d_z</w:t>
-      </w:r>
-      <w:r>
-        <w:rPr>
-          <w:color w:val="000000"/>
-        </w:rPr>
-        <w:t>。在</w:t>
-      </w:r>
-      <w:r>
-        <w:rPr>
-          <w:color w:val="000000"/>
-        </w:rPr>
-        <w:t>r=0.50</w:t>
-      </w:r>
-      <w:r>
-        <w:rPr>
-          <w:color w:val="000000"/>
-        </w:rPr>
-        <w:t>下的两项预设权重比较使用</w:t>
-      </w:r>
-      <w:r>
-        <w:rPr>
-          <w:color w:val="000000"/>
-        </w:rPr>
-        <w:t>Holm</w:t>
-      </w:r>
-      <w:r>
-        <w:rPr>
-          <w:color w:val="000000"/>
-        </w:rPr>
-        <w:t>法校正。由于</w:t>
-      </w:r>
-      <w:r>
-        <w:rPr>
-          <w:color w:val="000000"/>
-        </w:rPr>
-        <w:t>n=3</w:t>
-      </w:r>
-      <w:r>
-        <w:rPr>
-          <w:color w:val="000000"/>
-        </w:rPr>
-        <w:t>无法可靠检验正态性，显著性结果仅作为均值、标准差和效应方向的补充。</w:t>
+        <w:t>上述指标均在标准化空间中计算，数值越小表示预测误差越低。由于RMSE是MSE的单调变换，正文表格主要报告MSE和MAE。各配置结果以3个随机种子的均值±样本标准差表示。固定权重与自适应权重使用相同随机种子进行双侧配对t检验，并报告配对差的95%置信区间（confidence interval，CI）及Cohen's d_z；r=0.50下的两项预设比较采用Holm法校正。鉴于独立重复数仅为3，统计检验仅作为误差均值和离散程度的补充，不将813个测试窗口视为独立重复。</w:t>
+      </w:r>
+      <w:r>
+        <w:rPr>
+          <w:color w:val="000000"/>
+        </w:rPr>
+        <w:t/>
+      </w:r>
+      <w:r>
+        <w:rPr>
+          <w:color w:val="000000"/>
+        </w:rPr>
+        <w:t/>
+      </w:r>
+      <w:r>
+        <w:rPr>
+          <w:color w:val="000000"/>
+        </w:rPr>
+        <w:t/>
+      </w:r>
+      <w:r>
+        <w:rPr>
+          <w:color w:val="000000"/>
+        </w:rPr>
+        <w:t/>
+      </w:r>
+      <w:r>
+        <w:rPr>
+          <w:color w:val="000000"/>
+        </w:rPr>
+        <w:t/>
+      </w:r>
+      <w:r>
+        <w:rPr>
+          <w:color w:val="000000"/>
+        </w:rPr>
+        <w:t/>
+      </w:r>
+      <w:r>
+        <w:rPr>
+          <w:color w:val="000000"/>
+        </w:rPr>
+        <w:t/>
+      </w:r>
+      <w:r>
+        <w:rPr>
+          <w:color w:val="000000"/>
+        </w:rPr>
+        <w:t/>
+      </w:r>
+      <w:r>
+        <w:rPr>
+          <w:color w:val="000000"/>
+        </w:rPr>
+        <w:t/>
+      </w:r>
+      <w:r>
+        <w:rPr>
+          <w:color w:val="000000"/>
+        </w:rPr>
+        <w:t/>
+      </w:r>
+      <w:r>
+        <w:rPr>
+          <w:color w:val="000000"/>
+        </w:rPr>
+        <w:t/>
+      </w:r>
+      <w:r>
+        <w:rPr>
+          <w:color w:val="000000"/>
+        </w:rPr>
+        <w:t/>
+      </w:r>
+      <w:r>
+        <w:rPr>
+          <w:color w:val="000000"/>
+        </w:rPr>
+        <w:t/>
+      </w:r>
+      <w:r>
+        <w:rPr>
+          <w:color w:val="000000"/>
+        </w:rPr>
+        <w:t/>
+      </w:r>
+      <w:r>
+        <w:rPr>
+          <w:color w:val="000000"/>
+        </w:rPr>
+        <w:t/>
+      </w:r>
+      <w:r>
+        <w:rPr>
+          <w:color w:val="000000"/>
+        </w:rPr>
+        <w:t/>
+      </w:r>
+      <w:r>
+        <w:rPr>
+          <w:color w:val="000000"/>
+        </w:rPr>
+        <w:t/>
+      </w:r>
+      <w:r>
+        <w:rPr>
+          <w:color w:val="000000"/>
+        </w:rPr>
+        <w:t/>
+      </w:r>
+      <w:r>
+        <w:rPr>
+          <w:color w:val="000000"/>
+        </w:rPr>
+        <w:t/>
+      </w:r>
+      <w:r>
+        <w:rPr>
+          <w:color w:val="000000"/>
+        </w:rPr>
+        <w:t/>
+      </w:r>
+      <w:r>
+        <w:rPr>
+          <w:color w:val="000000"/>
+        </w:rPr>
+        <w:t/>
+      </w:r>
+      <w:r>
+        <w:rPr>
+          <w:color w:val="000000"/>
+        </w:rPr>
+        <w:t/>
+      </w:r>
+      <w:r>
+        <w:rPr>
+          <w:color w:val="000000"/>
+        </w:rPr>
+        <w:t/>
+      </w:r>
+      <w:r>
+        <w:rPr>
+          <w:color w:val="000000"/>
+        </w:rPr>
+        <w:t/>
+      </w:r>
+      <w:r>
+        <w:rPr>
+          <w:color w:val="000000"/>
+        </w:rPr>
+        <w:t/>
+      </w:r>
+      <w:r>
+        <w:rPr>
+          <w:color w:val="000000"/>
+        </w:rPr>
+        <w:t/>
+      </w:r>
+      <w:r>
+        <w:rPr>
+          <w:color w:val="000000"/>
+        </w:rPr>
+        <w:t/>
+      </w:r>
+      <w:r>
+        <w:rPr>
+          <w:color w:val="000000"/>
+        </w:rPr>
+        <w:t/>
+      </w:r>
+      <w:r>
+        <w:rPr>
+          <w:color w:val="000000"/>
+        </w:rPr>
+        <w:t/>
+      </w:r>
+      <w:r>
+        <w:rPr>
+          <w:color w:val="000000"/>
+        </w:rPr>
+        <w:t/>
+      </w:r>
+      <w:r>
+        <w:rPr>
+          <w:color w:val="000000"/>
+        </w:rPr>
+        <w:t/>
+      </w:r>
+      <w:r>
+        <w:rPr>
+          <w:color w:val="000000"/>
+        </w:rPr>
+        <w:t/>
+      </w:r>
+      <w:r>
+        <w:rPr>
+          <w:color w:val="000000"/>
+        </w:rPr>
+        <w:t/>
+      </w:r>
+      <w:r>
+        <w:rPr>
+          <w:color w:val="000000"/>
+        </w:rPr>
+        <w:t/>
+      </w:r>
+      <w:r>
+        <w:rPr>
+          <w:color w:val="000000"/>
+        </w:rPr>
+        <w:t/>
+      </w:r>
+      <w:r>
+        <w:rPr>
+          <w:color w:val="000000"/>
+        </w:rPr>
+        <w:t/>
+      </w:r>
+      <w:r>
+        <w:rPr>
+          <w:color w:val="000000"/>
+        </w:rPr>
+        <w:t/>
+      </w:r>
+      <w:r>
+        <w:rPr>
+          <w:color w:val="000000"/>
+        </w:rPr>
+        <w:t/>
+      </w:r>
+      <w:r>
+        <w:rPr>
+          <w:color w:val="000000"/>
+        </w:rPr>
+        <w:t/>
       </w:r>
     </w:p>
     <w:p>

</xml_diff>

<commit_message>
revise section 2.2 base model comparison
</commit_message>
<xml_diff>
--- a/word_output/2026.09.18v.docx
+++ b/word_output/2026.09.18v.docx
@@ -9329,7 +9329,7 @@
           <w:color w:val="000000"/>
           <w:szCs w:val="32"/>
         </w:rPr>
-        <w:t xml:space="preserve">2.3 </w:t>
+        <w:t xml:space="preserve">2.2 基础模型对比与组件分析</w:t>
       </w:r>
       <w:r>
         <w:rPr>
@@ -9339,78 +9339,78 @@
           <w:color w:val="000000"/>
           <w:szCs w:val="32"/>
         </w:rPr>
-        <w:t>基础模型与组件消融</w:t>
+        <w:t/>
       </w:r>
     </w:p>
     <w:p>
       <w:r>
-        <w:t>表</w:t>
-      </w:r>
-      <w:r>
-        <w:t>1</w:t>
-      </w:r>
-      <w:r>
-        <w:t>比较五种基础配置。所有模型使用相同划分、输入输出长度、预处理和早停规则。</w:t>
-      </w:r>
-      <w:r>
-        <w:t>DLinear+</w:t>
-      </w:r>
-      <w:r>
-        <w:t>自适应多尺度取得最低平均误差，</w:t>
-      </w:r>
-      <w:r>
-        <w:t>MSE</w:t>
-      </w:r>
-      <w:r>
-        <w:t>为</w:t>
-      </w:r>
-      <w:r>
-        <w:t>0.186099</w:t>
-      </w:r>
-      <w:r>
-        <w:t>，较单尺度</w:t>
-      </w:r>
-      <w:r>
-        <w:t>DLinear</w:t>
-      </w:r>
-      <w:r>
-        <w:t>降低</w:t>
-      </w:r>
-      <w:r>
-        <w:t>4.06%</w:t>
-      </w:r>
-      <w:r>
-        <w:t>；</w:t>
-      </w:r>
-      <w:r>
-        <w:t>MAE</w:t>
-      </w:r>
-      <w:r>
-        <w:t>为</w:t>
-      </w:r>
-      <w:r>
-        <w:t>0.168203</w:t>
-      </w:r>
-      <w:r>
-        <w:t>，降低</w:t>
-      </w:r>
-      <w:r>
-        <w:t>10.52%</w:t>
-      </w:r>
-      <w:r>
-        <w:t>。这表明三种分辨率与样本级融合的组合能够为当前</w:t>
-      </w:r>
-      <w:r>
-        <w:t>Abilene</w:t>
-      </w:r>
-      <w:r>
-        <w:t>短期预测提供互补信息。随机种子分布及均值见图</w:t>
-      </w:r>
-      <w:r>
-        <w:t>2</w:t>
-      </w:r>
-      <w:r>
-        <w:t>。</w:t>
+        <w:t>表1给出不同基础模型及组件组合的预测结果。所有模型采用相同的数据划分、输入输出长度、预处理方式和早停策略。DLinear+自适应多尺度取得最低平均误差，MSE和MAE分别为0.186099和0.168203；与单尺度DLinear相比，MSE降低4.06%，MAE降低10.52%。说明在当前Abilene任务中，不同时间分辨率的尺度专家与样本级自适应融合能够形成互补预测，并有效降低整体误差。各模型在3个随机种子下的结果分布及均值见图2。</w:t>
+      </w:r>
+      <w:r>
+        <w:t/>
+      </w:r>
+      <w:r>
+        <w:t/>
+      </w:r>
+      <w:r>
+        <w:t/>
+      </w:r>
+      <w:r>
+        <w:t/>
+      </w:r>
+      <w:r>
+        <w:t/>
+      </w:r>
+      <w:r>
+        <w:t/>
+      </w:r>
+      <w:r>
+        <w:t/>
+      </w:r>
+      <w:r>
+        <w:t/>
+      </w:r>
+      <w:r>
+        <w:t/>
+      </w:r>
+      <w:r>
+        <w:t/>
+      </w:r>
+      <w:r>
+        <w:t/>
+      </w:r>
+      <w:r>
+        <w:t/>
+      </w:r>
+      <w:r>
+        <w:t/>
+      </w:r>
+      <w:r>
+        <w:t/>
+      </w:r>
+      <w:r>
+        <w:t/>
+      </w:r>
+      <w:r>
+        <w:t/>
+      </w:r>
+      <w:r>
+        <w:t/>
+      </w:r>
+      <w:r>
+        <w:t/>
+      </w:r>
+      <w:r>
+        <w:t/>
+      </w:r>
+      <w:r>
+        <w:t/>
+      </w:r>
+      <w:r>
+        <w:t/>
+      </w:r>
+      <w:r>
+        <w:t/>
       </w:r>
     </w:p>
     <w:p>
@@ -10453,175 +10453,175 @@
         <w:rPr>
           <w:color w:val="000000"/>
         </w:rPr>
-        <w:t>频域相关模型没有呈现同等收益。</w:t>
-      </w:r>
-      <w:r>
-        <w:rPr>
-          <w:color w:val="000000"/>
-        </w:rPr>
-        <w:t>FITS</w:t>
-      </w:r>
-      <w:r>
-        <w:rPr>
-          <w:color w:val="000000"/>
-        </w:rPr>
-        <w:t>和</w:t>
-      </w:r>
-      <w:r>
-        <w:rPr>
-          <w:color w:val="000000"/>
-        </w:rPr>
-        <w:t>DLinear+</w:t>
-      </w:r>
-      <w:r>
-        <w:rPr>
-          <w:color w:val="000000"/>
-        </w:rPr>
-        <w:t>频域门控的</w:t>
-      </w:r>
-      <w:r>
-        <w:rPr>
-          <w:color w:val="000000"/>
-        </w:rPr>
-        <w:t>MSE</w:t>
-      </w:r>
-      <w:r>
-        <w:rPr>
-          <w:color w:val="000000"/>
-        </w:rPr>
-        <w:t>分别比</w:t>
-      </w:r>
-      <w:r>
-        <w:rPr>
-          <w:color w:val="000000"/>
-        </w:rPr>
-        <w:t>DLinear</w:t>
-      </w:r>
-      <w:r>
-        <w:rPr>
-          <w:color w:val="000000"/>
-        </w:rPr>
-        <w:t>高</w:t>
-      </w:r>
-      <w:r>
-        <w:rPr>
-          <w:color w:val="000000"/>
-        </w:rPr>
-        <w:t>4.25%</w:t>
-      </w:r>
-      <w:r>
-        <w:rPr>
-          <w:color w:val="000000"/>
-        </w:rPr>
-        <w:t>和</w:t>
-      </w:r>
-      <w:r>
-        <w:rPr>
-          <w:color w:val="000000"/>
-        </w:rPr>
-        <w:t>1.65%</w:t>
-      </w:r>
-      <w:r>
-        <w:rPr>
-          <w:color w:val="000000"/>
-        </w:rPr>
-        <w:t>；在自适应多尺度模型上增加</w:t>
-      </w:r>
-      <w:r>
-        <w:rPr>
-          <w:color w:val="000000"/>
-        </w:rPr>
-        <w:t>r=0.50</w:t>
-      </w:r>
-      <w:r>
-        <w:rPr>
-          <w:color w:val="000000"/>
-        </w:rPr>
-        <w:t>的频域门控后，</w:t>
-      </w:r>
-      <w:r>
-        <w:rPr>
-          <w:color w:val="000000"/>
-        </w:rPr>
-        <w:t>MSE</w:t>
-      </w:r>
-      <w:r>
-        <w:rPr>
-          <w:color w:val="000000"/>
-        </w:rPr>
-        <w:t>由</w:t>
-      </w:r>
-      <w:r>
-        <w:rPr>
-          <w:color w:val="000000"/>
-        </w:rPr>
-        <w:t>0.186099</w:t>
-      </w:r>
-      <w:r>
-        <w:rPr>
-          <w:color w:val="000000"/>
-        </w:rPr>
-        <w:t>升至</w:t>
-      </w:r>
-      <w:r>
-        <w:rPr>
-          <w:color w:val="000000"/>
-        </w:rPr>
-        <w:t>0.192432</w:t>
-      </w:r>
-      <w:r>
-        <w:rPr>
-          <w:color w:val="000000"/>
-        </w:rPr>
-        <w:t>。完整模型仍比</w:t>
-      </w:r>
-      <w:r>
-        <w:rPr>
-          <w:color w:val="000000"/>
-        </w:rPr>
-        <w:t>DLinear</w:t>
-      </w:r>
-      <w:r>
-        <w:rPr>
-          <w:color w:val="000000"/>
-        </w:rPr>
-        <w:t>低</w:t>
-      </w:r>
-      <w:r>
-        <w:rPr>
-          <w:color w:val="000000"/>
-        </w:rPr>
-        <w:t>0.80%</w:t>
-      </w:r>
-      <w:r>
-        <w:rPr>
-          <w:color w:val="000000"/>
-        </w:rPr>
-        <w:t>，但该差异不能证明频域模块单独有效。由表</w:t>
-      </w:r>
-      <w:r>
-        <w:rPr>
-          <w:color w:val="000000"/>
-        </w:rPr>
-        <w:t>1</w:t>
-      </w:r>
-      <w:r>
-        <w:rPr>
-          <w:color w:val="000000"/>
-        </w:rPr>
-        <w:t>和图</w:t>
-      </w:r>
-      <w:r>
-        <w:rPr>
-          <w:color w:val="000000"/>
-        </w:rPr>
-        <w:t>2</w:t>
-      </w:r>
-      <w:r>
-        <w:rPr>
-          <w:color w:val="000000"/>
-        </w:rPr>
-        <w:t>可见，基础实验中的主要增益来自自适应多尺度，不来自低频门控。</w:t>
+        <w:t>频域相关配置未表现出与自适应多尺度相同的增益。FITS和DLinear+频域门控的MSE分别比DLinear高4.25%和1.65%；在自适应多尺度模型上加入r=0.50的频域门控后，MSE由0.186099升至0.192432，虽仍低于DLinear，但没有超过无频域自适应多尺度模型。由此可见，当前基础实验中的主要性能改善来自多尺度专家与自适应融合，而非低频门控。频域门控的作用将在后续频率保留比例敏感性实验中进一步分析。</w:t>
+      </w:r>
+      <w:r>
+        <w:rPr>
+          <w:color w:val="000000"/>
+        </w:rPr>
+        <w:t/>
+      </w:r>
+      <w:r>
+        <w:rPr>
+          <w:color w:val="000000"/>
+        </w:rPr>
+        <w:t/>
+      </w:r>
+      <w:r>
+        <w:rPr>
+          <w:color w:val="000000"/>
+        </w:rPr>
+        <w:t/>
+      </w:r>
+      <w:r>
+        <w:rPr>
+          <w:color w:val="000000"/>
+        </w:rPr>
+        <w:t/>
+      </w:r>
+      <w:r>
+        <w:rPr>
+          <w:color w:val="000000"/>
+        </w:rPr>
+        <w:t/>
+      </w:r>
+      <w:r>
+        <w:rPr>
+          <w:color w:val="000000"/>
+        </w:rPr>
+        <w:t/>
+      </w:r>
+      <w:r>
+        <w:rPr>
+          <w:color w:val="000000"/>
+        </w:rPr>
+        <w:t/>
+      </w:r>
+      <w:r>
+        <w:rPr>
+          <w:color w:val="000000"/>
+        </w:rPr>
+        <w:t/>
+      </w:r>
+      <w:r>
+        <w:rPr>
+          <w:color w:val="000000"/>
+        </w:rPr>
+        <w:t/>
+      </w:r>
+      <w:r>
+        <w:rPr>
+          <w:color w:val="000000"/>
+        </w:rPr>
+        <w:t/>
+      </w:r>
+      <w:r>
+        <w:rPr>
+          <w:color w:val="000000"/>
+        </w:rPr>
+        <w:t/>
+      </w:r>
+      <w:r>
+        <w:rPr>
+          <w:color w:val="000000"/>
+        </w:rPr>
+        <w:t/>
+      </w:r>
+      <w:r>
+        <w:rPr>
+          <w:color w:val="000000"/>
+        </w:rPr>
+        <w:t/>
+      </w:r>
+      <w:r>
+        <w:rPr>
+          <w:color w:val="000000"/>
+        </w:rPr>
+        <w:t/>
+      </w:r>
+      <w:r>
+        <w:rPr>
+          <w:color w:val="000000"/>
+        </w:rPr>
+        <w:t/>
+      </w:r>
+      <w:r>
+        <w:rPr>
+          <w:color w:val="000000"/>
+        </w:rPr>
+        <w:t/>
+      </w:r>
+      <w:r>
+        <w:rPr>
+          <w:color w:val="000000"/>
+        </w:rPr>
+        <w:t/>
+      </w:r>
+      <w:r>
+        <w:rPr>
+          <w:color w:val="000000"/>
+        </w:rPr>
+        <w:t/>
+      </w:r>
+      <w:r>
+        <w:rPr>
+          <w:color w:val="000000"/>
+        </w:rPr>
+        <w:t/>
+      </w:r>
+      <w:r>
+        <w:rPr>
+          <w:color w:val="000000"/>
+        </w:rPr>
+        <w:t/>
+      </w:r>
+      <w:r>
+        <w:rPr>
+          <w:color w:val="000000"/>
+        </w:rPr>
+        <w:t/>
+      </w:r>
+      <w:r>
+        <w:rPr>
+          <w:color w:val="000000"/>
+        </w:rPr>
+        <w:t/>
+      </w:r>
+      <w:r>
+        <w:rPr>
+          <w:color w:val="000000"/>
+        </w:rPr>
+        <w:t/>
+      </w:r>
+      <w:r>
+        <w:rPr>
+          <w:color w:val="000000"/>
+        </w:rPr>
+        <w:t/>
+      </w:r>
+      <w:r>
+        <w:rPr>
+          <w:color w:val="000000"/>
+        </w:rPr>
+        <w:t/>
+      </w:r>
+      <w:r>
+        <w:rPr>
+          <w:color w:val="000000"/>
+        </w:rPr>
+        <w:t/>
+      </w:r>
+      <w:r>
+        <w:rPr>
+          <w:color w:val="000000"/>
+        </w:rPr>
+        <w:t/>
+      </w:r>
+      <w:r>
+        <w:rPr>
+          <w:color w:val="000000"/>
+        </w:rPr>
+        <w:t/>
       </w:r>
     </w:p>
     <w:p>

</xml_diff>

<commit_message>
revise section 2.3 adaptive weight ablation
</commit_message>
<xml_diff>
--- a/word_output/2026.09.18v.docx
+++ b/word_output/2026.09.18v.docx
@@ -10647,7 +10647,7 @@
           <w:color w:val="000000"/>
           <w:szCs w:val="32"/>
         </w:rPr>
-        <w:t xml:space="preserve">2.4 </w:t>
+        <w:t xml:space="preserve">2.3 自适应尺度权重消融与路由分析</w:t>
       </w:r>
       <w:r>
         <w:rPr>
@@ -10657,7 +10657,7 @@
           <w:color w:val="000000"/>
           <w:szCs w:val="32"/>
         </w:rPr>
-        <w:t>自适应权重消融与路由行为</w:t>
+        <w:t/>
       </w:r>
     </w:p>
     <w:p>
@@ -10665,173 +10665,173 @@
         <w:rPr>
           <w:color w:val="000000"/>
         </w:rPr>
-        <w:t>为分离多尺度结构和权重生成方式的影响，表</w:t>
-      </w:r>
-      <w:r>
-        <w:rPr>
-          <w:color w:val="000000"/>
-        </w:rPr>
-        <w:t>2</w:t>
-      </w:r>
-      <w:r>
-        <w:rPr>
-          <w:color w:val="000000"/>
-        </w:rPr>
-        <w:t>在尺度集合与专家结构完全相同的条件下比较固定等权和自适应权重。无频域时，自适应模型相对固定等权模型的</w:t>
-      </w:r>
-      <w:r>
-        <w:rPr>
-          <w:color w:val="000000"/>
-        </w:rPr>
-        <w:t>MSE</w:t>
-      </w:r>
-      <w:r>
-        <w:rPr>
-          <w:color w:val="000000"/>
-        </w:rPr>
-        <w:t>降低</w:t>
-      </w:r>
-      <w:r>
-        <w:rPr>
-          <w:color w:val="000000"/>
-        </w:rPr>
-        <w:t>3.95%</w:t>
-      </w:r>
-      <w:r>
-        <w:rPr>
-          <w:color w:val="000000"/>
-        </w:rPr>
-        <w:t>，</w:t>
-      </w:r>
-      <w:r>
-        <w:rPr>
-          <w:color w:val="000000"/>
-        </w:rPr>
-        <w:t>MAE</w:t>
-      </w:r>
-      <w:r>
-        <w:rPr>
-          <w:color w:val="000000"/>
-        </w:rPr>
-        <w:t>降低</w:t>
-      </w:r>
-      <w:r>
-        <w:rPr>
-          <w:color w:val="000000"/>
-        </w:rPr>
-        <w:t>11.38%</w:t>
-      </w:r>
-      <w:r>
-        <w:rPr>
-          <w:color w:val="000000"/>
-        </w:rPr>
-        <w:t>。按种子计算的</w:t>
-      </w:r>
-      <w:r>
-        <w:rPr>
-          <w:color w:val="000000"/>
-        </w:rPr>
-        <w:t>MSE</w:t>
-      </w:r>
-      <w:r>
-        <w:rPr>
-          <w:color w:val="000000"/>
-        </w:rPr>
-        <w:t>平均配对差为</w:t>
-      </w:r>
-      <w:r>
-        <w:rPr>
-          <w:color w:val="000000"/>
-        </w:rPr>
-        <w:t>0.007651</w:t>
-      </w:r>
-      <w:r>
-        <w:rPr>
-          <w:color w:val="000000"/>
-        </w:rPr>
-        <w:t>，</w:t>
-      </w:r>
-      <w:r>
-        <w:rPr>
-          <w:color w:val="000000"/>
-        </w:rPr>
-        <w:t>95% CI</w:t>
-      </w:r>
-      <w:r>
-        <w:rPr>
-          <w:color w:val="000000"/>
-        </w:rPr>
-        <w:t>为</w:t>
-      </w:r>
-      <w:r>
-        <w:rPr>
-          <w:color w:val="000000"/>
-        </w:rPr>
-        <w:t>[0.005238, 0.010064]</w:t>
-      </w:r>
-      <w:r>
-        <w:rPr>
-          <w:color w:val="000000"/>
-        </w:rPr>
-        <w:t>，</w:t>
-      </w:r>
-      <w:r>
-        <w:rPr>
-          <w:color w:val="000000"/>
-        </w:rPr>
-        <w:t>t(2)=13.642</w:t>
-      </w:r>
-      <w:r>
-        <w:rPr>
-          <w:color w:val="000000"/>
-        </w:rPr>
-        <w:t>，</w:t>
-      </w:r>
-      <w:r>
-        <w:rPr>
-          <w:color w:val="000000"/>
-        </w:rPr>
-        <w:t>Holm</w:t>
-      </w:r>
-      <w:r>
-        <w:rPr>
-          <w:color w:val="000000"/>
-        </w:rPr>
-        <w:t>校正后</w:t>
-      </w:r>
-      <w:r>
-        <w:rPr>
-          <w:color w:val="000000"/>
-        </w:rPr>
-        <w:t>p=0.01066</w:t>
-      </w:r>
-      <w:r>
-        <w:rPr>
-          <w:color w:val="000000"/>
-        </w:rPr>
-        <w:t>，</w:t>
+        <w:t>为判断预测性能提升是来自多尺度结构本身还是样本级动态加权，表2在尺度集合、专家结构和训练设置保持一致的条件下，仅改变尺度权重的生成方式。无频域条件下，自适应权重模型的MSE由0.193750降至0.186099，下降3.95%；MAE由0.189802降至0.168203，下降11.38%。相同随机种子的MSE平均配对差为0.007651，95% CI为[0.005238, 0.010064]，t(2)=13.642，Holm校正后p=0.01066，Cohen's d_z=7.876。三个随机种子的误差变化方向一致，说明在当前主模型设置下，自适应尺度权重比固定等权融合更有利于降低预测误差；受独立重复数限制，效应量和置信区间仍需谨慎解释。同种子配对变化见图3。</w:t>
+      </w:r>
+      <w:r>
+        <w:rPr>
+          <w:color w:val="000000"/>
+        </w:rPr>
+        <w:t/>
+      </w:r>
+      <w:r>
+        <w:rPr>
+          <w:color w:val="000000"/>
+        </w:rPr>
+        <w:t/>
+      </w:r>
+      <w:r>
+        <w:rPr>
+          <w:color w:val="000000"/>
+        </w:rPr>
+        <w:t/>
+      </w:r>
+      <w:r>
+        <w:rPr>
+          <w:color w:val="000000"/>
+        </w:rPr>
+        <w:t/>
+      </w:r>
+      <w:r>
+        <w:rPr>
+          <w:color w:val="000000"/>
+        </w:rPr>
+        <w:t/>
+      </w:r>
+      <w:r>
+        <w:rPr>
+          <w:color w:val="000000"/>
+        </w:rPr>
+        <w:t/>
+      </w:r>
+      <w:r>
+        <w:rPr>
+          <w:color w:val="000000"/>
+        </w:rPr>
+        <w:t/>
+      </w:r>
+      <w:r>
+        <w:rPr>
+          <w:color w:val="000000"/>
+        </w:rPr>
+        <w:t/>
+      </w:r>
+      <w:r>
+        <w:rPr>
+          <w:color w:val="000000"/>
+        </w:rPr>
+        <w:t/>
+      </w:r>
+      <w:r>
+        <w:rPr>
+          <w:color w:val="000000"/>
+        </w:rPr>
+        <w:t/>
+      </w:r>
+      <w:r>
+        <w:rPr>
+          <w:color w:val="000000"/>
+        </w:rPr>
+        <w:t/>
+      </w:r>
+      <w:r>
+        <w:rPr>
+          <w:color w:val="000000"/>
+        </w:rPr>
+        <w:t/>
+      </w:r>
+      <w:r>
+        <w:rPr>
+          <w:color w:val="000000"/>
+        </w:rPr>
+        <w:t/>
+      </w:r>
+      <w:r>
+        <w:rPr>
+          <w:color w:val="000000"/>
+        </w:rPr>
+        <w:t/>
+      </w:r>
+      <w:r>
+        <w:rPr>
+          <w:color w:val="000000"/>
+        </w:rPr>
+        <w:t/>
+      </w:r>
+      <w:r>
+        <w:rPr>
+          <w:color w:val="000000"/>
+        </w:rPr>
+        <w:t/>
+      </w:r>
+      <w:r>
+        <w:rPr>
+          <w:color w:val="000000"/>
+        </w:rPr>
+        <w:t/>
+      </w:r>
+      <w:r>
+        <w:rPr>
+          <w:color w:val="000000"/>
+        </w:rPr>
+        <w:t/>
+      </w:r>
+      <w:r>
+        <w:rPr>
+          <w:color w:val="000000"/>
+        </w:rPr>
+        <w:t/>
+      </w:r>
+      <w:r>
+        <w:rPr>
+          <w:color w:val="000000"/>
+        </w:rPr>
+        <w:t/>
+      </w:r>
+      <w:r>
+        <w:rPr>
+          <w:color w:val="000000"/>
+        </w:rPr>
+        <w:t/>
+      </w:r>
+      <w:r>
+        <w:rPr>
+          <w:color w:val="000000"/>
+        </w:rPr>
+        <w:t/>
+      </w:r>
+      <w:r>
+        <w:rPr>
+          <w:color w:val="000000"/>
+        </w:rPr>
+        <w:t/>
+      </w:r>
+      <w:r>
+        <w:rPr>
+          <w:color w:val="000000"/>
+        </w:rPr>
+        <w:t/>
       </w:r>
       <w:r>
         <w:rPr>
           <w:color w:val="000000"/>
         </w:rPr>
         <w:lastRenderedPageBreak/>
-        <w:t>Cohen's d_z=7.876</w:t>
-      </w:r>
-      <w:r>
-        <w:rPr>
-          <w:color w:val="000000"/>
-        </w:rPr>
-        <w:t>。该结果在三个种子上方向一致，但效应量和置信区间建立在很少的算法重复上，应谨慎解释。</w:t>
-      </w:r>
-      <w:r>
-        <w:t>同种子配对变化见图</w:t>
-      </w:r>
-      <w:r>
-        <w:t>3</w:t>
-      </w:r>
-      <w:r>
-        <w:t>。</w:t>
+        <w:t/>
+      </w:r>
+      <w:r>
+        <w:rPr>
+          <w:color w:val="000000"/>
+        </w:rPr>
+        <w:t/>
+      </w:r>
+      <w:r>
+        <w:t/>
+      </w:r>
+      <w:r>
+        <w:t/>
+      </w:r>
+      <w:r>
+        <w:t/>
       </w:r>
     </w:p>
     <w:p>
@@ -11955,232 +11955,232 @@
         <w:rPr>
           <w:color w:val="000000"/>
         </w:rPr>
-        <w:t>在</w:t>
-      </w:r>
-      <w:r>
-        <w:rPr>
-          <w:color w:val="000000"/>
-        </w:rPr>
-        <w:t>r=0.50</w:t>
-      </w:r>
-      <w:r>
-        <w:rPr>
-          <w:color w:val="000000"/>
-        </w:rPr>
-        <w:t>时，自适应权重相对固定等权降低</w:t>
-      </w:r>
-      <w:r>
-        <w:rPr>
-          <w:color w:val="000000"/>
-        </w:rPr>
-        <w:t>MSE 3.97%</w:t>
-      </w:r>
-      <w:r>
-        <w:rPr>
-          <w:color w:val="000000"/>
-        </w:rPr>
-        <w:t>，但配对差</w:t>
-      </w:r>
-      <w:r>
-        <w:rPr>
-          <w:color w:val="000000"/>
-        </w:rPr>
-        <w:t>95% CI</w:t>
-      </w:r>
-      <w:r>
-        <w:rPr>
-          <w:color w:val="000000"/>
-        </w:rPr>
-        <w:t>为</w:t>
-      </w:r>
-      <w:r>
-        <w:rPr>
-          <w:color w:val="000000"/>
-        </w:rPr>
-        <w:t>[-0.001193, 0.017096]</w:t>
-      </w:r>
-      <w:r>
-        <w:rPr>
-          <w:color w:val="000000"/>
-        </w:rPr>
-        <w:t>，</w:t>
-      </w:r>
-      <w:r>
-        <w:rPr>
-          <w:color w:val="000000"/>
-        </w:rPr>
-        <w:t>Holm</w:t>
-      </w:r>
-      <w:r>
-        <w:rPr>
-          <w:color w:val="000000"/>
-        </w:rPr>
-        <w:t>校正后</w:t>
-      </w:r>
-      <w:r>
-        <w:rPr>
-          <w:color w:val="000000"/>
-        </w:rPr>
-        <w:t>p=0.06460</w:t>
-      </w:r>
-      <w:r>
-        <w:rPr>
-          <w:color w:val="000000"/>
-        </w:rPr>
-        <w:t>；在探索性</w:t>
-      </w:r>
-      <w:r>
-        <w:rPr>
-          <w:color w:val="000000"/>
-        </w:rPr>
-        <w:t>r=0.75</w:t>
-      </w:r>
-      <w:r>
-        <w:rPr>
-          <w:color w:val="000000"/>
-        </w:rPr>
-        <w:t>设置下，</w:t>
-      </w:r>
-      <w:r>
-        <w:rPr>
-          <w:color w:val="000000"/>
-        </w:rPr>
-        <w:t>MSE</w:t>
-      </w:r>
-      <w:r>
-        <w:rPr>
-          <w:color w:val="000000"/>
-        </w:rPr>
-        <w:t>和</w:t>
-      </w:r>
-      <w:r>
-        <w:rPr>
-          <w:color w:val="000000"/>
-        </w:rPr>
-        <w:t>MAE</w:t>
-      </w:r>
-      <w:r>
-        <w:rPr>
-          <w:color w:val="000000"/>
-        </w:rPr>
-        <w:t>分别降低</w:t>
-      </w:r>
-      <w:r>
-        <w:rPr>
-          <w:color w:val="000000"/>
-        </w:rPr>
-        <w:t>3.74%</w:t>
-      </w:r>
-      <w:r>
-        <w:rPr>
-          <w:color w:val="000000"/>
-        </w:rPr>
-        <w:t>和</w:t>
-      </w:r>
-      <w:r>
-        <w:rPr>
-          <w:color w:val="000000"/>
-        </w:rPr>
-        <w:t>11.51%</w:t>
-      </w:r>
-      <w:r>
-        <w:rPr>
-          <w:color w:val="000000"/>
-        </w:rPr>
-        <w:t>，配对差</w:t>
-      </w:r>
-      <w:r>
-        <w:rPr>
-          <w:color w:val="000000"/>
-        </w:rPr>
-        <w:t>95% CI</w:t>
-      </w:r>
-      <w:r>
-        <w:rPr>
-          <w:color w:val="000000"/>
-        </w:rPr>
-        <w:t>为</w:t>
-      </w:r>
-      <w:r>
-        <w:rPr>
-          <w:color w:val="000000"/>
-        </w:rPr>
-        <w:t>[-0.001770, 0.016493]</w:t>
-      </w:r>
-      <w:r>
-        <w:rPr>
-          <w:color w:val="000000"/>
-        </w:rPr>
-        <w:t>，</w:t>
-      </w:r>
-      <w:r>
-        <w:rPr>
-          <w:color w:val="000000"/>
-        </w:rPr>
-        <w:t>t(2)=3.469</w:t>
-      </w:r>
-      <w:r>
-        <w:rPr>
-          <w:color w:val="000000"/>
-        </w:rPr>
-        <w:t>，</w:t>
-      </w:r>
-      <w:r>
-        <w:rPr>
-          <w:color w:val="000000"/>
-        </w:rPr>
-        <w:t>p=0.07401</w:t>
-      </w:r>
-      <w:r>
-        <w:rPr>
-          <w:color w:val="000000"/>
-        </w:rPr>
-        <w:t>，</w:t>
-      </w:r>
-      <w:r>
-        <w:rPr>
-          <w:color w:val="000000"/>
-        </w:rPr>
-        <w:t>Cohen's d_z=2.003</w:t>
-      </w:r>
-      <w:r>
-        <w:rPr>
-          <w:color w:val="000000"/>
-        </w:rPr>
-        <w:t>。后两项区间跨越</w:t>
-      </w:r>
-      <w:r>
-        <w:rPr>
-          <w:color w:val="000000"/>
-        </w:rPr>
-        <w:t>0</w:t>
-      </w:r>
-      <w:r>
-        <w:rPr>
-          <w:color w:val="000000"/>
-        </w:rPr>
-        <w:t>，只能称为改善趋势。图</w:t>
-      </w:r>
-      <w:r>
-        <w:rPr>
-          <w:color w:val="000000"/>
-        </w:rPr>
-        <w:t>3</w:t>
-      </w:r>
-      <w:r>
-        <w:rPr>
-          <w:color w:val="000000"/>
-        </w:rPr>
-        <w:t>把同一种子的结果连接，可避免把总体均值差异误读为大量独立样本带来的显著性。</w:t>
-      </w:r>
-      <w:r>
-        <w:t>路由权重的样本变化与总体分布见图</w:t>
-      </w:r>
-      <w:r>
-        <w:t>4</w:t>
-      </w:r>
-      <w:r>
-        <w:t>。</w:t>
+        <w:t>加入频域门控后，自适应权重仍表现出较低的平均误差。r=0.50时，自适应权重相对固定等权的MSE降低3.97%，但配对差95% CI为[-0.001193, 0.017096]，Holm校正后p=0.06460；在探索性r=0.75设置下，MSE和MAE分别降低3.74%和11.51%，配对差95% CI为[-0.001770, 0.016493]，t(2)=3.469，p=0.07401，Cohen's d_z=2.003。由于两组频域设置下的置信区间均跨越0，因此只能将其视为与无频域结果方向一致的改善趋势，而不能作为显著性结论。路由权重在不同测试窗口中的变化及总体分布见图4。</w:t>
+      </w:r>
+      <w:r>
+        <w:rPr>
+          <w:color w:val="000000"/>
+        </w:rPr>
+        <w:t/>
+      </w:r>
+      <w:r>
+        <w:rPr>
+          <w:color w:val="000000"/>
+        </w:rPr>
+        <w:t/>
+      </w:r>
+      <w:r>
+        <w:rPr>
+          <w:color w:val="000000"/>
+        </w:rPr>
+        <w:t/>
+      </w:r>
+      <w:r>
+        <w:rPr>
+          <w:color w:val="000000"/>
+        </w:rPr>
+        <w:t/>
+      </w:r>
+      <w:r>
+        <w:rPr>
+          <w:color w:val="000000"/>
+        </w:rPr>
+        <w:t/>
+      </w:r>
+      <w:r>
+        <w:rPr>
+          <w:color w:val="000000"/>
+        </w:rPr>
+        <w:t/>
+      </w:r>
+      <w:r>
+        <w:rPr>
+          <w:color w:val="000000"/>
+        </w:rPr>
+        <w:t/>
+      </w:r>
+      <w:r>
+        <w:rPr>
+          <w:color w:val="000000"/>
+        </w:rPr>
+        <w:t/>
+      </w:r>
+      <w:r>
+        <w:rPr>
+          <w:color w:val="000000"/>
+        </w:rPr>
+        <w:t/>
+      </w:r>
+      <w:r>
+        <w:rPr>
+          <w:color w:val="000000"/>
+        </w:rPr>
+        <w:t/>
+      </w:r>
+      <w:r>
+        <w:rPr>
+          <w:color w:val="000000"/>
+        </w:rPr>
+        <w:t/>
+      </w:r>
+      <w:r>
+        <w:rPr>
+          <w:color w:val="000000"/>
+        </w:rPr>
+        <w:t/>
+      </w:r>
+      <w:r>
+        <w:rPr>
+          <w:color w:val="000000"/>
+        </w:rPr>
+        <w:t/>
+      </w:r>
+      <w:r>
+        <w:rPr>
+          <w:color w:val="000000"/>
+        </w:rPr>
+        <w:t/>
+      </w:r>
+      <w:r>
+        <w:rPr>
+          <w:color w:val="000000"/>
+        </w:rPr>
+        <w:t/>
+      </w:r>
+      <w:r>
+        <w:rPr>
+          <w:color w:val="000000"/>
+        </w:rPr>
+        <w:t/>
+      </w:r>
+      <w:r>
+        <w:rPr>
+          <w:color w:val="000000"/>
+        </w:rPr>
+        <w:t/>
+      </w:r>
+      <w:r>
+        <w:rPr>
+          <w:color w:val="000000"/>
+        </w:rPr>
+        <w:t/>
+      </w:r>
+      <w:r>
+        <w:rPr>
+          <w:color w:val="000000"/>
+        </w:rPr>
+        <w:t/>
+      </w:r>
+      <w:r>
+        <w:rPr>
+          <w:color w:val="000000"/>
+        </w:rPr>
+        <w:t/>
+      </w:r>
+      <w:r>
+        <w:rPr>
+          <w:color w:val="000000"/>
+        </w:rPr>
+        <w:t/>
+      </w:r>
+      <w:r>
+        <w:rPr>
+          <w:color w:val="000000"/>
+        </w:rPr>
+        <w:t/>
+      </w:r>
+      <w:r>
+        <w:rPr>
+          <w:color w:val="000000"/>
+        </w:rPr>
+        <w:t/>
+      </w:r>
+      <w:r>
+        <w:rPr>
+          <w:color w:val="000000"/>
+        </w:rPr>
+        <w:t/>
+      </w:r>
+      <w:r>
+        <w:rPr>
+          <w:color w:val="000000"/>
+        </w:rPr>
+        <w:t/>
+      </w:r>
+      <w:r>
+        <w:rPr>
+          <w:color w:val="000000"/>
+        </w:rPr>
+        <w:t/>
+      </w:r>
+      <w:r>
+        <w:rPr>
+          <w:color w:val="000000"/>
+        </w:rPr>
+        <w:t/>
+      </w:r>
+      <w:r>
+        <w:rPr>
+          <w:color w:val="000000"/>
+        </w:rPr>
+        <w:t/>
+      </w:r>
+      <w:r>
+        <w:rPr>
+          <w:color w:val="000000"/>
+        </w:rPr>
+        <w:t/>
+      </w:r>
+      <w:r>
+        <w:rPr>
+          <w:color w:val="000000"/>
+        </w:rPr>
+        <w:t/>
+      </w:r>
+      <w:r>
+        <w:rPr>
+          <w:color w:val="000000"/>
+        </w:rPr>
+        <w:t/>
+      </w:r>
+      <w:r>
+        <w:rPr>
+          <w:color w:val="000000"/>
+        </w:rPr>
+        <w:t/>
+      </w:r>
+      <w:r>
+        <w:rPr>
+          <w:color w:val="000000"/>
+        </w:rPr>
+        <w:t/>
+      </w:r>
+      <w:r>
+        <w:rPr>
+          <w:color w:val="000000"/>
+        </w:rPr>
+        <w:t/>
+      </w:r>
+      <w:r>
+        <w:rPr>
+          <w:color w:val="000000"/>
+        </w:rPr>
+        <w:t/>
+      </w:r>
+      <w:r>
+        <w:rPr>
+          <w:color w:val="000000"/>
+        </w:rPr>
+        <w:t/>
+      </w:r>
+      <w:r>
+        <w:t/>
+      </w:r>
+      <w:r>
+        <w:t/>
+      </w:r>
+      <w:r>
+        <w:t/>
       </w:r>
     </w:p>
     <w:p>
@@ -12281,31 +12281,31 @@
     </w:p>
     <w:p>
       <w:r>
-        <w:t>图</w:t>
-      </w:r>
-      <w:r>
-        <w:t>4</w:t>
-      </w:r>
-      <w:r>
-        <w:t>显示路由权重并非恒定</w:t>
-      </w:r>
-      <w:r>
-        <w:t>1/3</w:t>
-      </w:r>
-      <w:r>
-        <w:t>，且在测试窗口之间存在分布差异，说明路由器没有退化为固定平均。三个随机种子的平均尺度偏好并不完全一致，因此结果只支持</w:t>
-      </w:r>
-      <w:r>
-        <w:t>“</w:t>
-      </w:r>
-      <w:r>
-        <w:t>权重会随样本变化</w:t>
-      </w:r>
-      <w:r>
-        <w:t>”</w:t>
-      </w:r>
-      <w:r>
-        <w:t>，不能把某一个尺度固定解释为所有场景中最重要的业务尺度。更稳妥的机制解释是：路由器根据窗口统计状态改变专家组合，从而降低固定融合的约束。</w:t>
+        <w:t>图4显示三个尺度的路由权重并未固定在1/3附近，而是随测试窗口发生变化，说明路由器没有退化为固定平均融合。与此同时，不同随机种子的平均尺度偏好并不完全一致，因此现有结果只能说明路由器能够依据输入状态动态调整尺度组合，不能进一步将某一尺度解释为所有场景下持续占优的固定业务尺度。结合固定等权消融可以看出，本文路由机制的主要作用是根据窗口统计状态改变不同尺度专家的组合比例，从而减弱固定融合对不同流量状态适应性的限制。</w:t>
+      </w:r>
+      <w:r>
+        <w:t/>
+      </w:r>
+      <w:r>
+        <w:t/>
+      </w:r>
+      <w:r>
+        <w:t/>
+      </w:r>
+      <w:r>
+        <w:t/>
+      </w:r>
+      <w:r>
+        <w:t/>
+      </w:r>
+      <w:r>
+        <w:t/>
+      </w:r>
+      <w:r>
+        <w:t/>
+      </w:r>
+      <w:r>
+        <w:t/>
       </w:r>
     </w:p>
     <w:p>

</xml_diff>

<commit_message>
revise section 2.4 frequency sensitivity
</commit_message>
<xml_diff>
--- a/word_output/2026.09.18v.docx
+++ b/word_output/2026.09.18v.docx
@@ -12331,7 +12331,7 @@
           <w:color w:val="000000"/>
           <w:szCs w:val="32"/>
         </w:rPr>
-        <w:t xml:space="preserve">2.5 </w:t>
+        <w:t xml:space="preserve">2.4 频率保留比例敏感性</w:t>
       </w:r>
       <w:r>
         <w:rPr>
@@ -12341,87 +12341,87 @@
           <w:color w:val="000000"/>
           <w:szCs w:val="32"/>
         </w:rPr>
-        <w:t>频率保留比例敏感性</w:t>
+        <w:t/>
       </w:r>
     </w:p>
     <w:p>
       <w:r>
-        <w:t>表</w:t>
-      </w:r>
-      <w:r>
-        <w:t>3</w:t>
-      </w:r>
-      <w:r>
-        <w:t>给出</w:t>
-      </w:r>
-      <w:r>
-        <w:t>r</w:t>
+        <w:t>表3给出r∈{0.25,0.50,0.75}时的频率保留比例敏感性结果。对DLinear+频域门控和频域门控+自适应多尺度两类模型，随着r由0.25增至0.75，平均MSE均持续下降，表明过强的低频截断会削弱预测性能。该现象与高频部分可能包含有效变化信息的认识一致[5]，但当前实验未直接定位具体有效频带，因此这一解释仅用于说明结果趋势。不同随机种子下的变化轨迹见图5。</w:t>
+      </w:r>
+      <w:r>
+        <w:t/>
+      </w:r>
+      <w:r>
+        <w:t/>
+      </w:r>
+      <w:r>
+        <w:t/>
       </w:r>
       <w:r>
         <w:rPr>
           <w:rFonts w:ascii="Cambria Math" w:hAnsi="Cambria Math" w:cs="Cambria Math"/>
         </w:rPr>
-        <w:t>∈</w:t>
-      </w:r>
-      <w:r>
-        <w:t>{0.25,0.50,0.75}</w:t>
-      </w:r>
-      <w:r>
-        <w:t>的频率敏感性结果。对</w:t>
-      </w:r>
-      <w:r>
-        <w:t>DLinear+</w:t>
-      </w:r>
-      <w:r>
-        <w:t>频域门控和频域门控</w:t>
-      </w:r>
-      <w:r>
-        <w:t>+</w:t>
-      </w:r>
-      <w:r>
-        <w:t>自适应多尺度两类模型，保留比例从</w:t>
-      </w:r>
-      <w:r>
-        <w:t>0.25</w:t>
-      </w:r>
-      <w:r>
-        <w:t>增加到</w:t>
-      </w:r>
-      <w:r>
-        <w:t>0.75</w:t>
-      </w:r>
-      <w:r>
-        <w:t>时平均</w:t>
-      </w:r>
-      <w:r>
-        <w:t>MSE</w:t>
-      </w:r>
-      <w:r>
-        <w:t>均逐步下降。该趋势与</w:t>
-      </w:r>
-      <w:r>
-        <w:t>“</w:t>
-      </w:r>
-      <w:r>
-        <w:t>过强低通可能删除重要变化</w:t>
-      </w:r>
-      <w:r>
-        <w:t>”</w:t>
-      </w:r>
-      <w:r>
-        <w:t>的认识一致</w:t>
-      </w:r>
-      <w:r>
-        <w:t>[5]</w:t>
-      </w:r>
-      <w:r>
-        <w:t>，但实验没有直接定位误差对应的具体频带，因此只能作为与结果相符的解释。各随机种子的敏感性轨迹见图</w:t>
-      </w:r>
-      <w:r>
-        <w:t>5</w:t>
-      </w:r>
-      <w:r>
-        <w:t>。</w:t>
+        <w:t/>
+      </w:r>
+      <w:r>
+        <w:t/>
+      </w:r>
+      <w:r>
+        <w:t/>
+      </w:r>
+      <w:r>
+        <w:t/>
+      </w:r>
+      <w:r>
+        <w:t/>
+      </w:r>
+      <w:r>
+        <w:t/>
+      </w:r>
+      <w:r>
+        <w:t/>
+      </w:r>
+      <w:r>
+        <w:t/>
+      </w:r>
+      <w:r>
+        <w:t/>
+      </w:r>
+      <w:r>
+        <w:t/>
+      </w:r>
+      <w:r>
+        <w:t/>
+      </w:r>
+      <w:r>
+        <w:t/>
+      </w:r>
+      <w:r>
+        <w:t/>
+      </w:r>
+      <w:r>
+        <w:t/>
+      </w:r>
+      <w:r>
+        <w:t/>
+      </w:r>
+      <w:r>
+        <w:t/>
+      </w:r>
+      <w:r>
+        <w:t/>
+      </w:r>
+      <w:r>
+        <w:t/>
+      </w:r>
+      <w:r>
+        <w:t/>
+      </w:r>
+      <w:r>
+        <w:t/>
+      </w:r>
+      <w:r>
+        <w:t/>
       </w:r>
     </w:p>
     <w:p>
@@ -13609,163 +13609,163 @@
         <w:rPr>
           <w:color w:val="000000"/>
         </w:rPr>
-        <w:t>完整模型在三个候选比例中的最低</w:t>
-      </w:r>
-      <w:r>
-        <w:rPr>
-          <w:color w:val="000000"/>
-        </w:rPr>
-        <w:t>MSE</w:t>
-      </w:r>
-      <w:r>
-        <w:rPr>
-          <w:color w:val="000000"/>
-        </w:rPr>
-        <w:t>为</w:t>
-      </w:r>
-      <w:r>
-        <w:rPr>
-          <w:color w:val="000000"/>
-        </w:rPr>
-        <w:t>0.189447</w:t>
-      </w:r>
-      <w:r>
-        <w:rPr>
-          <w:color w:val="000000"/>
-        </w:rPr>
-        <w:t>。与</w:t>
-      </w:r>
-      <w:r>
-        <w:rPr>
-          <w:color w:val="000000"/>
-        </w:rPr>
-        <w:t>DLinear</w:t>
-      </w:r>
-      <w:r>
-        <w:rPr>
-          <w:color w:val="000000"/>
-        </w:rPr>
-        <w:t>相比，</w:t>
-      </w:r>
-      <w:r>
-        <w:rPr>
-          <w:color w:val="000000"/>
-        </w:rPr>
-        <w:t>r=0.75</w:t>
-      </w:r>
-      <w:r>
-        <w:rPr>
-          <w:color w:val="000000"/>
-        </w:rPr>
-        <w:t>的完整模型将</w:t>
-      </w:r>
-      <w:r>
-        <w:rPr>
-          <w:color w:val="000000"/>
-        </w:rPr>
-        <w:t>MSE</w:t>
-      </w:r>
-      <w:r>
-        <w:rPr>
-          <w:color w:val="000000"/>
-        </w:rPr>
-        <w:t>和</w:t>
-      </w:r>
-      <w:r>
-        <w:rPr>
-          <w:color w:val="000000"/>
-        </w:rPr>
-        <w:t>MAE</w:t>
-      </w:r>
-      <w:r>
-        <w:rPr>
-          <w:color w:val="000000"/>
-        </w:rPr>
-        <w:t>分别降低</w:t>
-      </w:r>
-      <w:r>
-        <w:rPr>
-          <w:color w:val="000000"/>
-        </w:rPr>
-        <w:t>2.34%</w:t>
-      </w:r>
-      <w:r>
-        <w:rPr>
-          <w:color w:val="000000"/>
-        </w:rPr>
-        <w:t>和</w:t>
-      </w:r>
-      <w:r>
-        <w:rPr>
-          <w:color w:val="000000"/>
-        </w:rPr>
-        <w:t>9.28%</w:t>
-      </w:r>
-      <w:r>
-        <w:rPr>
-          <w:color w:val="000000"/>
-        </w:rPr>
-        <w:t>；但与无频域自适应多尺度模型相比，其</w:t>
-      </w:r>
-      <w:r>
-        <w:rPr>
-          <w:color w:val="000000"/>
-        </w:rPr>
-        <w:t>MSE</w:t>
-      </w:r>
-      <w:r>
-        <w:rPr>
-          <w:color w:val="000000"/>
-        </w:rPr>
-        <w:t>和</w:t>
-      </w:r>
-      <w:r>
-        <w:rPr>
-          <w:color w:val="000000"/>
-        </w:rPr>
-        <w:t>MAE</w:t>
-      </w:r>
-      <w:r>
-        <w:rPr>
-          <w:color w:val="000000"/>
-        </w:rPr>
-        <w:t>仍分别高</w:t>
-      </w:r>
-      <w:r>
-        <w:rPr>
-          <w:color w:val="000000"/>
-        </w:rPr>
-        <w:t>1.80%</w:t>
-      </w:r>
-      <w:r>
-        <w:rPr>
-          <w:color w:val="000000"/>
-        </w:rPr>
-        <w:t>和</w:t>
-      </w:r>
-      <w:r>
-        <w:rPr>
-          <w:color w:val="000000"/>
-        </w:rPr>
-        <w:t>1.39%</w:t>
-      </w:r>
-      <w:r>
-        <w:rPr>
-          <w:color w:val="000000"/>
-        </w:rPr>
-        <w:t>。因此，</w:t>
-      </w:r>
-      <w:r>
-        <w:rPr>
-          <w:color w:val="000000"/>
-        </w:rPr>
-        <w:t>0.75</w:t>
-      </w:r>
-      <w:r>
-        <w:rPr>
-          <w:color w:val="000000"/>
-        </w:rPr>
-        <w:t>只能称为已测试候选值中的探索性较优比例，不能称为在独立验证上确定的最优超参数。频域门控的价值主要体现在揭示截断边界：低频保留过少会损失信息，而保留更多频率虽能缓解损失，仍未超过不截断的主模型。</w:t>
+        <w:t>在三个候选比例中，r=0.75时完整模型取得最低MSE 0.189447。相较DLinear，其MSE和MAE分别降低2.34%和9.28%；但相较无频域自适应多尺度主模型，MSE和MAE仍分别高1.80%和1.39%。因此，r=0.75只能视为当前三个测试比例中的探索性较优设置，不能据此认定为最优频率保留比例。结合表3和图5可见，增加频率保留比例能够缓解低频截断造成的信息损失，但频域门控仍未带来超过无频域主模型的额外收益，其作用更适合作为频率截断边界的辅助分析。</w:t>
+      </w:r>
+      <w:r>
+        <w:rPr>
+          <w:color w:val="000000"/>
+        </w:rPr>
+        <w:t/>
+      </w:r>
+      <w:r>
+        <w:rPr>
+          <w:color w:val="000000"/>
+        </w:rPr>
+        <w:t/>
+      </w:r>
+      <w:r>
+        <w:rPr>
+          <w:color w:val="000000"/>
+        </w:rPr>
+        <w:t/>
+      </w:r>
+      <w:r>
+        <w:rPr>
+          <w:color w:val="000000"/>
+        </w:rPr>
+        <w:t/>
+      </w:r>
+      <w:r>
+        <w:rPr>
+          <w:color w:val="000000"/>
+        </w:rPr>
+        <w:t/>
+      </w:r>
+      <w:r>
+        <w:rPr>
+          <w:color w:val="000000"/>
+        </w:rPr>
+        <w:t/>
+      </w:r>
+      <w:r>
+        <w:rPr>
+          <w:color w:val="000000"/>
+        </w:rPr>
+        <w:t/>
+      </w:r>
+      <w:r>
+        <w:rPr>
+          <w:color w:val="000000"/>
+        </w:rPr>
+        <w:t/>
+      </w:r>
+      <w:r>
+        <w:rPr>
+          <w:color w:val="000000"/>
+        </w:rPr>
+        <w:t/>
+      </w:r>
+      <w:r>
+        <w:rPr>
+          <w:color w:val="000000"/>
+        </w:rPr>
+        <w:t/>
+      </w:r>
+      <w:r>
+        <w:rPr>
+          <w:color w:val="000000"/>
+        </w:rPr>
+        <w:t/>
+      </w:r>
+      <w:r>
+        <w:rPr>
+          <w:color w:val="000000"/>
+        </w:rPr>
+        <w:t/>
+      </w:r>
+      <w:r>
+        <w:rPr>
+          <w:color w:val="000000"/>
+        </w:rPr>
+        <w:t/>
+      </w:r>
+      <w:r>
+        <w:rPr>
+          <w:color w:val="000000"/>
+        </w:rPr>
+        <w:t/>
+      </w:r>
+      <w:r>
+        <w:rPr>
+          <w:color w:val="000000"/>
+        </w:rPr>
+        <w:t/>
+      </w:r>
+      <w:r>
+        <w:rPr>
+          <w:color w:val="000000"/>
+        </w:rPr>
+        <w:t/>
+      </w:r>
+      <w:r>
+        <w:rPr>
+          <w:color w:val="000000"/>
+        </w:rPr>
+        <w:t/>
+      </w:r>
+      <w:r>
+        <w:rPr>
+          <w:color w:val="000000"/>
+        </w:rPr>
+        <w:t/>
+      </w:r>
+      <w:r>
+        <w:rPr>
+          <w:color w:val="000000"/>
+        </w:rPr>
+        <w:t/>
+      </w:r>
+      <w:r>
+        <w:rPr>
+          <w:color w:val="000000"/>
+        </w:rPr>
+        <w:t/>
+      </w:r>
+      <w:r>
+        <w:rPr>
+          <w:color w:val="000000"/>
+        </w:rPr>
+        <w:t/>
+      </w:r>
+      <w:r>
+        <w:rPr>
+          <w:color w:val="000000"/>
+        </w:rPr>
+        <w:t/>
+      </w:r>
+      <w:r>
+        <w:rPr>
+          <w:color w:val="000000"/>
+        </w:rPr>
+        <w:t/>
+      </w:r>
+      <w:r>
+        <w:rPr>
+          <w:color w:val="000000"/>
+        </w:rPr>
+        <w:t/>
+      </w:r>
+      <w:r>
+        <w:rPr>
+          <w:color w:val="000000"/>
+        </w:rPr>
+        <w:t/>
+      </w:r>
+      <w:r>
+        <w:rPr>
+          <w:color w:val="000000"/>
+        </w:rPr>
+        <w:t/>
       </w:r>
     </w:p>
     <w:p>

</xml_diff>

<commit_message>
revise section 2.5 representative forecast and scope
</commit_message>
<xml_diff>
--- a/word_output/2026.09.18v.docx
+++ b/word_output/2026.09.18v.docx
@@ -13791,7 +13791,7 @@
           <w:color w:val="000000"/>
           <w:szCs w:val="32"/>
         </w:rPr>
-        <w:t xml:space="preserve">2.6 </w:t>
+        <w:t xml:space="preserve">2.5 代表性预测与适用范围</w:t>
       </w:r>
       <w:r>
         <w:rPr>
@@ -13801,7 +13801,7 @@
           <w:color w:val="000000"/>
           <w:szCs w:val="32"/>
         </w:rPr>
-        <w:t>代表性预测</w:t>
+        <w:t/>
       </w:r>
     </w:p>
     <w:p>
@@ -13809,55 +13809,55 @@
         <w:rPr>
           <w:color w:val="000000"/>
         </w:rPr>
-        <w:t>为直观展示模型预测效果，选取测试集中具有代表性的</w:t>
-      </w:r>
-      <w:r>
-        <w:rPr>
-          <w:color w:val="000000"/>
-        </w:rPr>
-        <w:t xml:space="preserve"> OD </w:t>
-      </w:r>
-      <w:r>
-        <w:rPr>
-          <w:color w:val="000000"/>
-        </w:rPr>
-        <w:t>流量窗口进行可视化，结果如图</w:t>
-      </w:r>
-      <w:r>
-        <w:rPr>
-          <w:color w:val="000000"/>
-        </w:rPr>
-        <w:t>6</w:t>
-      </w:r>
-      <w:r>
-        <w:rPr>
-          <w:color w:val="000000"/>
-        </w:rPr>
-        <w:t>所示。从应用角度看，预测输出可作为容量与拥塞管理的辅助输入。例如，网络管理系统可用未来</w:t>
-      </w:r>
-      <w:r>
-        <w:rPr>
-          <w:color w:val="000000"/>
-        </w:rPr>
-        <w:t>24 h</w:t>
-      </w:r>
-      <w:r>
-        <w:rPr>
-          <w:color w:val="000000"/>
-        </w:rPr>
-        <w:t>的</w:t>
-      </w:r>
-      <w:r>
-        <w:rPr>
-          <w:color w:val="000000"/>
-        </w:rPr>
-        <w:t>OD</w:t>
-      </w:r>
-      <w:r>
-        <w:rPr>
-          <w:color w:val="000000"/>
-        </w:rPr>
-        <w:t>流量估计识别可能持续上升的业务对，提前调整链路容量、路由权重或巡检优先级；在资源编排中，可根据预测需求安排带宽和计算资源。</w:t>
+        <w:t>为直观展示模型在具体OD流量窗口上的预测结果，选取测试集中的代表性样本进行可视化，如图6所示。该图主要用于观察预测序列与真实变化趋势的对应关系，不作为独立于表1—表3之外的额外性能证据。从应用角度看，未来24 h的OD流量预测可作为容量规划、拥塞预警和资源编排的辅助输入，为链路容量调整、路由配置及带宽资源分配提供参考。需要指出的是，本文实验仅基于Abilene数据集、固定输入长度L=96和预测长度H=24开展，并以3个随机种子进行重复验证；模型也未显式引入OD节点之间的网络拓扑关系。因此，当前结果主要说明所提出方法在该数据集和预测设置下的有效性，其在其他网络规模、不同预测长度及拓扑条件下的泛化能力仍需进一步验证。</w:t>
+      </w:r>
+      <w:r>
+        <w:rPr>
+          <w:color w:val="000000"/>
+        </w:rPr>
+        <w:t xml:space="preserve"/>
+      </w:r>
+      <w:r>
+        <w:rPr>
+          <w:color w:val="000000"/>
+        </w:rPr>
+        <w:t/>
+      </w:r>
+      <w:r>
+        <w:rPr>
+          <w:color w:val="000000"/>
+        </w:rPr>
+        <w:t/>
+      </w:r>
+      <w:r>
+        <w:rPr>
+          <w:color w:val="000000"/>
+        </w:rPr>
+        <w:t/>
+      </w:r>
+      <w:r>
+        <w:rPr>
+          <w:color w:val="000000"/>
+        </w:rPr>
+        <w:t/>
+      </w:r>
+      <w:r>
+        <w:rPr>
+          <w:color w:val="000000"/>
+        </w:rPr>
+        <w:t/>
+      </w:r>
+      <w:r>
+        <w:rPr>
+          <w:color w:val="000000"/>
+        </w:rPr>
+        <w:t/>
+      </w:r>
+      <w:r>
+        <w:rPr>
+          <w:color w:val="000000"/>
+        </w:rPr>
+        <w:t/>
       </w:r>
     </w:p>
     <w:p>

</xml_diff>

<commit_message>
apply journal requirement 1 page layout
</commit_message>
<xml_diff>
--- a/word_output/2026.09.18v.docx
+++ b/word_output/2026.09.18v.docx
@@ -14363,8 +14363,8 @@
       <w:headerReference w:type="default" r:id="rId12"/>
       <w:footerReference w:type="first" r:id="rId13"/>
       <w:pgSz w:w="11906" w:h="16838"/>
-      <w:pgMar w:top="1757" w:right="1134" w:bottom="1417" w:left="1134" w:header="454" w:footer="454" w:gutter="0"/>
-      <w:cols w:space="720"/>
+      <w:pgMar w:top="1757" w:right="1134" w:bottom="1417" w:left="1134" w:header="851" w:footer="992" w:gutter="0"/>
+      <w:cols w:space="425" w:num="1"/>
       <w:titlePg/>
       <w:docGrid w:type="lines" w:linePitch="312"/>
     </w:sectPr>
@@ -14877,9 +14877,14 @@
 <file path=word/styles.xml><?xml version="1.0" encoding="utf-8"?>
 <w:styles xmlns:mc="http://schemas.openxmlformats.org/markup-compatibility/2006" xmlns:r="http://schemas.openxmlformats.org/officeDocument/2006/relationships" xmlns:w="http://schemas.openxmlformats.org/wordprocessingml/2006/main" xmlns:w14="http://schemas.microsoft.com/office/word/2010/wordml" xmlns:w15="http://schemas.microsoft.com/office/word/2012/wordml" xmlns:w16cex="http://schemas.microsoft.com/office/word/2018/wordml/cex" xmlns:w16cid="http://schemas.microsoft.com/office/word/2016/wordml/cid" xmlns:w16="http://schemas.microsoft.com/office/word/2018/wordml" xmlns:w16du="http://schemas.microsoft.com/office/word/2023/wordml/word16du" xmlns:w16sdtdh="http://schemas.microsoft.com/office/word/2020/wordml/sdtdatahash" xmlns:w16sdtfl="http://schemas.microsoft.com/office/word/2024/wordml/sdtformatlock" xmlns:w16se="http://schemas.microsoft.com/office/word/2015/wordml/symex" mc:Ignorable="w14 w15 w16se w16cid w16 w16cex w16sdtdh w16sdtfl w16du">
   <w:docDefaults>
+    <w:pPrDefault>
+      <w:pPr>
+        <w:spacing w:line="240" w:lineRule="auto"/>
+      </w:pPr>
+    </w:pPrDefault>
     <w:rPrDefault>
       <w:rPr>
-        <w:rFonts w:asciiTheme="minorHAnsi" w:eastAsiaTheme="minorEastAsia" w:hAnsiTheme="minorHAnsi" w:cstheme="minorBidi"/>
+        <w:rFonts w:asciiTheme="minorHAnsi" w:eastAsiaTheme="minorEastAsia" w:hAnsiTheme="minorHAnsi" w:cstheme="minorBidi" w:eastAsia="宋体"/>
         <w:kern w:val="2"/>
         <w:sz w:val="22"/>
         <w:szCs w:val="24"/>

</xml_diff>

<commit_message>
apply journal requirement 3 author format
</commit_message>
<xml_diff>
--- a/word_output/2026.09.18v.docx
+++ b/word_output/2026.09.18v.docx
@@ -28,25 +28,28 @@
       </w:pPr>
       <w:r>
         <w:rPr>
-          <w:rFonts w:eastAsia="楷体"/>
+          <w:rFonts w:eastAsia="楷体" w:ascii="KaiTi" w:hAnsi="KaiTi" w:cs="KaiTi"/>
           <w:color w:val="000000"/>
           <w:szCs w:val="21"/>
+          <w:sz w:val="21"/>
         </w:rPr>
         <w:t>[</w:t>
       </w:r>
       <w:r>
         <w:rPr>
-          <w:rFonts w:eastAsia="楷体"/>
+          <w:rFonts w:eastAsia="楷体" w:ascii="KaiTi" w:hAnsi="KaiTi" w:cs="KaiTi"/>
           <w:color w:val="000000"/>
           <w:szCs w:val="21"/>
+          <w:sz w:val="21"/>
         </w:rPr>
         <w:t>请填写作者姓名</w:t>
       </w:r>
       <w:r>
         <w:rPr>
-          <w:rFonts w:eastAsia="楷体"/>
+          <w:rFonts w:eastAsia="楷体" w:ascii="KaiTi" w:hAnsi="KaiTi" w:cs="KaiTi"/>
           <w:color w:val="000000"/>
           <w:szCs w:val="21"/>
+          <w:sz w:val="21"/>
         </w:rPr>
         <w:t>]</w:t>
       </w:r>

</xml_diff>

<commit_message>
apply journal requirement 4 affiliation format
</commit_message>
<xml_diff>
--- a/word_output/2026.09.18v.docx
+++ b/word_output/2026.09.18v.docx
@@ -66,7 +66,7 @@
           <w:sz w:val="18"/>
           <w:szCs w:val="18"/>
         </w:rPr>
-        <w:t>（</w:t>
+        <w:t>（[请填写工作单位] [请填写部门]，[省 市 邮编]）</w:t>
       </w:r>
       <w:r>
         <w:rPr>
@@ -75,7 +75,7 @@
           <w:sz w:val="18"/>
           <w:szCs w:val="18"/>
         </w:rPr>
-        <w:t>[</w:t>
+        <w:t/>
       </w:r>
       <w:r>
         <w:rPr>
@@ -84,7 +84,7 @@
           <w:sz w:val="18"/>
           <w:szCs w:val="18"/>
         </w:rPr>
-        <w:t>请填写单位全称</w:t>
+        <w:t/>
       </w:r>
       <w:r>
         <w:rPr>
@@ -93,7 +93,7 @@
           <w:sz w:val="18"/>
           <w:szCs w:val="18"/>
         </w:rPr>
-        <w:t>]</w:t>
+        <w:t/>
       </w:r>
       <w:r>
         <w:rPr>
@@ -102,7 +102,7 @@
           <w:sz w:val="18"/>
           <w:szCs w:val="18"/>
         </w:rPr>
-        <w:t>，</w:t>
+        <w:t/>
       </w:r>
       <w:r>
         <w:rPr>
@@ -111,7 +111,7 @@
           <w:sz w:val="18"/>
           <w:szCs w:val="18"/>
         </w:rPr>
-        <w:t>[</w:t>
+        <w:t/>
       </w:r>
       <w:r>
         <w:rPr>
@@ -120,7 +120,7 @@
           <w:sz w:val="18"/>
           <w:szCs w:val="18"/>
         </w:rPr>
-        <w:t>省</w:t>
+        <w:t/>
       </w:r>
       <w:r>
         <w:rPr>
@@ -129,7 +129,7 @@
           <w:sz w:val="18"/>
           <w:szCs w:val="18"/>
         </w:rPr>
-        <w:t xml:space="preserve"> </w:t>
+        <w:t xml:space="preserve"/>
       </w:r>
       <w:r>
         <w:rPr>
@@ -138,7 +138,7 @@
           <w:sz w:val="18"/>
           <w:szCs w:val="18"/>
         </w:rPr>
-        <w:t>市</w:t>
+        <w:t/>
       </w:r>
       <w:r>
         <w:rPr>
@@ -147,7 +147,7 @@
           <w:sz w:val="18"/>
           <w:szCs w:val="18"/>
         </w:rPr>
-        <w:t xml:space="preserve"> </w:t>
+        <w:t xml:space="preserve"/>
       </w:r>
       <w:r>
         <w:rPr>
@@ -156,7 +156,7 @@
           <w:sz w:val="18"/>
           <w:szCs w:val="18"/>
         </w:rPr>
-        <w:t>邮编</w:t>
+        <w:t/>
       </w:r>
       <w:r>
         <w:rPr>
@@ -165,7 +165,7 @@
           <w:sz w:val="18"/>
           <w:szCs w:val="18"/>
         </w:rPr>
-        <w:t>]</w:t>
+        <w:t/>
       </w:r>
       <w:r>
         <w:rPr>
@@ -174,7 +174,7 @@
           <w:sz w:val="18"/>
           <w:szCs w:val="18"/>
         </w:rPr>
-        <w:t>）</w:t>
+        <w:t/>
       </w:r>
     </w:p>
     <w:p>

</xml_diff>

<commit_message>
apply journal requirement 5 abstract
</commit_message>
<xml_diff>
--- a/word_output/2026.09.18v.docx
+++ b/word_output/2026.09.18v.docx
@@ -190,127 +190,127 @@
         <w:rPr>
           <w:color w:val="000000"/>
         </w:rPr>
-        <w:t>为提高骨干网络源</w:t>
-      </w:r>
-      <w:r>
-        <w:rPr>
-          <w:color w:val="000000"/>
-        </w:rPr>
-        <w:t>—</w:t>
-      </w:r>
-      <w:r>
-        <w:rPr>
-          <w:color w:val="000000"/>
-        </w:rPr>
-        <w:t>目的节点对流量短期预测对不同时间尺度变化的适应能力，构建一种基于样本级自适应多尺度加权的轻量预测方法。采用尺度</w:t>
-      </w:r>
-      <w:r>
-        <w:rPr>
-          <w:color w:val="000000"/>
-        </w:rPr>
-        <w:t>1</w:t>
-      </w:r>
-      <w:r>
-        <w:rPr>
-          <w:color w:val="000000"/>
-        </w:rPr>
-        <w:t>、</w:t>
-      </w:r>
-      <w:r>
-        <w:rPr>
-          <w:color w:val="000000"/>
-        </w:rPr>
-        <w:t>2</w:t>
-      </w:r>
-      <w:r>
-        <w:rPr>
-          <w:color w:val="000000"/>
-        </w:rPr>
-        <w:t>和</w:t>
-      </w:r>
-      <w:r>
-        <w:rPr>
-          <w:color w:val="000000"/>
-        </w:rPr>
-        <w:t>4</w:t>
-      </w:r>
-      <w:r>
-        <w:rPr>
-          <w:color w:val="000000"/>
-        </w:rPr>
-        <w:t>的非重叠平均池化生成多分辨率序列，并分别输入独立的分解线性模型进行预测；提取窗口均值、标准差、末时刻均值和平均绝对一阶差分，经路由网络生成</w:t>
-      </w:r>
-      <w:r>
-        <w:rPr>
-          <w:color w:val="000000"/>
-        </w:rPr>
-        <w:t>Softmax</w:t>
-      </w:r>
-      <w:r>
-        <w:rPr>
-          <w:color w:val="000000"/>
-        </w:rPr>
-        <w:t>权重，对不同尺度专家输出进行样本级自适应融合，并设置低频门控分析频率保留比例的影响。在</w:t>
-      </w:r>
-      <w:r>
-        <w:rPr>
-          <w:color w:val="000000"/>
-        </w:rPr>
-        <w:t>Abilene</w:t>
-      </w:r>
-      <w:r>
-        <w:rPr>
-          <w:color w:val="000000"/>
-        </w:rPr>
-        <w:t>数据集上的实验表明，无频域门控的自适应多尺度模型相较于单尺度</w:t>
-      </w:r>
-      <w:r>
-        <w:rPr>
-          <w:color w:val="000000"/>
-        </w:rPr>
-        <w:t>DLinear</w:t>
-      </w:r>
-      <w:r>
-        <w:rPr>
-          <w:color w:val="000000"/>
-        </w:rPr>
-        <w:t>，均方误差和平均绝对误差分别降低</w:t>
-      </w:r>
-      <w:r>
-        <w:rPr>
-          <w:color w:val="000000"/>
-        </w:rPr>
-        <w:t>4.06%</w:t>
-      </w:r>
-      <w:r>
-        <w:rPr>
-          <w:color w:val="000000"/>
-        </w:rPr>
-        <w:t>和</w:t>
-      </w:r>
-      <w:r>
-        <w:rPr>
-          <w:color w:val="000000"/>
-        </w:rPr>
-        <w:t>10.52%</w:t>
-      </w:r>
-      <w:r>
-        <w:rPr>
-          <w:color w:val="000000"/>
-        </w:rPr>
-        <w:t>；在尺度集合和专家结构相同条件下，均方误差较固定等权融合降低</w:t>
-      </w:r>
-      <w:r>
-        <w:rPr>
-          <w:color w:val="000000"/>
-        </w:rPr>
-        <w:t>3.95%</w:t>
-      </w:r>
-      <w:r>
-        <w:rPr>
-          <w:color w:val="000000"/>
-        </w:rPr>
-        <w:t>；随着频率保留比例增加，含门控模型误差逐步下降，但仍未优于无频域模型。结果表明，自适应尺度融合能够利用不同时间分辨率的互补信息，低频门控可作为频率特性分析的辅助模块。</w:t>
+        <w:t>为提高骨干网络源—目的节点对流量短期预测对不同时间尺度变化的适应能力，构建一种基于样本级自适应多尺度加权的轻量预测方法。采用尺度1、2和4的非重叠平均池化生成多分辨率序列，并分别输入独立的分解线性模型进行预测；提取窗口均值、标准差、末时刻均值和平均绝对一阶差分，经路由网络生成Softmax权重，对不同尺度专家输出进行样本级自适应融合，并设置低频门控分析频率保留比例的影响。在Abilene数据集上的实验表明，无频域门控的自适应多尺度模型相较于单尺度分解线性模型，均方误差和平均绝对误差分别降低4.06%和10.52%；在尺度集合和专家结构相同条件下，均方误差较固定等权融合降低3.95%；随着频率保留比例增加，含门控模型误差逐步下降，但仍未优于无频域模型。实验结果说明，样本级尺度权重有助于提高骨干网络源—目的节点对短期流量预测精度，频域处理更适合作为频率特征分析的补充手段。</w:t>
+      </w:r>
+      <w:r>
+        <w:rPr>
+          <w:color w:val="000000"/>
+        </w:rPr>
+        <w:t/>
+      </w:r>
+      <w:r>
+        <w:rPr>
+          <w:color w:val="000000"/>
+        </w:rPr>
+        <w:t/>
+      </w:r>
+      <w:r>
+        <w:rPr>
+          <w:color w:val="000000"/>
+        </w:rPr>
+        <w:t/>
+      </w:r>
+      <w:r>
+        <w:rPr>
+          <w:color w:val="000000"/>
+        </w:rPr>
+        <w:t/>
+      </w:r>
+      <w:r>
+        <w:rPr>
+          <w:color w:val="000000"/>
+        </w:rPr>
+        <w:t/>
+      </w:r>
+      <w:r>
+        <w:rPr>
+          <w:color w:val="000000"/>
+        </w:rPr>
+        <w:t/>
+      </w:r>
+      <w:r>
+        <w:rPr>
+          <w:color w:val="000000"/>
+        </w:rPr>
+        <w:t/>
+      </w:r>
+      <w:r>
+        <w:rPr>
+          <w:color w:val="000000"/>
+        </w:rPr>
+        <w:t/>
+      </w:r>
+      <w:r>
+        <w:rPr>
+          <w:color w:val="000000"/>
+        </w:rPr>
+        <w:t/>
+      </w:r>
+      <w:r>
+        <w:rPr>
+          <w:color w:val="000000"/>
+        </w:rPr>
+        <w:t/>
+      </w:r>
+      <w:r>
+        <w:rPr>
+          <w:color w:val="000000"/>
+        </w:rPr>
+        <w:t/>
+      </w:r>
+      <w:r>
+        <w:rPr>
+          <w:color w:val="000000"/>
+        </w:rPr>
+        <w:t/>
+      </w:r>
+      <w:r>
+        <w:rPr>
+          <w:color w:val="000000"/>
+        </w:rPr>
+        <w:t/>
+      </w:r>
+      <w:r>
+        <w:rPr>
+          <w:color w:val="000000"/>
+        </w:rPr>
+        <w:t/>
+      </w:r>
+      <w:r>
+        <w:rPr>
+          <w:color w:val="000000"/>
+        </w:rPr>
+        <w:t/>
+      </w:r>
+      <w:r>
+        <w:rPr>
+          <w:color w:val="000000"/>
+        </w:rPr>
+        <w:t/>
+      </w:r>
+      <w:r>
+        <w:rPr>
+          <w:color w:val="000000"/>
+        </w:rPr>
+        <w:t/>
+      </w:r>
+      <w:r>
+        <w:rPr>
+          <w:color w:val="000000"/>
+        </w:rPr>
+        <w:t/>
+      </w:r>
+      <w:r>
+        <w:rPr>
+          <w:color w:val="000000"/>
+        </w:rPr>
+        <w:t/>
+      </w:r>
+      <w:r>
+        <w:rPr>
+          <w:color w:val="000000"/>
+        </w:rPr>
+        <w:t/>
       </w:r>
     </w:p>
     <w:p>

</xml_diff>

<commit_message>
apply journal requirement 10 body and terminology
</commit_message>
<xml_diff>
--- a/word_output/2026.09.18v.docx
+++ b/word_output/2026.09.18v.docx
@@ -442,134 +442,200 @@
       </w:pPr>
       <w:r>
         <w:rPr>
-          <w:color w:val="000000"/>
+          <w:rFonts w:eastAsia="宋体"/>
+          <w:color w:val="000000"/>
+          <w:sz w:val="21"/>
+          <w:szCs w:val="21"/>
         </w:rPr>
         <w:t>随着网络业务规模和业务类型持续增长，骨干网络流量呈现出明显的时变性、突发性和多时间尺度变化特征。源</w:t>
       </w:r>
       <w:r>
         <w:rPr>
-          <w:color w:val="000000"/>
+          <w:rFonts w:eastAsia="宋体"/>
+          <w:color w:val="000000"/>
+          <w:sz w:val="21"/>
+          <w:szCs w:val="21"/>
         </w:rPr>
         <w:t>—</w:t>
       </w:r>
       <w:r>
         <w:rPr>
-          <w:color w:val="000000"/>
+          <w:rFonts w:eastAsia="宋体"/>
+          <w:color w:val="000000"/>
+          <w:sz w:val="21"/>
+          <w:szCs w:val="21"/>
         </w:rPr>
         <w:t>目的节点对（</w:t>
       </w:r>
       <w:r>
         <w:rPr>
-          <w:color w:val="000000"/>
+          <w:rFonts w:eastAsia="宋体"/>
+          <w:color w:val="000000"/>
+          <w:sz w:val="21"/>
+          <w:szCs w:val="21"/>
         </w:rPr>
         <w:t>origin-destination</w:t>
       </w:r>
       <w:r>
         <w:rPr>
-          <w:color w:val="000000"/>
+          <w:rFonts w:eastAsia="宋体"/>
+          <w:color w:val="000000"/>
+          <w:sz w:val="21"/>
+          <w:szCs w:val="21"/>
         </w:rPr>
         <w:t>，</w:t>
       </w:r>
       <w:r>
         <w:rPr>
-          <w:color w:val="000000"/>
+          <w:rFonts w:eastAsia="宋体"/>
+          <w:color w:val="000000"/>
+          <w:sz w:val="21"/>
+          <w:szCs w:val="21"/>
         </w:rPr>
         <w:t>OD</w:t>
       </w:r>
       <w:r>
         <w:rPr>
-          <w:color w:val="000000"/>
+          <w:rFonts w:eastAsia="宋体"/>
+          <w:color w:val="000000"/>
+          <w:sz w:val="21"/>
+          <w:szCs w:val="21"/>
         </w:rPr>
         <w:t>）流量能够反映网络入口与出口之间的业务需求，其短期预测结果可为容量规划、拥塞预警、流量工程和资源调度提供依据。现有网络流量预测方法已由传统统计模型逐步发展到机器学习和深度学习方法</w:t>
       </w:r>
       <w:r>
         <w:rPr>
-          <w:color w:val="000000"/>
+          <w:rFonts w:eastAsia="宋体"/>
+          <w:color w:val="000000"/>
+          <w:sz w:val="21"/>
+          <w:szCs w:val="21"/>
         </w:rPr>
         <w:t>[1]</w:t>
       </w:r>
       <w:r>
         <w:rPr>
-          <w:color w:val="000000"/>
+          <w:rFonts w:eastAsia="宋体"/>
+          <w:color w:val="000000"/>
+          <w:sz w:val="21"/>
+          <w:szCs w:val="21"/>
         </w:rPr>
         <w:t>。针对网络流量中的时空相关性，</w:t>
       </w:r>
       <w:r>
         <w:rPr>
-          <w:color w:val="000000"/>
+          <w:rFonts w:eastAsia="宋体"/>
+          <w:color w:val="000000"/>
+          <w:sz w:val="21"/>
+          <w:szCs w:val="21"/>
         </w:rPr>
         <w:t>Qin</w:t>
       </w:r>
       <w:r>
         <w:rPr>
-          <w:color w:val="000000"/>
+          <w:rFonts w:eastAsia="宋体"/>
+          <w:color w:val="000000"/>
+          <w:sz w:val="21"/>
+          <w:szCs w:val="21"/>
         </w:rPr>
         <w:t>等</w:t>
       </w:r>
       <w:r>
         <w:rPr>
-          <w:color w:val="000000"/>
+          <w:rFonts w:eastAsia="宋体"/>
+          <w:color w:val="000000"/>
+          <w:sz w:val="21"/>
+          <w:szCs w:val="21"/>
         </w:rPr>
         <w:t>[2]</w:t>
       </w:r>
       <w:r>
         <w:rPr>
-          <w:color w:val="000000"/>
+          <w:rFonts w:eastAsia="宋体"/>
+          <w:color w:val="000000"/>
+          <w:sz w:val="21"/>
+          <w:szCs w:val="21"/>
         </w:rPr>
         <w:t>采用图神经网络建模通信网络中的空间依赖关系；韦烜等</w:t>
       </w:r>
       <w:r>
         <w:rPr>
-          <w:color w:val="000000"/>
+          <w:rFonts w:eastAsia="宋体"/>
+          <w:color w:val="000000"/>
+          <w:sz w:val="21"/>
+          <w:szCs w:val="21"/>
         </w:rPr>
         <w:t>[9]</w:t>
       </w:r>
       <w:r>
         <w:rPr>
-          <w:color w:val="000000"/>
+          <w:rFonts w:eastAsia="宋体"/>
+          <w:color w:val="000000"/>
+          <w:sz w:val="21"/>
+          <w:szCs w:val="21"/>
         </w:rPr>
         <w:t>对大型</w:t>
       </w:r>
       <w:r>
         <w:rPr>
-          <w:color w:val="000000"/>
-        </w:rPr>
-        <w:t>IP</w:t>
-      </w:r>
-      <w:r>
-        <w:rPr>
-          <w:color w:val="000000"/>
+          <w:rFonts w:eastAsia="宋体"/>
+          <w:color w:val="000000"/>
+          <w:sz w:val="21"/>
+          <w:szCs w:val="21"/>
+        </w:rPr>
+        <w:t>互联网协议（Internet Protocol，IP）</w:t>
+      </w:r>
+      <w:r>
+        <w:rPr>
+          <w:rFonts w:eastAsia="宋体"/>
+          <w:color w:val="000000"/>
+          <w:sz w:val="21"/>
+          <w:szCs w:val="21"/>
         </w:rPr>
         <w:t>网络流量矩阵的分析与预测进行了研究，表明</w:t>
       </w:r>
       <w:r>
         <w:rPr>
-          <w:color w:val="000000"/>
+          <w:rFonts w:eastAsia="宋体"/>
+          <w:color w:val="000000"/>
+          <w:sz w:val="21"/>
+          <w:szCs w:val="21"/>
         </w:rPr>
         <w:t>OD</w:t>
       </w:r>
       <w:r>
         <w:rPr>
-          <w:color w:val="000000"/>
+          <w:rFonts w:eastAsia="宋体"/>
+          <w:color w:val="000000"/>
+          <w:sz w:val="21"/>
+          <w:szCs w:val="21"/>
         </w:rPr>
         <w:t>流量预测在实际网络运行管理中具有应用价值。然而，图结构建模通常依赖网络拓扑或较复杂的特征交互，</w:t>
       </w:r>
       <w:r>
         <w:rPr>
-          <w:color w:val="000000"/>
+          <w:rFonts w:eastAsia="宋体"/>
+          <w:color w:val="000000"/>
+          <w:sz w:val="21"/>
+          <w:szCs w:val="21"/>
         </w:rPr>
         <w:lastRenderedPageBreak/>
         <w:t>对于只利用历史</w:t>
       </w:r>
       <w:r>
         <w:rPr>
-          <w:color w:val="000000"/>
+          <w:rFonts w:eastAsia="宋体"/>
+          <w:color w:val="000000"/>
+          <w:sz w:val="21"/>
+          <w:szCs w:val="21"/>
         </w:rPr>
         <w:t>OD</w:t>
       </w:r>
       <w:r>
         <w:rPr>
-          <w:color w:val="000000"/>
+          <w:rFonts w:eastAsia="宋体"/>
+          <w:color w:val="000000"/>
+          <w:sz w:val="21"/>
+          <w:szCs w:val="21"/>
         </w:rPr>
         <w:t>流量序列进行轻量预测的场景，仍存在进一步简化模型结构的空间。</w:t>
       </w:r>
@@ -582,175 +648,262 @@
       </w:pPr>
       <w:r>
         <w:rPr>
-          <w:color w:val="000000"/>
+          <w:rFonts w:eastAsia="宋体"/>
+          <w:color w:val="000000"/>
+          <w:sz w:val="21"/>
+          <w:szCs w:val="21"/>
         </w:rPr>
         <w:t>网络流量在不同时间尺度上具有不同的变化特征。较细时间尺度能够保留局部波动和突发信息，较粗时间尺度则有利于平滑短期扰动并突出整体趋势。</w:t>
       </w:r>
       <w:r>
         <w:rPr>
-          <w:color w:val="000000"/>
+          <w:rFonts w:eastAsia="宋体"/>
+          <w:color w:val="000000"/>
+          <w:sz w:val="21"/>
+          <w:szCs w:val="21"/>
         </w:rPr>
         <w:t>Zhou</w:t>
       </w:r>
       <w:r>
         <w:rPr>
-          <w:color w:val="000000"/>
+          <w:rFonts w:eastAsia="宋体"/>
+          <w:color w:val="000000"/>
+          <w:sz w:val="21"/>
+          <w:szCs w:val="21"/>
         </w:rPr>
         <w:t>等</w:t>
       </w:r>
       <w:r>
         <w:rPr>
-          <w:color w:val="000000"/>
+          <w:rFonts w:eastAsia="宋体"/>
+          <w:color w:val="000000"/>
+          <w:sz w:val="21"/>
+          <w:szCs w:val="21"/>
         </w:rPr>
         <w:t>[3]</w:t>
       </w:r>
       <w:r>
         <w:rPr>
-          <w:color w:val="000000"/>
+          <w:rFonts w:eastAsia="宋体"/>
+          <w:color w:val="000000"/>
+          <w:sz w:val="21"/>
+          <w:szCs w:val="21"/>
         </w:rPr>
         <w:t>利用多尺度回声状态网络提取不同时间尺度的流量特征；</w:t>
       </w:r>
       <w:r>
         <w:rPr>
-          <w:color w:val="000000"/>
+          <w:rFonts w:eastAsia="宋体"/>
+          <w:color w:val="000000"/>
+          <w:sz w:val="21"/>
+          <w:szCs w:val="21"/>
         </w:rPr>
         <w:t>TimeMixer</w:t>
       </w:r>
       <w:r>
         <w:rPr>
-          <w:color w:val="000000"/>
+          <w:rFonts w:eastAsia="宋体"/>
+          <w:color w:val="000000"/>
+          <w:sz w:val="21"/>
+          <w:szCs w:val="21"/>
         </w:rPr>
         <w:t>通过多尺度分解与混合机制实现不同分辨率信息的交互</w:t>
       </w:r>
       <w:r>
         <w:rPr>
-          <w:color w:val="000000"/>
+          <w:rFonts w:eastAsia="宋体"/>
+          <w:color w:val="000000"/>
+          <w:sz w:val="21"/>
+          <w:szCs w:val="21"/>
         </w:rPr>
         <w:t>[7]</w:t>
       </w:r>
       <w:r>
         <w:rPr>
-          <w:color w:val="000000"/>
+          <w:rFonts w:eastAsia="宋体"/>
+          <w:color w:val="000000"/>
+          <w:sz w:val="21"/>
+          <w:szCs w:val="21"/>
         </w:rPr>
         <w:t>；</w:t>
       </w:r>
       <w:r>
         <w:rPr>
-          <w:color w:val="000000"/>
+          <w:rFonts w:eastAsia="宋体"/>
+          <w:color w:val="000000"/>
+          <w:sz w:val="21"/>
+          <w:szCs w:val="21"/>
         </w:rPr>
         <w:t>CycleLLH</w:t>
       </w:r>
       <w:r>
         <w:rPr>
-          <w:color w:val="000000"/>
+          <w:rFonts w:eastAsia="宋体"/>
+          <w:color w:val="000000"/>
+          <w:sz w:val="21"/>
+          <w:szCs w:val="21"/>
         </w:rPr>
         <w:t>则从周期性整合角度提高网络流量预测能力</w:t>
       </w:r>
       <w:r>
         <w:rPr>
-          <w:color w:val="000000"/>
+          <w:rFonts w:eastAsia="宋体"/>
+          <w:color w:val="000000"/>
+          <w:sz w:val="21"/>
+          <w:szCs w:val="21"/>
         </w:rPr>
         <w:t>[10]</w:t>
       </w:r>
       <w:r>
         <w:rPr>
-          <w:color w:val="000000"/>
+          <w:rFonts w:eastAsia="宋体"/>
+          <w:color w:val="000000"/>
+          <w:sz w:val="21"/>
+          <w:szCs w:val="21"/>
         </w:rPr>
         <w:t>。除时域多尺度建模外，频域方法也被广泛用于时间序列预测。</w:t>
       </w:r>
       <w:r>
         <w:rPr>
-          <w:color w:val="000000"/>
-        </w:rPr>
-        <w:t>FEDformer</w:t>
-      </w:r>
-      <w:r>
-        <w:rPr>
-          <w:color w:val="000000"/>
+          <w:rFonts w:eastAsia="宋体"/>
+          <w:color w:val="000000"/>
+          <w:sz w:val="21"/>
+          <w:szCs w:val="21"/>
+        </w:rPr>
+        <w:t>频率增强分解Transformer（Frequency Enhanced Decomposed Transformer，FEDformer）</w:t>
+      </w:r>
+      <w:r>
+        <w:rPr>
+          <w:rFonts w:eastAsia="宋体"/>
+          <w:color w:val="000000"/>
+          <w:sz w:val="21"/>
+          <w:szCs w:val="21"/>
         </w:rPr>
         <w:t>利用频域增强机制提取主要周期成分</w:t>
       </w:r>
       <w:r>
         <w:rPr>
-          <w:color w:val="000000"/>
+          <w:rFonts w:eastAsia="宋体"/>
+          <w:color w:val="000000"/>
+          <w:sz w:val="21"/>
+          <w:szCs w:val="21"/>
         </w:rPr>
         <w:t>[5]</w:t>
       </w:r>
       <w:r>
         <w:rPr>
-          <w:color w:val="000000"/>
+          <w:rFonts w:eastAsia="宋体"/>
+          <w:color w:val="000000"/>
+          <w:sz w:val="21"/>
+          <w:szCs w:val="21"/>
         </w:rPr>
         <w:t>，</w:t>
       </w:r>
       <w:r>
         <w:rPr>
-          <w:color w:val="000000"/>
-        </w:rPr>
-        <w:t>FITS</w:t>
-      </w:r>
-      <w:r>
-        <w:rPr>
-          <w:color w:val="000000"/>
+          <w:rFonts w:eastAsia="宋体"/>
+          <w:color w:val="000000"/>
+          <w:sz w:val="21"/>
+          <w:szCs w:val="21"/>
+        </w:rPr>
+        <w:t>频率插值时间序列分析（Frequency Interpolation Time Series Analysis，FITS）</w:t>
+      </w:r>
+      <w:r>
+        <w:rPr>
+          <w:rFonts w:eastAsia="宋体"/>
+          <w:color w:val="000000"/>
+          <w:sz w:val="21"/>
+          <w:szCs w:val="21"/>
         </w:rPr>
         <w:t>通过频率插值实现轻量时间序列预测</w:t>
       </w:r>
       <w:r>
         <w:rPr>
-          <w:color w:val="000000"/>
+          <w:rFonts w:eastAsia="宋体"/>
+          <w:color w:val="000000"/>
+          <w:sz w:val="21"/>
+          <w:szCs w:val="21"/>
         </w:rPr>
         <w:t>[6]</w:t>
       </w:r>
       <w:r>
         <w:rPr>
-          <w:color w:val="000000"/>
+          <w:rFonts w:eastAsia="宋体"/>
+          <w:color w:val="000000"/>
+          <w:sz w:val="21"/>
+          <w:szCs w:val="21"/>
         </w:rPr>
         <w:t>；</w:t>
       </w:r>
       <w:r>
         <w:rPr>
-          <w:color w:val="000000"/>
+          <w:rFonts w:eastAsia="宋体"/>
+          <w:color w:val="000000"/>
+          <w:sz w:val="21"/>
+          <w:szCs w:val="21"/>
         </w:rPr>
         <w:t>Tang</w:t>
       </w:r>
       <w:r>
         <w:rPr>
-          <w:color w:val="000000"/>
+          <w:rFonts w:eastAsia="宋体"/>
+          <w:color w:val="000000"/>
+          <w:sz w:val="21"/>
+          <w:szCs w:val="21"/>
         </w:rPr>
         <w:t>等</w:t>
       </w:r>
       <w:r>
         <w:rPr>
-          <w:color w:val="000000"/>
+          <w:rFonts w:eastAsia="宋体"/>
+          <w:color w:val="000000"/>
+          <w:sz w:val="21"/>
+          <w:szCs w:val="21"/>
         </w:rPr>
         <w:t>[8]</w:t>
       </w:r>
       <w:r>
         <w:rPr>
-          <w:color w:val="000000"/>
+          <w:rFonts w:eastAsia="宋体"/>
+          <w:color w:val="000000"/>
+          <w:sz w:val="21"/>
+          <w:szCs w:val="21"/>
         </w:rPr>
         <w:t>进一步将频域多层感知机与多尺度注意力结合，用于蜂窝网络流量预测。另一方面，</w:t>
       </w:r>
       <w:r>
         <w:rPr>
-          <w:color w:val="000000"/>
-        </w:rPr>
-        <w:t>DLinear</w:t>
-      </w:r>
-      <w:r>
-        <w:rPr>
-          <w:color w:val="000000"/>
+          <w:rFonts w:eastAsia="宋体"/>
+          <w:color w:val="000000"/>
+          <w:sz w:val="21"/>
+          <w:szCs w:val="21"/>
+        </w:rPr>
+        <w:t>分解线性（Decomposition Linear，DLinear）模型</w:t>
+      </w:r>
+      <w:r>
+        <w:rPr>
+          <w:rFonts w:eastAsia="宋体"/>
+          <w:color w:val="000000"/>
+          <w:sz w:val="21"/>
+          <w:szCs w:val="21"/>
         </w:rPr>
         <w:t>通过趋势项与余项分解配合线性映射实现多步预测，结构简单且参数量较少</w:t>
       </w:r>
       <w:r>
         <w:rPr>
-          <w:color w:val="000000"/>
+          <w:rFonts w:eastAsia="宋体"/>
+          <w:color w:val="000000"/>
+          <w:sz w:val="21"/>
+          <w:szCs w:val="21"/>
         </w:rPr>
         <w:t>[4]</w:t>
       </w:r>
       <w:r>
         <w:rPr>
-          <w:color w:val="000000"/>
+          <w:rFonts w:eastAsia="宋体"/>
+          <w:color w:val="000000"/>
+          <w:sz w:val="21"/>
+          <w:szCs w:val="21"/>
         </w:rPr>
         <w:t>，为构建轻量预测模型提供了基础。</w:t>
       </w:r>
@@ -763,67 +916,100 @@
       </w:pPr>
       <w:r>
         <w:rPr>
-          <w:color w:val="000000"/>
+          <w:rFonts w:eastAsia="宋体"/>
+          <w:color w:val="000000"/>
+          <w:sz w:val="21"/>
+          <w:szCs w:val="21"/>
         </w:rPr>
         <w:t>上述研究表明，多尺度信息和频率特征均有助于描述时间序列的复杂变化，但现有多尺度方法多采用固定的尺度组合或较复杂的混合、注意力结构，不同时间尺度在不同流量状态下的重要程度仍缺少简单有效的动态调节机制。同时，网络流量中的突发变化可能分布于中高频成分，过度保留低频信息也可能造成有效预测信息损失。针对上述问题，本文提出一种基于样本级自适应多尺度加权的轻量网络流量预测方法。首先，对输入序列进行尺度</w:t>
       </w:r>
       <w:r>
         <w:rPr>
-          <w:color w:val="000000"/>
+          <w:rFonts w:eastAsia="宋体"/>
+          <w:color w:val="000000"/>
+          <w:sz w:val="21"/>
+          <w:szCs w:val="21"/>
         </w:rPr>
         <w:t>1</w:t>
       </w:r>
       <w:r>
         <w:rPr>
-          <w:color w:val="000000"/>
+          <w:rFonts w:eastAsia="宋体"/>
+          <w:color w:val="000000"/>
+          <w:sz w:val="21"/>
+          <w:szCs w:val="21"/>
         </w:rPr>
         <w:t>、</w:t>
       </w:r>
       <w:r>
         <w:rPr>
-          <w:color w:val="000000"/>
+          <w:rFonts w:eastAsia="宋体"/>
+          <w:color w:val="000000"/>
+          <w:sz w:val="21"/>
+          <w:szCs w:val="21"/>
         </w:rPr>
         <w:t>2</w:t>
       </w:r>
       <w:r>
         <w:rPr>
-          <w:color w:val="000000"/>
+          <w:rFonts w:eastAsia="宋体"/>
+          <w:color w:val="000000"/>
+          <w:sz w:val="21"/>
+          <w:szCs w:val="21"/>
         </w:rPr>
         <w:t>和</w:t>
       </w:r>
       <w:r>
         <w:rPr>
-          <w:color w:val="000000"/>
+          <w:rFonts w:eastAsia="宋体"/>
+          <w:color w:val="000000"/>
+          <w:sz w:val="21"/>
+          <w:szCs w:val="21"/>
         </w:rPr>
         <w:t>4</w:t>
       </w:r>
       <w:r>
         <w:rPr>
-          <w:color w:val="000000"/>
+          <w:rFonts w:eastAsia="宋体"/>
+          <w:color w:val="000000"/>
+          <w:sz w:val="21"/>
+          <w:szCs w:val="21"/>
         </w:rPr>
         <w:t>的非重叠平均池化，构造不同时间分辨率的序列，并分别采用独立</w:t>
       </w:r>
       <w:r>
         <w:rPr>
-          <w:color w:val="000000"/>
+          <w:rFonts w:eastAsia="宋体"/>
+          <w:color w:val="000000"/>
+          <w:sz w:val="21"/>
+          <w:szCs w:val="21"/>
         </w:rPr>
         <w:t>DLinear</w:t>
       </w:r>
       <w:r>
         <w:rPr>
-          <w:color w:val="000000"/>
+          <w:rFonts w:eastAsia="宋体"/>
+          <w:color w:val="000000"/>
+          <w:sz w:val="21"/>
+          <w:szCs w:val="21"/>
         </w:rPr>
         <w:t>模型进行预测；其次，根据输入窗口的均值、标准差、末时刻均值和平均绝对一阶差分生成样本级尺度权重，实现不同尺度预测结果的自适应融合；最后，引入低频门控作为辅助分析模块，考察不同频率保留比例对预测性能的影响。该方法不依赖显式网络拓扑和复杂注意力结构，重点分析不同时间分辨率信息及其自适应融合对骨干网络</w:t>
       </w:r>
       <w:r>
         <w:rPr>
-          <w:color w:val="000000"/>
+          <w:rFonts w:eastAsia="宋体"/>
+          <w:color w:val="000000"/>
+          <w:sz w:val="21"/>
+          <w:szCs w:val="21"/>
         </w:rPr>
         <w:t>OD</w:t>
       </w:r>
       <w:r>
         <w:rPr>
-          <w:color w:val="000000"/>
+          <w:rFonts w:eastAsia="宋体"/>
+          <w:color w:val="000000"/>
+          <w:sz w:val="21"/>
+          <w:szCs w:val="21"/>
         </w:rPr>
         <w:t>流量短期预测的作用。</w:t>
       </w:r>
@@ -870,19 +1056,28 @@
     <w:p>
       <w:r>
         <w:rPr>
-          <w:color w:val="000000"/>
+          <w:rFonts w:eastAsia="宋体"/>
+          <w:color w:val="000000"/>
+          <w:sz w:val="21"/>
+          <w:szCs w:val="21"/>
         </w:rPr>
         <w:t>本文方法由预处理、多尺度构造、尺度专家、统计路由和预测融合五部分组成。无频域自适应多尺度结构作为主模型；可学习低频门控作为辅助模块，仅用于分析频率保留比例。整体流程如图</w:t>
       </w:r>
       <w:r>
         <w:rPr>
-          <w:color w:val="000000"/>
+          <w:rFonts w:eastAsia="宋体"/>
+          <w:color w:val="000000"/>
+          <w:sz w:val="21"/>
+          <w:szCs w:val="21"/>
         </w:rPr>
         <w:t>1</w:t>
       </w:r>
       <w:r>
         <w:rPr>
-          <w:color w:val="000000"/>
+          <w:rFonts w:eastAsia="宋体"/>
+          <w:color w:val="000000"/>
+          <w:sz w:val="21"/>
+          <w:szCs w:val="21"/>
         </w:rPr>
         <w:t>所示。</w:t>
       </w:r>
@@ -1022,9 +1217,19 @@
         <w:spacing w:line="360" w:lineRule="auto"/>
       </w:pPr>
       <w:r>
+        <w:rPr>
+          <w:rFonts w:eastAsia="宋体"/>
+          <w:sz w:val="21"/>
+          <w:szCs w:val="21"/>
+        </w:rPr>
         <w:t>设预处理后的多变量流量序列为</w:t>
       </w:r>
       <w:r>
+        <w:rPr>
+          <w:rFonts w:eastAsia="宋体"/>
+          <w:sz w:val="21"/>
+          <w:szCs w:val="21"/>
+        </w:rPr>
         <w:t xml:space="preserve"> x_t</w:t>
       </w:r>
       <w:r>
@@ -1034,36 +1239,91 @@
         <w:t>∈</w:t>
       </w:r>
       <w:r>
+        <w:rPr>
+          <w:rFonts w:eastAsia="宋体"/>
+          <w:sz w:val="21"/>
+          <w:szCs w:val="21"/>
+        </w:rPr>
         <w:t>R^C</w:t>
       </w:r>
       <w:r>
+        <w:rPr>
+          <w:rFonts w:eastAsia="宋体"/>
+          <w:sz w:val="21"/>
+          <w:szCs w:val="21"/>
+        </w:rPr>
         <w:t>，其中</w:t>
       </w:r>
       <w:r>
+        <w:rPr>
+          <w:rFonts w:eastAsia="宋体"/>
+          <w:sz w:val="21"/>
+          <w:szCs w:val="21"/>
+        </w:rPr>
         <w:t>t</w:t>
       </w:r>
       <w:r>
+        <w:rPr>
+          <w:rFonts w:eastAsia="宋体"/>
+          <w:sz w:val="21"/>
+          <w:szCs w:val="21"/>
+        </w:rPr>
         <w:t>为时间索引，</w:t>
       </w:r>
       <w:r>
+        <w:rPr>
+          <w:rFonts w:eastAsia="宋体"/>
+          <w:sz w:val="21"/>
+          <w:szCs w:val="21"/>
+        </w:rPr>
         <w:t>C</w:t>
       </w:r>
       <w:r>
+        <w:rPr>
+          <w:rFonts w:eastAsia="宋体"/>
+          <w:sz w:val="21"/>
+          <w:szCs w:val="21"/>
+        </w:rPr>
         <w:t>为</w:t>
       </w:r>
       <w:r>
+        <w:rPr>
+          <w:rFonts w:eastAsia="宋体"/>
+          <w:sz w:val="21"/>
+          <w:szCs w:val="21"/>
+        </w:rPr>
         <w:t>OD</w:t>
       </w:r>
       <w:r>
+        <w:rPr>
+          <w:rFonts w:eastAsia="宋体"/>
+          <w:sz w:val="21"/>
+          <w:szCs w:val="21"/>
+        </w:rPr>
         <w:t>变量数。第</w:t>
       </w:r>
       <w:r>
+        <w:rPr>
+          <w:rFonts w:eastAsia="宋体"/>
+          <w:sz w:val="21"/>
+          <w:szCs w:val="21"/>
+        </w:rPr>
         <w:t>n</w:t>
       </w:r>
       <w:r>
+        <w:rPr>
+          <w:rFonts w:eastAsia="宋体"/>
+          <w:sz w:val="21"/>
+          <w:szCs w:val="21"/>
+        </w:rPr>
         <w:t>个样本的输入</w:t>
       </w:r>
       <w:r>
+        <w:rPr>
+          <w:rFonts w:eastAsia="宋体"/>
+          <w:sz w:val="21"/>
+          <w:szCs w:val="21"/>
+        </w:rPr>
         <w:lastRenderedPageBreak/>
         <w:t>和目标分别为</w:t>
       </w:r>
@@ -1561,36 +1821,91 @@
         <w:spacing w:line="360" w:lineRule="auto"/>
       </w:pPr>
       <w:r>
+        <w:rPr>
+          <w:rFonts w:eastAsia="宋体"/>
+          <w:sz w:val="21"/>
+          <w:szCs w:val="21"/>
+        </w:rPr>
         <w:t>本文取输入长度</w:t>
       </w:r>
       <w:r>
+        <w:rPr>
+          <w:rFonts w:eastAsia="宋体"/>
+          <w:sz w:val="21"/>
+          <w:szCs w:val="21"/>
+        </w:rPr>
         <w:t>L=96</w:t>
       </w:r>
       <w:r>
+        <w:rPr>
+          <w:rFonts w:eastAsia="宋体"/>
+          <w:sz w:val="21"/>
+          <w:szCs w:val="21"/>
+        </w:rPr>
         <w:t>、预测长度</w:t>
       </w:r>
       <w:r>
+        <w:rPr>
+          <w:rFonts w:eastAsia="宋体"/>
+          <w:sz w:val="21"/>
+          <w:szCs w:val="21"/>
+        </w:rPr>
         <w:t>H=24</w:t>
       </w:r>
       <w:r>
+        <w:rPr>
+          <w:rFonts w:eastAsia="宋体"/>
+          <w:sz w:val="21"/>
+          <w:szCs w:val="21"/>
+        </w:rPr>
         <w:t>、变量数</w:t>
       </w:r>
       <w:r>
+        <w:rPr>
+          <w:rFonts w:eastAsia="宋体"/>
+          <w:sz w:val="21"/>
+          <w:szCs w:val="21"/>
+        </w:rPr>
         <w:t>C=144</w:t>
       </w:r>
       <w:r>
+        <w:rPr>
+          <w:rFonts w:eastAsia="宋体"/>
+          <w:sz w:val="21"/>
+          <w:szCs w:val="21"/>
+        </w:rPr>
         <w:t>，学习映射</w:t>
       </w:r>
       <w:r>
+        <w:rPr>
+          <w:rFonts w:eastAsia="宋体"/>
+          <w:sz w:val="21"/>
+          <w:szCs w:val="21"/>
+        </w:rPr>
         <w:t>Ŷ_n=f_θ(X_n)</w:t>
       </w:r>
       <w:r>
+        <w:rPr>
+          <w:rFonts w:eastAsia="宋体"/>
+          <w:sz w:val="21"/>
+          <w:szCs w:val="21"/>
+        </w:rPr>
         <w:t>。原始非负流量</w:t>
       </w:r>
       <w:r>
+        <w:rPr>
+          <w:rFonts w:eastAsia="宋体"/>
+          <w:sz w:val="21"/>
+          <w:szCs w:val="21"/>
+        </w:rPr>
         <w:t>v_{t,c}</w:t>
       </w:r>
       <w:r>
+        <w:rPr>
+          <w:rFonts w:eastAsia="宋体"/>
+          <w:sz w:val="21"/>
+          <w:szCs w:val="21"/>
+        </w:rPr>
         <w:t>先作对数变换</w:t>
       </w:r>
     </w:p>
@@ -1796,6 +2111,11 @@
         <w:spacing w:line="360" w:lineRule="auto"/>
       </w:pPr>
       <w:r>
+        <w:rPr>
+          <w:rFonts w:eastAsia="宋体"/>
+          <w:sz w:val="21"/>
+          <w:szCs w:val="21"/>
+        </w:rPr>
         <w:t>再按变量进行标准化：</w:t>
       </w:r>
     </w:p>
@@ -2081,21 +2401,51 @@
         <w:spacing w:line="360" w:lineRule="auto"/>
       </w:pPr>
       <w:r>
+        <w:rPr>
+          <w:rFonts w:eastAsia="宋体"/>
+          <w:sz w:val="21"/>
+          <w:szCs w:val="21"/>
+        </w:rPr>
         <w:t>其中</w:t>
       </w:r>
       <w:r>
+        <w:rPr>
+          <w:rFonts w:eastAsia="宋体"/>
+          <w:sz w:val="21"/>
+          <w:szCs w:val="21"/>
+        </w:rPr>
         <w:t>μ_c^{tr}</w:t>
       </w:r>
       <w:r>
+        <w:rPr>
+          <w:rFonts w:eastAsia="宋体"/>
+          <w:sz w:val="21"/>
+          <w:szCs w:val="21"/>
+        </w:rPr>
         <w:t>和</w:t>
       </w:r>
       <w:r>
+        <w:rPr>
+          <w:rFonts w:eastAsia="宋体"/>
+          <w:sz w:val="21"/>
+          <w:szCs w:val="21"/>
+        </w:rPr>
         <w:t>σ_c^{tr}</w:t>
       </w:r>
       <w:r>
+        <w:rPr>
+          <w:rFonts w:eastAsia="宋体"/>
+          <w:sz w:val="21"/>
+          <w:szCs w:val="21"/>
+        </w:rPr>
         <w:t>只由训练集计算，再用于验证集和测试集，避免未来信息进入训练过程。时间点按</w:t>
       </w:r>
       <w:r>
+        <w:rPr>
+          <w:rFonts w:eastAsia="宋体"/>
+          <w:sz w:val="21"/>
+          <w:szCs w:val="21"/>
+        </w:rPr>
         <w:t>6</w:t>
       </w:r>
       <w:r>
@@ -2105,6 +2455,11 @@
         <w:t>∶</w:t>
       </w:r>
       <w:r>
+        <w:rPr>
+          <w:rFonts w:eastAsia="宋体"/>
+          <w:sz w:val="21"/>
+          <w:szCs w:val="21"/>
+        </w:rPr>
         <w:t>2</w:t>
       </w:r>
       <w:r>
@@ -2114,9 +2469,19 @@
         <w:t>∶</w:t>
       </w:r>
       <w:r>
+        <w:rPr>
+          <w:rFonts w:eastAsia="宋体"/>
+          <w:sz w:val="21"/>
+          <w:szCs w:val="21"/>
+        </w:rPr>
         <w:t>2</w:t>
       </w:r>
       <w:r>
+        <w:rPr>
+          <w:rFonts w:eastAsia="宋体"/>
+          <w:sz w:val="21"/>
+          <w:szCs w:val="21"/>
+        </w:rPr>
         <w:t>顺序划分，不随机打乱原始时间位置；每个集合内部独立构造滑动窗口，避免跨边界使用数据。</w:t>
       </w:r>
     </w:p>
@@ -2159,24 +2524,59 @@
         <w:spacing w:line="360" w:lineRule="auto"/>
       </w:pPr>
       <w:r>
+        <w:rPr>
+          <w:rFonts w:eastAsia="宋体"/>
+          <w:sz w:val="21"/>
+          <w:szCs w:val="21"/>
+        </w:rPr>
         <w:t>设尺度集合</w:t>
       </w:r>
       <w:r>
+        <w:rPr>
+          <w:rFonts w:eastAsia="宋体"/>
+          <w:sz w:val="21"/>
+          <w:szCs w:val="21"/>
+        </w:rPr>
         <w:t>S={1,2,4}</w:t>
       </w:r>
       <w:r>
+        <w:rPr>
+          <w:rFonts w:eastAsia="宋体"/>
+          <w:sz w:val="21"/>
+          <w:szCs w:val="21"/>
+        </w:rPr>
         <w:t>。对尺度</w:t>
       </w:r>
       <w:r>
+        <w:rPr>
+          <w:rFonts w:eastAsia="宋体"/>
+          <w:sz w:val="21"/>
+          <w:szCs w:val="21"/>
+        </w:rPr>
         <w:t>s</w:t>
       </w:r>
       <w:r>
+        <w:rPr>
+          <w:rFonts w:eastAsia="宋体"/>
+          <w:sz w:val="21"/>
+          <w:szCs w:val="21"/>
+        </w:rPr>
         <w:t>，使用窗口大小和步长均为</w:t>
       </w:r>
       <w:r>
+        <w:rPr>
+          <w:rFonts w:eastAsia="宋体"/>
+          <w:sz w:val="21"/>
+          <w:szCs w:val="21"/>
+        </w:rPr>
         <w:t>s</w:t>
       </w:r>
       <w:r>
+        <w:rPr>
+          <w:rFonts w:eastAsia="宋体"/>
+          <w:sz w:val="21"/>
+          <w:szCs w:val="21"/>
+        </w:rPr>
         <w:t>的非重叠平均池化：</w:t>
       </w:r>
     </w:p>
@@ -2516,48 +2916,123 @@
         <w:spacing w:line="360" w:lineRule="auto"/>
       </w:pPr>
       <w:r>
+        <w:rPr>
+          <w:rFonts w:eastAsia="宋体"/>
+          <w:sz w:val="21"/>
+          <w:szCs w:val="21"/>
+        </w:rPr>
         <w:t>三个尺度的输入长度依次为</w:t>
       </w:r>
       <w:r>
+        <w:rPr>
+          <w:rFonts w:eastAsia="宋体"/>
+          <w:sz w:val="21"/>
+          <w:szCs w:val="21"/>
+        </w:rPr>
         <w:t>96</w:t>
       </w:r>
       <w:r>
+        <w:rPr>
+          <w:rFonts w:eastAsia="宋体"/>
+          <w:sz w:val="21"/>
+          <w:szCs w:val="21"/>
+        </w:rPr>
         <w:t>、</w:t>
       </w:r>
       <w:r>
+        <w:rPr>
+          <w:rFonts w:eastAsia="宋体"/>
+          <w:sz w:val="21"/>
+          <w:szCs w:val="21"/>
+        </w:rPr>
         <w:t>48</w:t>
       </w:r>
       <w:r>
+        <w:rPr>
+          <w:rFonts w:eastAsia="宋体"/>
+          <w:sz w:val="21"/>
+          <w:szCs w:val="21"/>
+        </w:rPr>
         <w:t>和</w:t>
       </w:r>
       <w:r>
+        <w:rPr>
+          <w:rFonts w:eastAsia="宋体"/>
+          <w:sz w:val="21"/>
+          <w:szCs w:val="21"/>
+        </w:rPr>
         <w:t>24</w:t>
       </w:r>
       <w:r>
+        <w:rPr>
+          <w:rFonts w:eastAsia="宋体"/>
+          <w:sz w:val="21"/>
+          <w:szCs w:val="21"/>
+        </w:rPr>
         <w:t>。尺度</w:t>
       </w:r>
       <w:r>
+        <w:rPr>
+          <w:rFonts w:eastAsia="宋体"/>
+          <w:sz w:val="21"/>
+          <w:szCs w:val="21"/>
+        </w:rPr>
         <w:t>1</w:t>
       </w:r>
       <w:r>
+        <w:rPr>
+          <w:rFonts w:eastAsia="宋体"/>
+          <w:sz w:val="21"/>
+          <w:szCs w:val="21"/>
+        </w:rPr>
         <w:t>保留逐小时细节，尺度</w:t>
       </w:r>
       <w:r>
+        <w:rPr>
+          <w:rFonts w:eastAsia="宋体"/>
+          <w:sz w:val="21"/>
+          <w:szCs w:val="21"/>
+        </w:rPr>
         <w:t>2</w:t>
       </w:r>
       <w:r>
+        <w:rPr>
+          <w:rFonts w:eastAsia="宋体"/>
+          <w:sz w:val="21"/>
+          <w:szCs w:val="21"/>
+        </w:rPr>
         <w:t>和</w:t>
       </w:r>
       <w:r>
+        <w:rPr>
+          <w:rFonts w:eastAsia="宋体"/>
+          <w:sz w:val="21"/>
+          <w:szCs w:val="21"/>
+        </w:rPr>
         <w:t>4</w:t>
       </w:r>
       <w:r>
+        <w:rPr>
+          <w:rFonts w:eastAsia="宋体"/>
+          <w:sz w:val="21"/>
+          <w:szCs w:val="21"/>
+        </w:rPr>
         <w:t>逐步平滑局部扰动并扩大单个表示对应的时间范围。由于</w:t>
       </w:r>
       <w:r>
+        <w:rPr>
+          <w:rFonts w:eastAsia="宋体"/>
+          <w:sz w:val="21"/>
+          <w:szCs w:val="21"/>
+        </w:rPr>
         <w:t>L</w:t>
       </w:r>
       <w:r>
+        <w:rPr>
+          <w:rFonts w:eastAsia="宋体"/>
+          <w:sz w:val="21"/>
+          <w:szCs w:val="21"/>
+        </w:rPr>
         <w:t>能被各尺度整除，池化不需要补零或裁剪。平均池化本身不增加可训练参数，也使三条支路的含义明确。</w:t>
       </w:r>
     </w:p>
@@ -2600,30 +3075,75 @@
         <w:spacing w:line="360" w:lineRule="auto"/>
       </w:pPr>
       <w:r>
+        <w:rPr>
+          <w:rFonts w:eastAsia="宋体"/>
+          <w:sz w:val="21"/>
+          <w:szCs w:val="21"/>
+        </w:rPr>
         <w:t>每个尺度配置一个独立</w:t>
       </w:r>
       <w:r>
+        <w:rPr>
+          <w:rFonts w:eastAsia="宋体"/>
+          <w:sz w:val="21"/>
+          <w:szCs w:val="21"/>
+        </w:rPr>
         <w:t>DLinear</w:t>
       </w:r>
       <w:r>
+        <w:rPr>
+          <w:rFonts w:eastAsia="宋体"/>
+          <w:sz w:val="21"/>
+          <w:szCs w:val="21"/>
+        </w:rPr>
         <w:t>专家</w:t>
       </w:r>
       <w:r>
+        <w:rPr>
+          <w:rFonts w:eastAsia="宋体"/>
+          <w:sz w:val="21"/>
+          <w:szCs w:val="21"/>
+        </w:rPr>
         <w:t>[7]</w:t>
       </w:r>
       <w:r>
+        <w:rPr>
+          <w:rFonts w:eastAsia="宋体"/>
+          <w:sz w:val="21"/>
+          <w:szCs w:val="21"/>
+        </w:rPr>
         <w:t>。对尺度</w:t>
       </w:r>
       <w:r>
+        <w:rPr>
+          <w:rFonts w:eastAsia="宋体"/>
+          <w:sz w:val="21"/>
+          <w:szCs w:val="21"/>
+        </w:rPr>
         <w:t>s</w:t>
       </w:r>
       <w:r>
+        <w:rPr>
+          <w:rFonts w:eastAsia="宋体"/>
+          <w:sz w:val="21"/>
+          <w:szCs w:val="21"/>
+        </w:rPr>
         <w:t>的输入，以长度</w:t>
       </w:r>
       <w:r>
+        <w:rPr>
+          <w:rFonts w:eastAsia="宋体"/>
+          <w:sz w:val="21"/>
+          <w:szCs w:val="21"/>
+        </w:rPr>
         <w:t>q=25</w:t>
       </w:r>
       <w:r>
+        <w:rPr>
+          <w:rFonts w:eastAsia="宋体"/>
+          <w:sz w:val="21"/>
+          <w:szCs w:val="21"/>
+        </w:rPr>
         <w:t>的中心移动平均提取趋势项，序列两端采用端点复制以保持长度：</w:t>
       </w:r>
     </w:p>
@@ -3239,24 +3759,59 @@
         <w:spacing w:line="360" w:lineRule="auto"/>
       </w:pPr>
       <w:r>
+        <w:rPr>
+          <w:rFonts w:eastAsia="宋体"/>
+          <w:sz w:val="21"/>
+          <w:szCs w:val="21"/>
+        </w:rPr>
         <w:t>趋势项</w:t>
       </w:r>
       <w:r>
+        <w:rPr>
+          <w:rFonts w:eastAsia="宋体"/>
+          <w:sz w:val="21"/>
+          <w:szCs w:val="21"/>
+        </w:rPr>
         <w:t>T^{(s)}</w:t>
       </w:r>
       <w:r>
+        <w:rPr>
+          <w:rFonts w:eastAsia="宋体"/>
+          <w:sz w:val="21"/>
+          <w:szCs w:val="21"/>
+        </w:rPr>
         <w:t>和余项</w:t>
       </w:r>
       <w:r>
+        <w:rPr>
+          <w:rFonts w:eastAsia="宋体"/>
+          <w:sz w:val="21"/>
+          <w:szCs w:val="21"/>
+        </w:rPr>
         <w:t>R^{(s)}</w:t>
       </w:r>
       <w:r>
+        <w:rPr>
+          <w:rFonts w:eastAsia="宋体"/>
+          <w:sz w:val="21"/>
+          <w:szCs w:val="21"/>
+        </w:rPr>
         <w:t>沿时间维分别通过线性层映射到预测长度</w:t>
       </w:r>
       <w:r>
+        <w:rPr>
+          <w:rFonts w:eastAsia="宋体"/>
+          <w:sz w:val="21"/>
+          <w:szCs w:val="21"/>
+        </w:rPr>
         <w:t>H</w:t>
       </w:r>
       <w:r>
+        <w:rPr>
+          <w:rFonts w:eastAsia="宋体"/>
+          <w:sz w:val="21"/>
+          <w:szCs w:val="21"/>
+        </w:rPr>
         <w:t>：</w:t>
       </w:r>
     </w:p>
@@ -3810,18 +4365,43 @@
         <w:spacing w:line="360" w:lineRule="auto"/>
       </w:pPr>
       <w:r>
+        <w:rPr>
+          <w:rFonts w:eastAsia="宋体"/>
+          <w:sz w:val="21"/>
+          <w:szCs w:val="21"/>
+        </w:rPr>
         <w:t>同一尺度内的</w:t>
       </w:r>
       <w:r>
+        <w:rPr>
+          <w:rFonts w:eastAsia="宋体"/>
+          <w:sz w:val="21"/>
+          <w:szCs w:val="21"/>
+        </w:rPr>
         <w:t>144</w:t>
       </w:r>
       <w:r>
+        <w:rPr>
+          <w:rFonts w:eastAsia="宋体"/>
+          <w:sz w:val="21"/>
+          <w:szCs w:val="21"/>
+        </w:rPr>
         <w:t>个变量共享时间映射权重，三个尺度使用不同参数。共享权重显著控制参数量，但不会显式学习</w:t>
       </w:r>
       <w:r>
+        <w:rPr>
+          <w:rFonts w:eastAsia="宋体"/>
+          <w:sz w:val="21"/>
+          <w:szCs w:val="21"/>
+        </w:rPr>
         <w:t>OD</w:t>
       </w:r>
       <w:r>
+        <w:rPr>
+          <w:rFonts w:eastAsia="宋体"/>
+          <w:sz w:val="21"/>
+          <w:szCs w:val="21"/>
+        </w:rPr>
         <w:t>变量间的拓扑关系。三个专家观察不同分辨率的输入，因此即使主干结构相同，也会形成互补预测。</w:t>
       </w:r>
     </w:p>
@@ -3865,18 +4445,43 @@
         <w:spacing w:line="360" w:lineRule="auto"/>
       </w:pPr>
       <w:r>
+        <w:rPr>
+          <w:rFonts w:eastAsia="宋体"/>
+          <w:sz w:val="21"/>
+          <w:szCs w:val="21"/>
+        </w:rPr>
         <w:t>固定平均默认三个尺度对每个窗口同等重要，难以反映流量状态差异。本文从原始输入</w:t>
       </w:r>
       <w:r>
+        <w:rPr>
+          <w:rFonts w:eastAsia="宋体"/>
+          <w:sz w:val="21"/>
+          <w:szCs w:val="21"/>
+        </w:rPr>
         <w:t>X_n</w:t>
       </w:r>
       <w:r>
+        <w:rPr>
+          <w:rFonts w:eastAsia="宋体"/>
+          <w:sz w:val="21"/>
+          <w:szCs w:val="21"/>
+        </w:rPr>
         <w:t>提取四维统计向量</w:t>
       </w:r>
       <w:r>
+        <w:rPr>
+          <w:rFonts w:eastAsia="宋体"/>
+          <w:sz w:val="21"/>
+          <w:szCs w:val="21"/>
+        </w:rPr>
         <w:t>z_n=[μ_n,σ_n,ℓ_n,d_n]</w:t>
       </w:r>
       <w:r>
+        <w:rPr>
+          <w:rFonts w:eastAsia="宋体"/>
+          <w:sz w:val="21"/>
+          <w:szCs w:val="21"/>
+        </w:rPr>
         <w:t>，其中</w:t>
       </w:r>
     </w:p>
@@ -4878,33 +5483,83 @@
         <w:spacing w:line="360" w:lineRule="auto"/>
       </w:pPr>
       <w:r>
+        <w:rPr>
+          <w:rFonts w:eastAsia="宋体"/>
+          <w:sz w:val="21"/>
+          <w:szCs w:val="21"/>
+        </w:rPr>
         <w:t>μ_n</w:t>
       </w:r>
       <w:r>
+        <w:rPr>
+          <w:rFonts w:eastAsia="宋体"/>
+          <w:sz w:val="21"/>
+          <w:szCs w:val="21"/>
+        </w:rPr>
         <w:t>描述窗口总体水平，</w:t>
       </w:r>
       <w:r>
+        <w:rPr>
+          <w:rFonts w:eastAsia="宋体"/>
+          <w:sz w:val="21"/>
+          <w:szCs w:val="21"/>
+        </w:rPr>
         <w:t>σ_n</w:t>
       </w:r>
       <w:r>
+        <w:rPr>
+          <w:rFonts w:eastAsia="宋体"/>
+          <w:sz w:val="21"/>
+          <w:szCs w:val="21"/>
+        </w:rPr>
         <w:t>描述离散程度，</w:t>
       </w:r>
       <w:r>
+        <w:rPr>
+          <w:rFonts w:eastAsia="宋体"/>
+          <w:sz w:val="21"/>
+          <w:szCs w:val="21"/>
+        </w:rPr>
         <w:t>ℓ_n</w:t>
       </w:r>
       <w:r>
+        <w:rPr>
+          <w:rFonts w:eastAsia="宋体"/>
+          <w:sz w:val="21"/>
+          <w:szCs w:val="21"/>
+        </w:rPr>
         <w:t>描述最近时刻状态，</w:t>
       </w:r>
       <w:r>
+        <w:rPr>
+          <w:rFonts w:eastAsia="宋体"/>
+          <w:sz w:val="21"/>
+          <w:szCs w:val="21"/>
+        </w:rPr>
         <w:t>d_n</w:t>
       </w:r>
       <w:r>
+        <w:rPr>
+          <w:rFonts w:eastAsia="宋体"/>
+          <w:sz w:val="21"/>
+          <w:szCs w:val="21"/>
+        </w:rPr>
         <w:t>描述平均变化强度。四维向量经隐藏维数为</w:t>
       </w:r>
       <w:r>
+        <w:rPr>
+          <w:rFonts w:eastAsia="宋体"/>
+          <w:sz w:val="21"/>
+          <w:szCs w:val="21"/>
+        </w:rPr>
         <w:t>16</w:t>
       </w:r>
       <w:r>
+        <w:rPr>
+          <w:rFonts w:eastAsia="宋体"/>
+          <w:sz w:val="21"/>
+          <w:szCs w:val="21"/>
+        </w:rPr>
         <w:t>的两层感知器得到三个尺度分数：</w:t>
       </w:r>
     </w:p>
@@ -5180,15 +5835,35 @@
         <w:spacing w:line="360" w:lineRule="auto"/>
       </w:pPr>
       <w:r>
+        <w:rPr>
+          <w:rFonts w:eastAsia="宋体"/>
+          <w:sz w:val="21"/>
+          <w:szCs w:val="21"/>
+        </w:rPr>
         <w:t>Softmax</w:t>
       </w:r>
       <w:r>
+        <w:rPr>
+          <w:rFonts w:eastAsia="宋体"/>
+          <w:sz w:val="21"/>
+          <w:szCs w:val="21"/>
+        </w:rPr>
         <w:t>将分数转换为非负、和为</w:t>
       </w:r>
       <w:r>
+        <w:rPr>
+          <w:rFonts w:eastAsia="宋体"/>
+          <w:sz w:val="21"/>
+          <w:szCs w:val="21"/>
+        </w:rPr>
         <w:t>1</w:t>
       </w:r>
       <w:r>
+        <w:rPr>
+          <w:rFonts w:eastAsia="宋体"/>
+          <w:sz w:val="21"/>
+          <w:szCs w:val="21"/>
+        </w:rPr>
         <w:t>的权重：</w:t>
       </w:r>
     </w:p>
@@ -5664,6 +6339,11 @@
         <w:spacing w:line="360" w:lineRule="auto"/>
       </w:pPr>
       <w:r>
+        <w:rPr>
+          <w:rFonts w:eastAsia="宋体"/>
+          <w:sz w:val="21"/>
+          <w:szCs w:val="21"/>
+        </w:rPr>
         <w:t>最终预测为</w:t>
       </w:r>
     </w:p>
@@ -5915,18 +6595,43 @@
         <w:spacing w:line="360" w:lineRule="auto"/>
       </w:pPr>
       <w:r>
+        <w:rPr>
+          <w:rFonts w:eastAsia="宋体"/>
+          <w:sz w:val="21"/>
+          <w:szCs w:val="21"/>
+        </w:rPr>
         <w:t>每个样本单独生成一组权重，同一样本的全部</w:t>
       </w:r>
       <w:r>
+        <w:rPr>
+          <w:rFonts w:eastAsia="宋体"/>
+          <w:sz w:val="21"/>
+          <w:szCs w:val="21"/>
+        </w:rPr>
         <w:t>OD</w:t>
       </w:r>
       <w:r>
+        <w:rPr>
+          <w:rFonts w:eastAsia="宋体"/>
+          <w:sz w:val="21"/>
+          <w:szCs w:val="21"/>
+        </w:rPr>
         <w:t>变量共享该组权重。这是一种样本级而不是变量级路由，可控制复杂度并便于解释。固定等权消融令</w:t>
       </w:r>
       <w:r>
+        <w:rPr>
+          <w:rFonts w:eastAsia="宋体"/>
+          <w:sz w:val="21"/>
+          <w:szCs w:val="21"/>
+        </w:rPr>
         <w:t>α_{n,s}=1/3</w:t>
       </w:r>
       <w:r>
+        <w:rPr>
+          <w:rFonts w:eastAsia="宋体"/>
+          <w:sz w:val="21"/>
+          <w:szCs w:val="21"/>
+        </w:rPr>
         <w:t>，其他结构和训练过程完全不变，因此固定组与自适应组的误差差异主要反映权重生成方式。</w:t>
       </w:r>
     </w:p>
@@ -5969,12 +6674,27 @@
         <w:spacing w:line="360" w:lineRule="auto"/>
       </w:pPr>
       <w:r>
+        <w:rPr>
+          <w:rFonts w:eastAsia="宋体"/>
+          <w:sz w:val="21"/>
+          <w:szCs w:val="21"/>
+        </w:rPr>
         <w:t>对长度</w:t>
       </w:r>
       <w:r>
+        <w:rPr>
+          <w:rFonts w:eastAsia="宋体"/>
+          <w:sz w:val="21"/>
+          <w:szCs w:val="21"/>
+        </w:rPr>
         <w:t>L_s=L/s</w:t>
       </w:r>
       <w:r>
+        <w:rPr>
+          <w:rFonts w:eastAsia="宋体"/>
+          <w:sz w:val="21"/>
+          <w:szCs w:val="21"/>
+        </w:rPr>
         <w:t>的尺度输入，先按样本和变量沿时间维计算均值与标准差，得到标准化序列：</w:t>
       </w:r>
     </w:p>
@@ -6435,6 +7155,11 @@
         <w:spacing w:line="360" w:lineRule="auto"/>
       </w:pPr>
       <w:r>
+        <w:rPr>
+          <w:rFonts w:eastAsia="宋体"/>
+          <w:sz w:val="21"/>
+          <w:szCs w:val="21"/>
+        </w:rPr>
         <w:t>沿时间维执行实数快速傅里叶变换：</w:t>
       </w:r>
     </w:p>
@@ -6875,21 +7600,51 @@
         <w:spacing w:line="360" w:lineRule="auto"/>
       </w:pPr>
       <w:r>
-        <w:t>RFFT</w:t>
-      </w:r>
-      <w:r>
+        <w:rPr>
+          <w:rFonts w:eastAsia="宋体"/>
+          <w:sz w:val="21"/>
+          <w:szCs w:val="21"/>
+        </w:rPr>
+        <w:t>实值快速傅里叶变换（real fast Fourier transform，RFFT）</w:t>
+      </w:r>
+      <w:r>
+        <w:rPr>
+          <w:rFonts w:eastAsia="宋体"/>
+          <w:sz w:val="21"/>
+          <w:szCs w:val="21"/>
+        </w:rPr>
         <w:t>共有</w:t>
       </w:r>
       <w:r>
+        <w:rPr>
+          <w:rFonts w:eastAsia="宋体"/>
+          <w:sz w:val="21"/>
+          <w:szCs w:val="21"/>
+        </w:rPr>
         <w:t>L_s/2+1</w:t>
       </w:r>
       <w:r>
+        <w:rPr>
+          <w:rFonts w:eastAsia="宋体"/>
+          <w:sz w:val="21"/>
+          <w:szCs w:val="21"/>
+        </w:rPr>
         <w:t>个非负频率。按比例</w:t>
       </w:r>
       <w:r>
+        <w:rPr>
+          <w:rFonts w:eastAsia="宋体"/>
+          <w:sz w:val="21"/>
+          <w:szCs w:val="21"/>
+        </w:rPr>
         <w:t>r</w:t>
       </w:r>
       <w:r>
+        <w:rPr>
+          <w:rFonts w:eastAsia="宋体"/>
+          <w:sz w:val="21"/>
+          <w:szCs w:val="21"/>
+        </w:rPr>
         <w:t>保留低频个数</w:t>
       </w:r>
     </w:p>
@@ -7131,6 +7886,11 @@
         <w:spacing w:line="360" w:lineRule="auto"/>
       </w:pPr>
       <w:r>
+        <w:rPr>
+          <w:rFonts w:eastAsia="宋体"/>
+          <w:sz w:val="21"/>
+          <w:szCs w:val="21"/>
+        </w:rPr>
         <w:t>并对保留频率施加可学习门控：</w:t>
       </w:r>
     </w:p>
@@ -7624,25 +8384,60 @@
         <w:spacing w:line="360" w:lineRule="auto"/>
       </w:pPr>
       <w:r>
+        <w:rPr>
+          <w:rFonts w:eastAsia="宋体"/>
+          <w:sz w:val="21"/>
+          <w:szCs w:val="21"/>
+        </w:rPr>
         <w:t>门控参数在同一尺度内按频率共享给所有</w:t>
       </w:r>
       <w:r>
+        <w:rPr>
+          <w:rFonts w:eastAsia="宋体"/>
+          <w:sz w:val="21"/>
+          <w:szCs w:val="21"/>
+        </w:rPr>
         <w:t>OD</w:t>
       </w:r>
       <w:r>
+        <w:rPr>
+          <w:rFonts w:eastAsia="宋体"/>
+          <w:sz w:val="21"/>
+          <w:szCs w:val="21"/>
+        </w:rPr>
         <w:t>变量。</w:t>
       </w:r>
       <w:r>
+        <w:rPr>
+          <w:rFonts w:eastAsia="宋体"/>
+          <w:sz w:val="21"/>
+          <w:szCs w:val="21"/>
+        </w:rPr>
         <w:t>IRFFT</w:t>
       </w:r>
       <w:r>
+        <w:rPr>
+          <w:rFonts w:eastAsia="宋体"/>
+          <w:sz w:val="21"/>
+          <w:szCs w:val="21"/>
+        </w:rPr>
         <w:t>将信号恢复到时域，再还原窗口均值与标</w:t>
       </w:r>
       <w:r>
+        <w:rPr>
+          <w:rFonts w:eastAsia="宋体"/>
+          <w:sz w:val="21"/>
+          <w:szCs w:val="21"/>
+        </w:rPr>
         <w:lastRenderedPageBreak/>
         <w:t>准差。实验比较</w:t>
       </w:r>
       <w:r>
+        <w:rPr>
+          <w:rFonts w:eastAsia="宋体"/>
+          <w:sz w:val="21"/>
+          <w:szCs w:val="21"/>
+        </w:rPr>
         <w:t>r</w:t>
       </w:r>
       <w:r>
@@ -7652,15 +8447,35 @@
         <w:t>∈</w:t>
       </w:r>
       <w:r>
+        <w:rPr>
+          <w:rFonts w:eastAsia="宋体"/>
+          <w:sz w:val="21"/>
+          <w:szCs w:val="21"/>
+        </w:rPr>
         <w:t>{0.25,0.50,0.75}</w:t>
       </w:r>
       <w:r>
+        <w:rPr>
+          <w:rFonts w:eastAsia="宋体"/>
+          <w:sz w:val="21"/>
+          <w:szCs w:val="21"/>
+        </w:rPr>
         <w:t>。该设计把频域处理限定为可控低通和衰减，不将其等同于</w:t>
       </w:r>
       <w:r>
+        <w:rPr>
+          <w:rFonts w:eastAsia="宋体"/>
+          <w:sz w:val="21"/>
+          <w:szCs w:val="21"/>
+        </w:rPr>
         <w:t>FITS[10]</w:t>
       </w:r>
       <w:r>
+        <w:rPr>
+          <w:rFonts w:eastAsia="宋体"/>
+          <w:sz w:val="21"/>
+          <w:szCs w:val="21"/>
+        </w:rPr>
         <w:t>的复数频率插值。</w:t>
       </w:r>
     </w:p>
@@ -7703,12 +8518,27 @@
         <w:spacing w:line="360" w:lineRule="auto"/>
       </w:pPr>
       <w:r>
+        <w:rPr>
+          <w:rFonts w:eastAsia="宋体"/>
+          <w:sz w:val="21"/>
+          <w:szCs w:val="21"/>
+        </w:rPr>
         <w:t>模型以所有样本、预测时刻和</w:t>
       </w:r>
       <w:r>
+        <w:rPr>
+          <w:rFonts w:eastAsia="宋体"/>
+          <w:sz w:val="21"/>
+          <w:szCs w:val="21"/>
+        </w:rPr>
         <w:t>OD</w:t>
       </w:r>
       <w:r>
+        <w:rPr>
+          <w:rFonts w:eastAsia="宋体"/>
+          <w:sz w:val="21"/>
+          <w:szCs w:val="21"/>
+        </w:rPr>
         <w:t>变量上的均方误差为目标：</w:t>
       </w:r>
     </w:p>
@@ -8196,48 +9026,123 @@
         <w:spacing w:line="360" w:lineRule="auto"/>
       </w:pPr>
       <w:r>
+        <w:rPr>
+          <w:rFonts w:eastAsia="宋体"/>
+          <w:sz w:val="21"/>
+          <w:szCs w:val="21"/>
+        </w:rPr>
         <w:t>使用</w:t>
       </w:r>
       <w:r>
+        <w:rPr>
+          <w:rFonts w:eastAsia="宋体"/>
+          <w:sz w:val="21"/>
+          <w:szCs w:val="21"/>
+        </w:rPr>
         <w:t>Adam</w:t>
       </w:r>
       <w:r>
+        <w:rPr>
+          <w:rFonts w:eastAsia="宋体"/>
+          <w:sz w:val="21"/>
+          <w:szCs w:val="21"/>
+        </w:rPr>
         <w:t>优化器更新参数，模型选择只依据验证集</w:t>
       </w:r>
       <w:r>
-        <w:t>MSE</w:t>
-      </w:r>
-      <w:r>
+        <w:rPr>
+          <w:rFonts w:eastAsia="宋体"/>
+          <w:sz w:val="21"/>
+          <w:szCs w:val="21"/>
+        </w:rPr>
+        <w:t>均方误差</w:t>
+      </w:r>
+      <w:r>
+        <w:rPr>
+          <w:rFonts w:eastAsia="宋体"/>
+          <w:sz w:val="21"/>
+          <w:szCs w:val="21"/>
+        </w:rPr>
         <w:t>。无频域自适应多尺度模型含</w:t>
       </w:r>
       <w:r>
+        <w:rPr>
+          <w:rFonts w:eastAsia="宋体"/>
+          <w:sz w:val="21"/>
+          <w:szCs w:val="21"/>
+        </w:rPr>
         <w:t>8339</w:t>
       </w:r>
       <w:r>
+        <w:rPr>
+          <w:rFonts w:eastAsia="宋体"/>
+          <w:sz w:val="21"/>
+          <w:szCs w:val="21"/>
+        </w:rPr>
         <w:t>个可训练参数；加入频域门控后，参数量随保留频率数变化，</w:t>
       </w:r>
       <w:r>
+        <w:rPr>
+          <w:rFonts w:eastAsia="宋体"/>
+          <w:sz w:val="21"/>
+          <w:szCs w:val="21"/>
+        </w:rPr>
         <w:t>r=0.50</w:t>
       </w:r>
       <w:r>
+        <w:rPr>
+          <w:rFonts w:eastAsia="宋体"/>
+          <w:sz w:val="21"/>
+          <w:szCs w:val="21"/>
+        </w:rPr>
         <w:t>和</w:t>
       </w:r>
       <w:r>
+        <w:rPr>
+          <w:rFonts w:eastAsia="宋体"/>
+          <w:sz w:val="21"/>
+          <w:szCs w:val="21"/>
+        </w:rPr>
         <w:t>r=0.75</w:t>
       </w:r>
       <w:r>
+        <w:rPr>
+          <w:rFonts w:eastAsia="宋体"/>
+          <w:sz w:val="21"/>
+          <w:szCs w:val="21"/>
+        </w:rPr>
         <w:t>时分别为</w:t>
       </w:r>
       <w:r>
+        <w:rPr>
+          <w:rFonts w:eastAsia="宋体"/>
+          <w:sz w:val="21"/>
+          <w:szCs w:val="21"/>
+        </w:rPr>
         <w:t>8381</w:t>
       </w:r>
       <w:r>
+        <w:rPr>
+          <w:rFonts w:eastAsia="宋体"/>
+          <w:sz w:val="21"/>
+          <w:szCs w:val="21"/>
+        </w:rPr>
         <w:t>和</w:t>
       </w:r>
       <w:r>
+        <w:rPr>
+          <w:rFonts w:eastAsia="宋体"/>
+          <w:sz w:val="21"/>
+          <w:szCs w:val="21"/>
+        </w:rPr>
         <w:t>8402</w:t>
       </w:r>
       <w:r>
+        <w:rPr>
+          <w:rFonts w:eastAsia="宋体"/>
+          <w:sz w:val="21"/>
+          <w:szCs w:val="21"/>
+        </w:rPr>
         <w:t>。其参数增加主要来自尺度专家和门控，不涉及大型注意力矩阵。依据消融结果，无频域版本作为主要方法，频域版本作为敏感性分析对象。</w:t>
       </w:r>
     </w:p>
@@ -8318,7 +9223,10 @@
     <w:p>
       <w:r>
         <w:rPr>
-          <w:color w:val="000000"/>
+          <w:rFonts w:eastAsia="宋体"/>
+          <w:color w:val="000000"/>
+          <w:sz w:val="21"/>
+          <w:szCs w:val="21"/>
         </w:rPr>
         <w:t>实验使用CESNET TS-Zoo公开的Abilene骨干网1 h聚合流量矩阵，从字段matrix_avg_realOD提取144维有效OD流量序列，共4656个时间点。按照时间顺序以6∶2∶2划分训练集、验证集和测试集，分别包含2793、931和932个时间点。在输入长度L=96、预测长度H=24的条件下，各集合分别形成2674、812和813个滑动窗口。数据预处理与第1.1节一致，先进行log(1+x)变换，再使用训练集统计量按变量标准化；各集合独立构造窗口，不跨越数据集边界。</w:t>
       </w:r>
@@ -8518,9 +9426,12 @@
     <w:p>
       <w:r>
         <w:rPr>
-          <w:color w:val="000000"/>
-        </w:rPr>
-        <w:t>实验在Windows系统、NVIDIA GTX 1060 6 GB显卡和PyTorch 2.5.1+cu118环境下完成。模型采用Adam优化器，学习率为0.001，批量大小为16，最多训练30轮；当验证集MSE连续6轮未改善时提前停止，并保留验证集MSE最低的模型参数。每个配置分别使用随机种子42、43和44独立训练，共完成48次正式训练。</w:t>
+          <w:rFonts w:eastAsia="宋体"/>
+          <w:color w:val="000000"/>
+          <w:sz w:val="21"/>
+          <w:szCs w:val="21"/>
+        </w:rPr>
+        <w:t>实验在Windows系统、NVIDIA GTX 1060 6 GB显卡和PyTorch 2.5.1+cu118环境下完成。模型采用Adam优化器，学习率为0.001，批量大小为16，最多训练30轮；当验证集均方误差连续6轮未改善时提前停止，并保留验证集均方误差最低的模型参数。每个配置分别使用随机种子42、43和44独立训练，共完成48次正式训练。</w:t>
       </w:r>
       <w:r>
         <w:rPr>
@@ -8658,7 +9569,10 @@
     <w:p>
       <w:r>
         <w:rPr>
-          <w:color w:val="000000"/>
+          <w:rFonts w:eastAsia="宋体"/>
+          <w:color w:val="000000"/>
+          <w:sz w:val="21"/>
+          <w:szCs w:val="21"/>
         </w:rPr>
         <w:t>采用均方误差（mean squared error，MSE）、平均绝对误差（mean absolute error，MAE）和均方根误差（root mean squared error，RMSE）评价预测性能。设测试集包含N_te个窗口，则MAE和RMSE分别为</w:t>
       </w:r>
@@ -9070,7 +9984,10 @@
     <w:p>
       <w:r>
         <w:rPr>
-          <w:color w:val="000000"/>
+          <w:rFonts w:eastAsia="宋体"/>
+          <w:color w:val="000000"/>
+          <w:sz w:val="21"/>
+          <w:szCs w:val="21"/>
         </w:rPr>
         <w:t>上述指标均在标准化空间中计算，数值越小表示预测误差越低。由于RMSE是MSE的单调变换，正文表格主要报告MSE和MAE。各配置结果以3个随机种子的均值±样本标准差表示。固定权重与自适应权重使用相同随机种子进行双侧配对t检验，并报告配对差的95%置信区间（confidence interval，CI）及Cohen's d_z；r=0.50下的两项预设比较采用Holm法校正。鉴于独立重复数仅为3，统计检验仅作为误差均值和离散程度的补充，不将813个测试窗口视为独立重复。</w:t>
       </w:r>
@@ -9501,9 +10418,11 @@
             </w:pPr>
             <w:r>
               <w:rPr>
+                <w:rFonts w:eastAsia="宋体"/>
                 <w:b/>
                 <w:color w:val="000000"/>
-                <w:sz w:val="18"/>
+                <w:sz w:val="21"/>
+                <w:szCs w:val="21"/>
               </w:rPr>
               <w:t>模型</w:t>
             </w:r>
@@ -9535,9 +10454,11 @@
             </w:pPr>
             <w:r>
               <w:rPr>
+                <w:rFonts w:eastAsia="宋体"/>
                 <w:b/>
                 <w:color w:val="000000"/>
-                <w:sz w:val="18"/>
+                <w:sz w:val="21"/>
+                <w:szCs w:val="21"/>
               </w:rPr>
               <w:t>参数量</w:t>
             </w:r>
@@ -9569,9 +10490,11 @@
             </w:pPr>
             <w:r>
               <w:rPr>
+                <w:rFonts w:eastAsia="宋体"/>
                 <w:b/>
                 <w:color w:val="000000"/>
-                <w:sz w:val="18"/>
+                <w:sz w:val="21"/>
+                <w:szCs w:val="21"/>
               </w:rPr>
               <w:t>MSE</w:t>
             </w:r>
@@ -9603,9 +10526,11 @@
             </w:pPr>
             <w:r>
               <w:rPr>
+                <w:rFonts w:eastAsia="宋体"/>
                 <w:b/>
                 <w:color w:val="000000"/>
-                <w:sz w:val="18"/>
+                <w:sz w:val="21"/>
+                <w:szCs w:val="21"/>
               </w:rPr>
               <w:t>MAE</w:t>
             </w:r>
@@ -9643,8 +10568,10 @@
             </w:pPr>
             <w:r>
               <w:rPr>
+                <w:rFonts w:eastAsia="宋体"/>
                 <w:color w:val="000000"/>
-                <w:sz w:val="18"/>
+                <w:sz w:val="21"/>
+                <w:szCs w:val="21"/>
               </w:rPr>
               <w:t>DLinear</w:t>
             </w:r>
@@ -9676,8 +10603,10 @@
             </w:pPr>
             <w:r>
               <w:rPr>
+                <w:rFonts w:eastAsia="宋体"/>
                 <w:color w:val="000000"/>
-                <w:sz w:val="18"/>
+                <w:sz w:val="21"/>
+                <w:szCs w:val="21"/>
               </w:rPr>
               <w:t>4656</w:t>
             </w:r>
@@ -9709,8 +10638,10 @@
             </w:pPr>
             <w:r>
               <w:rPr>
+                <w:rFonts w:eastAsia="宋体"/>
                 <w:color w:val="000000"/>
-                <w:sz w:val="18"/>
+                <w:sz w:val="21"/>
+                <w:szCs w:val="21"/>
               </w:rPr>
               <w:t>0.193983±0.001567</w:t>
             </w:r>
@@ -9742,8 +10673,10 @@
             </w:pPr>
             <w:r>
               <w:rPr>
+                <w:rFonts w:eastAsia="宋体"/>
                 <w:color w:val="000000"/>
-                <w:sz w:val="18"/>
+                <w:sz w:val="21"/>
+                <w:szCs w:val="21"/>
               </w:rPr>
               <w:t>0.187988±0.009422</w:t>
             </w:r>
@@ -9781,8 +10714,10 @@
             </w:pPr>
             <w:r>
               <w:rPr>
+                <w:rFonts w:eastAsia="宋体"/>
                 <w:color w:val="000000"/>
-                <w:sz w:val="18"/>
+                <w:sz w:val="21"/>
+                <w:szCs w:val="21"/>
               </w:rPr>
               <w:t>FITS</w:t>
             </w:r>
@@ -9814,8 +10749,10 @@
             </w:pPr>
             <w:r>
               <w:rPr>
+                <w:rFonts w:eastAsia="宋体"/>
                 <w:color w:val="000000"/>
-                <w:sz w:val="18"/>
+                <w:sz w:val="21"/>
+                <w:szCs w:val="21"/>
               </w:rPr>
               <w:t>750</w:t>
             </w:r>
@@ -9847,8 +10784,10 @@
             </w:pPr>
             <w:r>
               <w:rPr>
+                <w:rFonts w:eastAsia="宋体"/>
                 <w:color w:val="000000"/>
-                <w:sz w:val="18"/>
+                <w:sz w:val="21"/>
+                <w:szCs w:val="21"/>
               </w:rPr>
               <w:t>0.202230±0.001972</w:t>
             </w:r>
@@ -9880,8 +10819,10 @@
             </w:pPr>
             <w:r>
               <w:rPr>
+                <w:rFonts w:eastAsia="宋体"/>
                 <w:color w:val="000000"/>
-                <w:sz w:val="18"/>
+                <w:sz w:val="21"/>
+                <w:szCs w:val="21"/>
               </w:rPr>
               <w:t>0.198299±0.003818</w:t>
             </w:r>
@@ -9919,29 +10860,37 @@
             </w:pPr>
             <w:r>
               <w:rPr>
+                <w:rFonts w:eastAsia="宋体"/>
                 <w:color w:val="000000"/>
-                <w:sz w:val="18"/>
+                <w:sz w:val="21"/>
+                <w:szCs w:val="21"/>
               </w:rPr>
               <w:t>DLinear+</w:t>
             </w:r>
             <w:r>
               <w:rPr>
+                <w:rFonts w:eastAsia="宋体"/>
                 <w:color w:val="000000"/>
-                <w:sz w:val="18"/>
+                <w:sz w:val="21"/>
+                <w:szCs w:val="21"/>
               </w:rPr>
               <w:t>频域门控（</w:t>
             </w:r>
             <w:r>
               <w:rPr>
+                <w:rFonts w:eastAsia="宋体"/>
                 <w:color w:val="000000"/>
-                <w:sz w:val="18"/>
+                <w:sz w:val="21"/>
+                <w:szCs w:val="21"/>
               </w:rPr>
               <w:t>r=0.50</w:t>
             </w:r>
             <w:r>
               <w:rPr>
+                <w:rFonts w:eastAsia="宋体"/>
                 <w:color w:val="000000"/>
-                <w:sz w:val="18"/>
+                <w:sz w:val="21"/>
+                <w:szCs w:val="21"/>
               </w:rPr>
               <w:t>）</w:t>
             </w:r>
@@ -9973,8 +10922,10 @@
             </w:pPr>
             <w:r>
               <w:rPr>
+                <w:rFonts w:eastAsia="宋体"/>
                 <w:color w:val="000000"/>
-                <w:sz w:val="18"/>
+                <w:sz w:val="21"/>
+                <w:szCs w:val="21"/>
               </w:rPr>
               <w:t>4680</w:t>
             </w:r>
@@ -10006,8 +10957,10 @@
             </w:pPr>
             <w:r>
               <w:rPr>
+                <w:rFonts w:eastAsia="宋体"/>
                 <w:color w:val="000000"/>
-                <w:sz w:val="18"/>
+                <w:sz w:val="21"/>
+                <w:szCs w:val="21"/>
               </w:rPr>
               <w:t>0.197181±0.000655</w:t>
             </w:r>
@@ -10039,8 +10992,10 @@
             </w:pPr>
             <w:r>
               <w:rPr>
+                <w:rFonts w:eastAsia="宋体"/>
                 <w:color w:val="000000"/>
-                <w:sz w:val="18"/>
+                <w:sz w:val="21"/>
+                <w:szCs w:val="21"/>
               </w:rPr>
               <w:t>0.191756±0.007712</w:t>
             </w:r>
@@ -10078,15 +11033,19 @@
             </w:pPr>
             <w:r>
               <w:rPr>
+                <w:rFonts w:eastAsia="宋体"/>
                 <w:color w:val="000000"/>
-                <w:sz w:val="18"/>
+                <w:sz w:val="21"/>
+                <w:szCs w:val="21"/>
               </w:rPr>
               <w:t>DLinear+</w:t>
             </w:r>
             <w:r>
               <w:rPr>
+                <w:rFonts w:eastAsia="宋体"/>
                 <w:color w:val="000000"/>
-                <w:sz w:val="18"/>
+                <w:sz w:val="21"/>
+                <w:szCs w:val="21"/>
               </w:rPr>
               <w:t>自适应多尺度</w:t>
             </w:r>
@@ -10118,8 +11077,10 @@
             </w:pPr>
             <w:r>
               <w:rPr>
+                <w:rFonts w:eastAsia="宋体"/>
                 <w:color w:val="000000"/>
-                <w:sz w:val="18"/>
+                <w:sz w:val="21"/>
+                <w:szCs w:val="21"/>
               </w:rPr>
               <w:t>8339</w:t>
             </w:r>
@@ -10151,8 +11112,10 @@
             </w:pPr>
             <w:r>
               <w:rPr>
+                <w:rFonts w:eastAsia="宋体"/>
                 <w:color w:val="000000"/>
-                <w:sz w:val="18"/>
+                <w:sz w:val="21"/>
+                <w:szCs w:val="21"/>
               </w:rPr>
               <w:t>0.186099±0.001996</w:t>
             </w:r>
@@ -10184,8 +11147,10 @@
             </w:pPr>
             <w:r>
               <w:rPr>
+                <w:rFonts w:eastAsia="宋体"/>
                 <w:color w:val="000000"/>
-                <w:sz w:val="18"/>
+                <w:sz w:val="21"/>
+                <w:szCs w:val="21"/>
               </w:rPr>
               <w:t>0.168203±0.000583</w:t>
             </w:r>
@@ -10222,36 +11187,46 @@
             </w:pPr>
             <w:r>
               <w:rPr>
+                <w:rFonts w:eastAsia="宋体"/>
                 <w:color w:val="000000"/>
-                <w:sz w:val="18"/>
+                <w:sz w:val="21"/>
+                <w:szCs w:val="21"/>
               </w:rPr>
               <w:t>频域门控</w:t>
             </w:r>
             <w:r>
               <w:rPr>
+                <w:rFonts w:eastAsia="宋体"/>
                 <w:color w:val="000000"/>
-                <w:sz w:val="18"/>
+                <w:sz w:val="21"/>
+                <w:szCs w:val="21"/>
               </w:rPr>
               <w:t>+</w:t>
             </w:r>
             <w:r>
               <w:rPr>
+                <w:rFonts w:eastAsia="宋体"/>
                 <w:color w:val="000000"/>
-                <w:sz w:val="18"/>
+                <w:sz w:val="21"/>
+                <w:szCs w:val="21"/>
               </w:rPr>
               <w:t>自适应多尺度（</w:t>
             </w:r>
             <w:r>
               <w:rPr>
+                <w:rFonts w:eastAsia="宋体"/>
                 <w:color w:val="000000"/>
-                <w:sz w:val="18"/>
+                <w:sz w:val="21"/>
+                <w:szCs w:val="21"/>
               </w:rPr>
               <w:t>r=0.50</w:t>
             </w:r>
             <w:r>
               <w:rPr>
+                <w:rFonts w:eastAsia="宋体"/>
                 <w:color w:val="000000"/>
-                <w:sz w:val="18"/>
+                <w:sz w:val="21"/>
+                <w:szCs w:val="21"/>
               </w:rPr>
               <w:t>）</w:t>
             </w:r>
@@ -10282,8 +11257,10 @@
             </w:pPr>
             <w:r>
               <w:rPr>
+                <w:rFonts w:eastAsia="宋体"/>
                 <w:color w:val="000000"/>
-                <w:sz w:val="18"/>
+                <w:sz w:val="21"/>
+                <w:szCs w:val="21"/>
               </w:rPr>
               <w:t>8381</w:t>
             </w:r>
@@ -10314,8 +11291,10 @@
             </w:pPr>
             <w:r>
               <w:rPr>
+                <w:rFonts w:eastAsia="宋体"/>
                 <w:color w:val="000000"/>
-                <w:sz w:val="18"/>
+                <w:sz w:val="21"/>
+                <w:szCs w:val="21"/>
               </w:rPr>
               <w:t>0.192432±0.005766</w:t>
             </w:r>
@@ -10346,8 +11325,10 @@
             </w:pPr>
             <w:r>
               <w:rPr>
+                <w:rFonts w:eastAsia="宋体"/>
                 <w:color w:val="000000"/>
-                <w:sz w:val="18"/>
+                <w:sz w:val="21"/>
+                <w:szCs w:val="21"/>
               </w:rPr>
               <w:t>0.173438±0.000813</w:t>
             </w:r>
@@ -10454,7 +11435,10 @@
     <w:p>
       <w:r>
         <w:rPr>
-          <w:color w:val="000000"/>
+          <w:rFonts w:eastAsia="宋体"/>
+          <w:color w:val="000000"/>
+          <w:sz w:val="21"/>
+          <w:szCs w:val="21"/>
         </w:rPr>
         <w:t>频域相关配置未表现出与自适应多尺度相同的增益。FITS和DLinear+频域门控的MSE分别比DLinear高4.25%和1.65%；在自适应多尺度模型上加入r=0.50的频域门控后，MSE由0.186099升至0.192432，虽仍低于DLinear，但没有超过无频域自适应多尺度模型。由此可见，当前基础实验中的主要性能改善来自多尺度专家与自适应融合，而非低频门控。频域门控的作用将在后续频率保留比例敏感性实验中进一步分析。</w:t>
       </w:r>
@@ -10666,7 +11650,10 @@
     <w:p>
       <w:r>
         <w:rPr>
-          <w:color w:val="000000"/>
+          <w:rFonts w:eastAsia="宋体"/>
+          <w:color w:val="000000"/>
+          <w:sz w:val="21"/>
+          <w:szCs w:val="21"/>
         </w:rPr>
         <w:t>为判断预测性能提升是来自多尺度结构本身还是样本级动态加权，表2在尺度集合、专家结构和训练设置保持一致的条件下，仅改变尺度权重的生成方式。无频域条件下，自适应权重模型的MSE由0.193750降至0.186099，下降3.95%；MAE由0.189802降至0.168203，下降11.38%。相同随机种子的MSE平均配对差为0.007651，95% CI为[0.005238, 0.010064]，t(2)=13.642，Holm校正后p=0.01066，Cohen's d_z=7.876。三个随机种子的误差变化方向一致，说明在当前主模型设置下，自适应尺度权重比固定等权融合更有利于降低预测误差；受独立重复数限制，效应量和置信区间仍需谨慎解释。同种子配对变化见图3。</w:t>
       </w:r>
@@ -10921,9 +11908,11 @@
             </w:pPr>
             <w:r>
               <w:rPr>
+                <w:rFonts w:eastAsia="宋体"/>
                 <w:b/>
                 <w:color w:val="000000"/>
-                <w:sz w:val="18"/>
+                <w:sz w:val="21"/>
+                <w:szCs w:val="21"/>
               </w:rPr>
               <w:t>频域设置</w:t>
             </w:r>
@@ -10955,9 +11944,11 @@
             </w:pPr>
             <w:r>
               <w:rPr>
+                <w:rFonts w:eastAsia="宋体"/>
                 <w:b/>
                 <w:color w:val="000000"/>
-                <w:sz w:val="18"/>
+                <w:sz w:val="21"/>
+                <w:szCs w:val="21"/>
               </w:rPr>
               <w:t>权重方式</w:t>
             </w:r>
@@ -10989,9 +11980,11 @@
             </w:pPr>
             <w:r>
               <w:rPr>
+                <w:rFonts w:eastAsia="宋体"/>
                 <w:b/>
                 <w:color w:val="000000"/>
-                <w:sz w:val="18"/>
+                <w:sz w:val="21"/>
+                <w:szCs w:val="21"/>
               </w:rPr>
               <w:t>MSE</w:t>
             </w:r>
@@ -11023,9 +12016,11 @@
             </w:pPr>
             <w:r>
               <w:rPr>
+                <w:rFonts w:eastAsia="宋体"/>
                 <w:b/>
                 <w:color w:val="000000"/>
-                <w:sz w:val="18"/>
+                <w:sz w:val="21"/>
+                <w:szCs w:val="21"/>
               </w:rPr>
               <w:t>MAE</w:t>
             </w:r>
@@ -11063,8 +12058,10 @@
             </w:pPr>
             <w:r>
               <w:rPr>
+                <w:rFonts w:eastAsia="宋体"/>
                 <w:color w:val="000000"/>
-                <w:sz w:val="18"/>
+                <w:sz w:val="21"/>
+                <w:szCs w:val="21"/>
               </w:rPr>
               <w:t>无频域</w:t>
             </w:r>
@@ -11096,8 +12093,10 @@
             </w:pPr>
             <w:r>
               <w:rPr>
+                <w:rFonts w:eastAsia="宋体"/>
                 <w:color w:val="000000"/>
-                <w:sz w:val="18"/>
+                <w:sz w:val="21"/>
+                <w:szCs w:val="21"/>
               </w:rPr>
               <w:t>固定等权</w:t>
             </w:r>
@@ -11129,8 +12128,10 @@
             </w:pPr>
             <w:r>
               <w:rPr>
+                <w:rFonts w:eastAsia="宋体"/>
                 <w:color w:val="000000"/>
-                <w:sz w:val="18"/>
+                <w:sz w:val="21"/>
+                <w:szCs w:val="21"/>
               </w:rPr>
               <w:t>0.193750±0.001103</w:t>
             </w:r>
@@ -11162,8 +12163,10 @@
             </w:pPr>
             <w:r>
               <w:rPr>
+                <w:rFonts w:eastAsia="宋体"/>
                 <w:color w:val="000000"/>
-                <w:sz w:val="18"/>
+                <w:sz w:val="21"/>
+                <w:szCs w:val="21"/>
               </w:rPr>
               <w:t>0.189802±0.005236</w:t>
             </w:r>
@@ -11201,8 +12204,10 @@
             </w:pPr>
             <w:r>
               <w:rPr>
+                <w:rFonts w:eastAsia="宋体"/>
                 <w:color w:val="000000"/>
-                <w:sz w:val="18"/>
+                <w:sz w:val="21"/>
+                <w:szCs w:val="21"/>
               </w:rPr>
               <w:t>无频域</w:t>
             </w:r>
@@ -11234,8 +12239,10 @@
             </w:pPr>
             <w:r>
               <w:rPr>
+                <w:rFonts w:eastAsia="宋体"/>
                 <w:color w:val="000000"/>
-                <w:sz w:val="18"/>
+                <w:sz w:val="21"/>
+                <w:szCs w:val="21"/>
               </w:rPr>
               <w:t>自适应</w:t>
             </w:r>
@@ -11267,8 +12274,10 @@
             </w:pPr>
             <w:r>
               <w:rPr>
+                <w:rFonts w:eastAsia="宋体"/>
                 <w:color w:val="000000"/>
-                <w:sz w:val="18"/>
+                <w:sz w:val="21"/>
+                <w:szCs w:val="21"/>
               </w:rPr>
               <w:t>0.186099±0.001996</w:t>
             </w:r>
@@ -11300,8 +12309,10 @@
             </w:pPr>
             <w:r>
               <w:rPr>
+                <w:rFonts w:eastAsia="宋体"/>
                 <w:color w:val="000000"/>
-                <w:sz w:val="18"/>
+                <w:sz w:val="21"/>
+                <w:szCs w:val="21"/>
               </w:rPr>
               <w:t>0.168203±0.000583</w:t>
             </w:r>
@@ -11339,8 +12350,10 @@
             </w:pPr>
             <w:r>
               <w:rPr>
+                <w:rFonts w:eastAsia="宋体"/>
                 <w:color w:val="000000"/>
-                <w:sz w:val="18"/>
+                <w:sz w:val="21"/>
+                <w:szCs w:val="21"/>
               </w:rPr>
               <w:t>r=0.50</w:t>
             </w:r>
@@ -11372,8 +12385,10 @@
             </w:pPr>
             <w:r>
               <w:rPr>
+                <w:rFonts w:eastAsia="宋体"/>
                 <w:color w:val="000000"/>
-                <w:sz w:val="18"/>
+                <w:sz w:val="21"/>
+                <w:szCs w:val="21"/>
               </w:rPr>
               <w:t>固定等权</w:t>
             </w:r>
@@ -11405,8 +12420,10 @@
             </w:pPr>
             <w:r>
               <w:rPr>
+                <w:rFonts w:eastAsia="宋体"/>
                 <w:color w:val="000000"/>
-                <w:sz w:val="18"/>
+                <w:sz w:val="21"/>
+                <w:szCs w:val="21"/>
               </w:rPr>
               <w:t>0.200384±0.002176</w:t>
             </w:r>
@@ -11438,8 +12455,10 @@
             </w:pPr>
             <w:r>
               <w:rPr>
+                <w:rFonts w:eastAsia="宋体"/>
                 <w:color w:val="000000"/>
-                <w:sz w:val="18"/>
+                <w:sz w:val="21"/>
+                <w:szCs w:val="21"/>
               </w:rPr>
               <w:t>0.195155±0.005022</w:t>
             </w:r>
@@ -11477,8 +12496,10 @@
             </w:pPr>
             <w:r>
               <w:rPr>
+                <w:rFonts w:eastAsia="宋体"/>
                 <w:color w:val="000000"/>
-                <w:sz w:val="18"/>
+                <w:sz w:val="21"/>
+                <w:szCs w:val="21"/>
               </w:rPr>
               <w:t>r=0.50</w:t>
             </w:r>
@@ -11510,8 +12531,10 @@
             </w:pPr>
             <w:r>
               <w:rPr>
+                <w:rFonts w:eastAsia="宋体"/>
                 <w:color w:val="000000"/>
-                <w:sz w:val="18"/>
+                <w:sz w:val="21"/>
+                <w:szCs w:val="21"/>
               </w:rPr>
               <w:t>自适应</w:t>
             </w:r>
@@ -11543,8 +12566,10 @@
             </w:pPr>
             <w:r>
               <w:rPr>
+                <w:rFonts w:eastAsia="宋体"/>
                 <w:color w:val="000000"/>
-                <w:sz w:val="18"/>
+                <w:sz w:val="21"/>
+                <w:szCs w:val="21"/>
               </w:rPr>
               <w:t>0.192432±0.005766</w:t>
             </w:r>
@@ -11576,8 +12601,10 @@
             </w:pPr>
             <w:r>
               <w:rPr>
+                <w:rFonts w:eastAsia="宋体"/>
                 <w:color w:val="000000"/>
-                <w:sz w:val="18"/>
+                <w:sz w:val="21"/>
+                <w:szCs w:val="21"/>
               </w:rPr>
               <w:t>0.173438±0.000813</w:t>
             </w:r>
@@ -11615,8 +12642,10 @@
             </w:pPr>
             <w:r>
               <w:rPr>
+                <w:rFonts w:eastAsia="宋体"/>
                 <w:color w:val="000000"/>
-                <w:sz w:val="18"/>
+                <w:sz w:val="21"/>
+                <w:szCs w:val="21"/>
               </w:rPr>
               <w:t>r=0.75</w:t>
             </w:r>
@@ -11648,8 +12677,10 @@
             </w:pPr>
             <w:r>
               <w:rPr>
+                <w:rFonts w:eastAsia="宋体"/>
                 <w:color w:val="000000"/>
-                <w:sz w:val="18"/>
+                <w:sz w:val="21"/>
+                <w:szCs w:val="21"/>
               </w:rPr>
               <w:t>固定等权</w:t>
             </w:r>
@@ -11681,8 +12712,10 @@
             </w:pPr>
             <w:r>
               <w:rPr>
+                <w:rFonts w:eastAsia="宋体"/>
                 <w:color w:val="000000"/>
-                <w:sz w:val="18"/>
+                <w:sz w:val="21"/>
+                <w:szCs w:val="21"/>
               </w:rPr>
               <w:t>0.196809±0.001457</w:t>
             </w:r>
@@ -11714,8 +12747,10 @@
             </w:pPr>
             <w:r>
               <w:rPr>
+                <w:rFonts w:eastAsia="宋体"/>
                 <w:color w:val="000000"/>
-                <w:sz w:val="18"/>
+                <w:sz w:val="21"/>
+                <w:szCs w:val="21"/>
               </w:rPr>
               <w:t>0.192722±0.005338</w:t>
             </w:r>
@@ -11752,8 +12787,10 @@
             </w:pPr>
             <w:r>
               <w:rPr>
+                <w:rFonts w:eastAsia="宋体"/>
                 <w:color w:val="000000"/>
-                <w:sz w:val="18"/>
+                <w:sz w:val="21"/>
+                <w:szCs w:val="21"/>
               </w:rPr>
               <w:t>r=0.75</w:t>
             </w:r>
@@ -11784,8 +12821,10 @@
             </w:pPr>
             <w:r>
               <w:rPr>
+                <w:rFonts w:eastAsia="宋体"/>
                 <w:color w:val="000000"/>
-                <w:sz w:val="18"/>
+                <w:sz w:val="21"/>
+                <w:szCs w:val="21"/>
               </w:rPr>
               <w:t>自适应</w:t>
             </w:r>
@@ -11816,8 +12855,10 @@
             </w:pPr>
             <w:r>
               <w:rPr>
+                <w:rFonts w:eastAsia="宋体"/>
                 <w:color w:val="000000"/>
-                <w:sz w:val="18"/>
+                <w:sz w:val="21"/>
+                <w:szCs w:val="21"/>
               </w:rPr>
               <w:t>0.189447±0.005119</w:t>
             </w:r>
@@ -11848,8 +12889,10 @@
             </w:pPr>
             <w:r>
               <w:rPr>
+                <w:rFonts w:eastAsia="宋体"/>
                 <w:color w:val="000000"/>
-                <w:sz w:val="18"/>
+                <w:sz w:val="21"/>
+                <w:szCs w:val="21"/>
               </w:rPr>
               <w:t>0.170543±0.000729</w:t>
             </w:r>
@@ -11956,7 +12999,10 @@
     <w:p>
       <w:r>
         <w:rPr>
-          <w:color w:val="000000"/>
+          <w:rFonts w:eastAsia="宋体"/>
+          <w:color w:val="000000"/>
+          <w:sz w:val="21"/>
+          <w:szCs w:val="21"/>
         </w:rPr>
         <w:t>加入频域门控后，自适应权重仍表现出较低的平均误差。r=0.50时，自适应权重相对固定等权的MSE降低3.97%，但配对差95% CI为[-0.001193, 0.017096]，Holm校正后p=0.06460；在探索性r=0.75设置下，MSE和MAE分别降低3.74%和11.51%，配对差95% CI为[-0.001770, 0.016493]，t(2)=3.469，p=0.07401，Cohen's d_z=2.003。由于两组频域设置下的置信区间均跨越0，因此只能将其视为与无频域结果方向一致的改善趋势，而不能作为显著性结论。路由权重在不同测试窗口中的变化及总体分布见图4。</w:t>
       </w:r>
@@ -12511,9 +13557,11 @@
             </w:pPr>
             <w:r>
               <w:rPr>
+                <w:rFonts w:eastAsia="宋体"/>
                 <w:b/>
                 <w:color w:val="000000"/>
-                <w:sz w:val="18"/>
+                <w:sz w:val="21"/>
+                <w:szCs w:val="21"/>
               </w:rPr>
               <w:t>模型</w:t>
             </w:r>
@@ -12545,9 +13593,11 @@
             </w:pPr>
             <w:r>
               <w:rPr>
+                <w:rFonts w:eastAsia="宋体"/>
                 <w:b/>
                 <w:color w:val="000000"/>
-                <w:sz w:val="18"/>
+                <w:sz w:val="21"/>
+                <w:szCs w:val="21"/>
               </w:rPr>
               <w:t>r</w:t>
             </w:r>
@@ -12579,9 +13629,11 @@
             </w:pPr>
             <w:r>
               <w:rPr>
+                <w:rFonts w:eastAsia="宋体"/>
                 <w:b/>
                 <w:color w:val="000000"/>
-                <w:sz w:val="18"/>
+                <w:sz w:val="21"/>
+                <w:szCs w:val="21"/>
               </w:rPr>
               <w:t>MSE</w:t>
             </w:r>
@@ -12613,9 +13665,11 @@
             </w:pPr>
             <w:r>
               <w:rPr>
+                <w:rFonts w:eastAsia="宋体"/>
                 <w:b/>
                 <w:color w:val="000000"/>
-                <w:sz w:val="18"/>
+                <w:sz w:val="21"/>
+                <w:szCs w:val="21"/>
               </w:rPr>
               <w:t>MAE</w:t>
             </w:r>
@@ -12653,15 +13707,19 @@
             </w:pPr>
             <w:r>
               <w:rPr>
+                <w:rFonts w:eastAsia="宋体"/>
                 <w:color w:val="000000"/>
-                <w:sz w:val="18"/>
+                <w:sz w:val="21"/>
+                <w:szCs w:val="21"/>
               </w:rPr>
               <w:t>DLinear+</w:t>
             </w:r>
             <w:r>
               <w:rPr>
+                <w:rFonts w:eastAsia="宋体"/>
                 <w:color w:val="000000"/>
-                <w:sz w:val="18"/>
+                <w:sz w:val="21"/>
+                <w:szCs w:val="21"/>
               </w:rPr>
               <w:t>频域门控</w:t>
             </w:r>
@@ -12693,8 +13751,10 @@
             </w:pPr>
             <w:r>
               <w:rPr>
+                <w:rFonts w:eastAsia="宋体"/>
                 <w:color w:val="000000"/>
-                <w:sz w:val="18"/>
+                <w:sz w:val="21"/>
+                <w:szCs w:val="21"/>
               </w:rPr>
               <w:t>0.25</w:t>
             </w:r>
@@ -12726,8 +13786,10 @@
             </w:pPr>
             <w:r>
               <w:rPr>
+                <w:rFonts w:eastAsia="宋体"/>
                 <w:color w:val="000000"/>
-                <w:sz w:val="18"/>
+                <w:sz w:val="21"/>
+                <w:szCs w:val="21"/>
               </w:rPr>
               <w:t>0.200367±0.002349</w:t>
             </w:r>
@@ -12759,8 +13821,10 @@
             </w:pPr>
             <w:r>
               <w:rPr>
+                <w:rFonts w:eastAsia="宋体"/>
                 <w:color w:val="000000"/>
-                <w:sz w:val="18"/>
+                <w:sz w:val="21"/>
+                <w:szCs w:val="21"/>
               </w:rPr>
               <w:t>0.193320±0.005065</w:t>
             </w:r>
@@ -12798,15 +13862,19 @@
             </w:pPr>
             <w:r>
               <w:rPr>
+                <w:rFonts w:eastAsia="宋体"/>
                 <w:color w:val="000000"/>
-                <w:sz w:val="18"/>
+                <w:sz w:val="21"/>
+                <w:szCs w:val="21"/>
               </w:rPr>
               <w:t>DLinear+</w:t>
             </w:r>
             <w:r>
               <w:rPr>
+                <w:rFonts w:eastAsia="宋体"/>
                 <w:color w:val="000000"/>
-                <w:sz w:val="18"/>
+                <w:sz w:val="21"/>
+                <w:szCs w:val="21"/>
               </w:rPr>
               <w:t>频域门控</w:t>
             </w:r>
@@ -12838,8 +13906,10 @@
             </w:pPr>
             <w:r>
               <w:rPr>
+                <w:rFonts w:eastAsia="宋体"/>
                 <w:color w:val="000000"/>
-                <w:sz w:val="18"/>
+                <w:sz w:val="21"/>
+                <w:szCs w:val="21"/>
               </w:rPr>
               <w:t>0.50</w:t>
             </w:r>
@@ -12871,8 +13941,10 @@
             </w:pPr>
             <w:r>
               <w:rPr>
+                <w:rFonts w:eastAsia="宋体"/>
                 <w:color w:val="000000"/>
-                <w:sz w:val="18"/>
+                <w:sz w:val="21"/>
+                <w:szCs w:val="21"/>
               </w:rPr>
               <w:t>0.197181±0.000655</w:t>
             </w:r>
@@ -12904,8 +13976,10 @@
             </w:pPr>
             <w:r>
               <w:rPr>
+                <w:rFonts w:eastAsia="宋体"/>
                 <w:color w:val="000000"/>
-                <w:sz w:val="18"/>
+                <w:sz w:val="21"/>
+                <w:szCs w:val="21"/>
               </w:rPr>
               <w:t>0.191756±0.007712</w:t>
             </w:r>
@@ -12943,15 +14017,19 @@
             </w:pPr>
             <w:r>
               <w:rPr>
+                <w:rFonts w:eastAsia="宋体"/>
                 <w:color w:val="000000"/>
-                <w:sz w:val="18"/>
+                <w:sz w:val="21"/>
+                <w:szCs w:val="21"/>
               </w:rPr>
               <w:t>DLinear+</w:t>
             </w:r>
             <w:r>
               <w:rPr>
+                <w:rFonts w:eastAsia="宋体"/>
                 <w:color w:val="000000"/>
-                <w:sz w:val="18"/>
+                <w:sz w:val="21"/>
+                <w:szCs w:val="21"/>
               </w:rPr>
               <w:t>频域门控</w:t>
             </w:r>
@@ -12983,8 +14061,10 @@
             </w:pPr>
             <w:r>
               <w:rPr>
+                <w:rFonts w:eastAsia="宋体"/>
                 <w:color w:val="000000"/>
-                <w:sz w:val="18"/>
+                <w:sz w:val="21"/>
+                <w:szCs w:val="21"/>
               </w:rPr>
               <w:t>0.75</w:t>
             </w:r>
@@ -13016,8 +14096,10 @@
             </w:pPr>
             <w:r>
               <w:rPr>
+                <w:rFonts w:eastAsia="宋体"/>
                 <w:color w:val="000000"/>
-                <w:sz w:val="18"/>
+                <w:sz w:val="21"/>
+                <w:szCs w:val="21"/>
               </w:rPr>
               <w:t>0.195478±0.001138</w:t>
             </w:r>
@@ -13049,8 +14131,10 @@
             </w:pPr>
             <w:r>
               <w:rPr>
+                <w:rFonts w:eastAsia="宋体"/>
                 <w:color w:val="000000"/>
-                <w:sz w:val="18"/>
+                <w:sz w:val="21"/>
+                <w:szCs w:val="21"/>
               </w:rPr>
               <w:t>0.190041±0.008711</w:t>
             </w:r>
@@ -13088,22 +14172,28 @@
             </w:pPr>
             <w:r>
               <w:rPr>
+                <w:rFonts w:eastAsia="宋体"/>
                 <w:color w:val="000000"/>
-                <w:sz w:val="18"/>
+                <w:sz w:val="21"/>
+                <w:szCs w:val="21"/>
               </w:rPr>
               <w:t>频域门控</w:t>
             </w:r>
             <w:r>
               <w:rPr>
+                <w:rFonts w:eastAsia="宋体"/>
                 <w:color w:val="000000"/>
-                <w:sz w:val="18"/>
+                <w:sz w:val="21"/>
+                <w:szCs w:val="21"/>
               </w:rPr>
               <w:t>+</w:t>
             </w:r>
             <w:r>
               <w:rPr>
+                <w:rFonts w:eastAsia="宋体"/>
                 <w:color w:val="000000"/>
-                <w:sz w:val="18"/>
+                <w:sz w:val="21"/>
+                <w:szCs w:val="21"/>
               </w:rPr>
               <w:t>自适应多尺度</w:t>
             </w:r>
@@ -13135,8 +14225,10 @@
             </w:pPr>
             <w:r>
               <w:rPr>
+                <w:rFonts w:eastAsia="宋体"/>
                 <w:color w:val="000000"/>
-                <w:sz w:val="18"/>
+                <w:sz w:val="21"/>
+                <w:szCs w:val="21"/>
               </w:rPr>
               <w:t>0.25</w:t>
             </w:r>
@@ -13168,8 +14260,10 @@
             </w:pPr>
             <w:r>
               <w:rPr>
+                <w:rFonts w:eastAsia="宋体"/>
                 <w:color w:val="000000"/>
-                <w:sz w:val="18"/>
+                <w:sz w:val="21"/>
+                <w:szCs w:val="21"/>
               </w:rPr>
               <w:t>0.201774±0.006798</w:t>
             </w:r>
@@ -13201,8 +14295,10 @@
             </w:pPr>
             <w:r>
               <w:rPr>
+                <w:rFonts w:eastAsia="宋体"/>
                 <w:color w:val="000000"/>
-                <w:sz w:val="18"/>
+                <w:sz w:val="21"/>
+                <w:szCs w:val="21"/>
               </w:rPr>
               <w:t>0.182381±0.002075</w:t>
             </w:r>
@@ -13240,22 +14336,28 @@
             </w:pPr>
             <w:r>
               <w:rPr>
+                <w:rFonts w:eastAsia="宋体"/>
                 <w:color w:val="000000"/>
-                <w:sz w:val="18"/>
+                <w:sz w:val="21"/>
+                <w:szCs w:val="21"/>
               </w:rPr>
               <w:t>频域门控</w:t>
             </w:r>
             <w:r>
               <w:rPr>
+                <w:rFonts w:eastAsia="宋体"/>
                 <w:color w:val="000000"/>
-                <w:sz w:val="18"/>
+                <w:sz w:val="21"/>
+                <w:szCs w:val="21"/>
               </w:rPr>
               <w:t>+</w:t>
             </w:r>
             <w:r>
               <w:rPr>
+                <w:rFonts w:eastAsia="宋体"/>
                 <w:color w:val="000000"/>
-                <w:sz w:val="18"/>
+                <w:sz w:val="21"/>
+                <w:szCs w:val="21"/>
               </w:rPr>
               <w:t>自适应多尺度</w:t>
             </w:r>
@@ -13287,8 +14389,10 @@
             </w:pPr>
             <w:r>
               <w:rPr>
+                <w:rFonts w:eastAsia="宋体"/>
                 <w:color w:val="000000"/>
-                <w:sz w:val="18"/>
+                <w:sz w:val="21"/>
+                <w:szCs w:val="21"/>
               </w:rPr>
               <w:t>0.50</w:t>
             </w:r>
@@ -13320,8 +14424,10 @@
             </w:pPr>
             <w:r>
               <w:rPr>
+                <w:rFonts w:eastAsia="宋体"/>
                 <w:color w:val="000000"/>
-                <w:sz w:val="18"/>
+                <w:sz w:val="21"/>
+                <w:szCs w:val="21"/>
               </w:rPr>
               <w:t>0.192432±0.005766</w:t>
             </w:r>
@@ -13353,8 +14459,10 @@
             </w:pPr>
             <w:r>
               <w:rPr>
+                <w:rFonts w:eastAsia="宋体"/>
                 <w:color w:val="000000"/>
-                <w:sz w:val="18"/>
+                <w:sz w:val="21"/>
+                <w:szCs w:val="21"/>
               </w:rPr>
               <w:t>0.173438±0.000813</w:t>
             </w:r>
@@ -13391,22 +14499,28 @@
             </w:pPr>
             <w:r>
               <w:rPr>
+                <w:rFonts w:eastAsia="宋体"/>
                 <w:color w:val="000000"/>
-                <w:sz w:val="18"/>
+                <w:sz w:val="21"/>
+                <w:szCs w:val="21"/>
               </w:rPr>
               <w:t>频域门控</w:t>
             </w:r>
             <w:r>
               <w:rPr>
+                <w:rFonts w:eastAsia="宋体"/>
                 <w:color w:val="000000"/>
-                <w:sz w:val="18"/>
+                <w:sz w:val="21"/>
+                <w:szCs w:val="21"/>
               </w:rPr>
               <w:t>+</w:t>
             </w:r>
             <w:r>
               <w:rPr>
+                <w:rFonts w:eastAsia="宋体"/>
                 <w:color w:val="000000"/>
-                <w:sz w:val="18"/>
+                <w:sz w:val="21"/>
+                <w:szCs w:val="21"/>
               </w:rPr>
               <w:t>自适应多尺度</w:t>
             </w:r>
@@ -13437,8 +14551,10 @@
             </w:pPr>
             <w:r>
               <w:rPr>
+                <w:rFonts w:eastAsia="宋体"/>
                 <w:color w:val="000000"/>
-                <w:sz w:val="18"/>
+                <w:sz w:val="21"/>
+                <w:szCs w:val="21"/>
               </w:rPr>
               <w:t>0.75</w:t>
             </w:r>
@@ -13469,8 +14585,10 @@
             </w:pPr>
             <w:r>
               <w:rPr>
+                <w:rFonts w:eastAsia="宋体"/>
                 <w:color w:val="000000"/>
-                <w:sz w:val="18"/>
+                <w:sz w:val="21"/>
+                <w:szCs w:val="21"/>
               </w:rPr>
               <w:t>0.189447±0.005119</w:t>
             </w:r>
@@ -13501,8 +14619,10 @@
             </w:pPr>
             <w:r>
               <w:rPr>
+                <w:rFonts w:eastAsia="宋体"/>
                 <w:color w:val="000000"/>
-                <w:sz w:val="18"/>
+                <w:sz w:val="21"/>
+                <w:szCs w:val="21"/>
               </w:rPr>
               <w:t>0.170543±0.000729</w:t>
             </w:r>
@@ -13610,7 +14730,10 @@
     <w:p>
       <w:r>
         <w:rPr>
-          <w:color w:val="000000"/>
+          <w:rFonts w:eastAsia="宋体"/>
+          <w:color w:val="000000"/>
+          <w:sz w:val="21"/>
+          <w:szCs w:val="21"/>
         </w:rPr>
         <w:t>在三个候选比例中，r=0.75时完整模型取得最低MSE 0.189447。相较DLinear，其MSE和MAE分别降低2.34%和9.28%；但相较无频域自适应多尺度主模型，MSE和MAE仍分别高1.80%和1.39%。因此，r=0.75只能视为当前三个测试比例中的探索性较优设置，不能据此认定为最优频率保留比例。结合表3和图5可见，增加频率保留比例能够缓解低频截断造成的信息损失，但频域门控仍未带来超过无频域主模型的额外收益，其作用更适合作为频率截断边界的辅助分析。</w:t>
       </w:r>
@@ -13810,7 +14933,10 @@
     <w:p>
       <w:r>
         <w:rPr>
-          <w:color w:val="000000"/>
+          <w:rFonts w:eastAsia="宋体"/>
+          <w:color w:val="000000"/>
+          <w:sz w:val="21"/>
+          <w:szCs w:val="21"/>
         </w:rPr>
         <w:t>为直观展示模型在具体OD流量窗口上的预测结果，选取测试集中的代表性样本进行可视化，如图6所示。该图主要用于观察预测序列与真实变化趋势的对应关系，不作为独立于表1—表3之外的额外性能证据。从应用角度看，未来24 h的OD流量预测可作为容量规划、拥塞预警和资源编排的辅助输入，为链路容量调整、路由配置及带宽资源分配提供参考。需要指出的是，本文实验仅基于Abilene数据集、固定输入长度L=96和预测长度H=24开展，并以3个随机种子进行重复验证；模型也未显式引入OD节点之间的网络拓扑关系。因此，当前结果主要说明所提出方法在该数据集和预测设置下的有效性，其在其他网络规模、不同预测长度及拓扑条件下的泛化能力仍需进一步验证。</w:t>
       </w:r>
@@ -13999,7 +15125,10 @@
     <w:p>
       <w:r>
         <w:rPr>
-          <w:color w:val="000000"/>
+          <w:rFonts w:eastAsia="宋体"/>
+          <w:color w:val="000000"/>
+          <w:sz w:val="21"/>
+          <w:szCs w:val="21"/>
         </w:rPr>
         <w:t>本文提出一种基于自适应多尺度加权的多变量网络流量预测方法，通过不同时间分辨率的DLinear尺度专家与轻量统计路由网络实现样本级动态融合。Abilene数据集上的实验结果表明，无频域自适应多尺度模型相较单尺度DLinear的MSE和MAE分别降低4.06%和10.52%，说明多尺度信息与自适应融合能够有效改善当前任务下的预测精度。固定等权消融进一步表明，自适应尺度权重使MSE降低3.95%；同时，加入频域门控后的模型未超过无频域主模型，说明当前主要性能增益来自动态多尺度融合，而频域门控更适合作为频率截断边界的辅助分析。本文实验仅在Abilene数据集、固定输入输出长度和有限随机重复下开展，且未显式建模OD拓扑关系，后续将结合其他公开网络流量数据集、不同预测长度及网络拓扑条件进一步验证模型的泛化能力与适用范围。</w:t>
       </w:r>

</xml_diff>

<commit_message>
align introduction and heading format with journal
</commit_message>
<xml_diff>
--- a/word_output/2026.09.18v.docx
+++ b/word_output/2026.09.18v.docx
@@ -921,97 +921,97 @@
           <w:sz w:val="21"/>
           <w:szCs w:val="21"/>
         </w:rPr>
-        <w:t>上述研究表明，多尺度信息和频率特征均有助于描述时间序列的复杂变化，但现有多尺度方法多采用固定的尺度组合或较复杂的混合、注意力结构，不同时间尺度在不同流量状态下的重要程度仍缺少简单有效的动态调节机制。同时，网络流量中的突发变化可能分布于中高频成分，过度保留低频信息也可能造成有效预测信息损失。针对上述问题，本文提出一种基于样本级自适应多尺度加权的轻量网络流量预测方法。首先，对输入序列进行尺度</w:t>
-      </w:r>
-      <w:r>
-        <w:rPr>
-          <w:rFonts w:eastAsia="宋体"/>
-          <w:color w:val="000000"/>
-          <w:sz w:val="21"/>
-          <w:szCs w:val="21"/>
-        </w:rPr>
-        <w:t>1</w:t>
-      </w:r>
-      <w:r>
-        <w:rPr>
-          <w:rFonts w:eastAsia="宋体"/>
-          <w:color w:val="000000"/>
-          <w:sz w:val="21"/>
-          <w:szCs w:val="21"/>
-        </w:rPr>
-        <w:t>、</w:t>
-      </w:r>
-      <w:r>
-        <w:rPr>
-          <w:rFonts w:eastAsia="宋体"/>
-          <w:color w:val="000000"/>
-          <w:sz w:val="21"/>
-          <w:szCs w:val="21"/>
-        </w:rPr>
-        <w:t>2</w:t>
-      </w:r>
-      <w:r>
-        <w:rPr>
-          <w:rFonts w:eastAsia="宋体"/>
-          <w:color w:val="000000"/>
-          <w:sz w:val="21"/>
-          <w:szCs w:val="21"/>
-        </w:rPr>
-        <w:t>和</w:t>
-      </w:r>
-      <w:r>
-        <w:rPr>
-          <w:rFonts w:eastAsia="宋体"/>
-          <w:color w:val="000000"/>
-          <w:sz w:val="21"/>
-          <w:szCs w:val="21"/>
-        </w:rPr>
-        <w:t>4</w:t>
-      </w:r>
-      <w:r>
-        <w:rPr>
-          <w:rFonts w:eastAsia="宋体"/>
-          <w:color w:val="000000"/>
-          <w:sz w:val="21"/>
-          <w:szCs w:val="21"/>
-        </w:rPr>
-        <w:t>的非重叠平均池化，构造不同时间分辨率的序列，并分别采用独立</w:t>
-      </w:r>
-      <w:r>
-        <w:rPr>
-          <w:rFonts w:eastAsia="宋体"/>
-          <w:color w:val="000000"/>
-          <w:sz w:val="21"/>
-          <w:szCs w:val="21"/>
-        </w:rPr>
-        <w:t>DLinear</w:t>
-      </w:r>
-      <w:r>
-        <w:rPr>
-          <w:rFonts w:eastAsia="宋体"/>
-          <w:color w:val="000000"/>
-          <w:sz w:val="21"/>
-          <w:szCs w:val="21"/>
-        </w:rPr>
-        <w:t>模型进行预测；其次，根据输入窗口的均值、标准差、末时刻均值和平均绝对一阶差分生成样本级尺度权重，实现不同尺度预测结果的自适应融合；最后，引入低频门控作为辅助分析模块，考察不同频率保留比例对预测性能的影响。该方法不依赖显式网络拓扑和复杂注意力结构，重点分析不同时间分辨率信息及其自适应融合对骨干网络</w:t>
-      </w:r>
-      <w:r>
-        <w:rPr>
-          <w:rFonts w:eastAsia="宋体"/>
-          <w:color w:val="000000"/>
-          <w:sz w:val="21"/>
-          <w:szCs w:val="21"/>
-        </w:rPr>
-        <w:t>OD</w:t>
-      </w:r>
-      <w:r>
-        <w:rPr>
-          <w:rFonts w:eastAsia="宋体"/>
-          <w:color w:val="000000"/>
-          <w:sz w:val="21"/>
-          <w:szCs w:val="21"/>
-        </w:rPr>
-        <w:t>流量短期预测的作用。</w:t>
+        <w:t>上述研究表明，多尺度信息和频率特征均有助于描述时间序列的复杂变化，但现有多尺度方法多采用固定尺度组合或较复杂的混合、注意力结构，对不同流量状态下尺度重要性的动态调节仍较有限；同时，过强的低频截断可能造成突发变化等有效信息损失。针对这些问题，本研究构建基于分解线性尺度专家的样本级自适应多尺度预测框架，以不同时间分辨率专家形成互补预测，并由轻量路由器依据输入窗口状态动态分配尺度权重；频域门控仅作为辅助模块，用于分析频率保留边界。该框架不依赖显式网络拓扑和复杂注意力结构，重点验证动态尺度融合对骨干网络OD流量短期预测的作用。</w:t>
+      </w:r>
+      <w:r>
+        <w:rPr>
+          <w:rFonts w:eastAsia="宋体"/>
+          <w:color w:val="000000"/>
+          <w:sz w:val="21"/>
+          <w:szCs w:val="21"/>
+        </w:rPr>
+        <w:t/>
+      </w:r>
+      <w:r>
+        <w:rPr>
+          <w:rFonts w:eastAsia="宋体"/>
+          <w:color w:val="000000"/>
+          <w:sz w:val="21"/>
+          <w:szCs w:val="21"/>
+        </w:rPr>
+        <w:t/>
+      </w:r>
+      <w:r>
+        <w:rPr>
+          <w:rFonts w:eastAsia="宋体"/>
+          <w:color w:val="000000"/>
+          <w:sz w:val="21"/>
+          <w:szCs w:val="21"/>
+        </w:rPr>
+        <w:t/>
+      </w:r>
+      <w:r>
+        <w:rPr>
+          <w:rFonts w:eastAsia="宋体"/>
+          <w:color w:val="000000"/>
+          <w:sz w:val="21"/>
+          <w:szCs w:val="21"/>
+        </w:rPr>
+        <w:t/>
+      </w:r>
+      <w:r>
+        <w:rPr>
+          <w:rFonts w:eastAsia="宋体"/>
+          <w:color w:val="000000"/>
+          <w:sz w:val="21"/>
+          <w:szCs w:val="21"/>
+        </w:rPr>
+        <w:t/>
+      </w:r>
+      <w:r>
+        <w:rPr>
+          <w:rFonts w:eastAsia="宋体"/>
+          <w:color w:val="000000"/>
+          <w:sz w:val="21"/>
+          <w:szCs w:val="21"/>
+        </w:rPr>
+        <w:t/>
+      </w:r>
+      <w:r>
+        <w:rPr>
+          <w:rFonts w:eastAsia="宋体"/>
+          <w:color w:val="000000"/>
+          <w:sz w:val="21"/>
+          <w:szCs w:val="21"/>
+        </w:rPr>
+        <w:t/>
+      </w:r>
+      <w:r>
+        <w:rPr>
+          <w:rFonts w:eastAsia="宋体"/>
+          <w:color w:val="000000"/>
+          <w:sz w:val="21"/>
+          <w:szCs w:val="21"/>
+        </w:rPr>
+        <w:t/>
+      </w:r>
+      <w:r>
+        <w:rPr>
+          <w:rFonts w:eastAsia="宋体"/>
+          <w:color w:val="000000"/>
+          <w:sz w:val="21"/>
+          <w:szCs w:val="21"/>
+        </w:rPr>
+        <w:t/>
+      </w:r>
+      <w:r>
+        <w:rPr>
+          <w:rFonts w:eastAsia="宋体"/>
+          <w:color w:val="000000"/>
+          <w:sz w:val="21"/>
+          <w:szCs w:val="21"/>
+        </w:rPr>
+        <w:t/>
       </w:r>
     </w:p>
     <w:p/>
@@ -1198,7 +1198,8 @@
           <w:b/>
           <w:bCs/>
           <w:color w:val="000000"/>
-          <w:szCs w:val="32"/>
+          <w:szCs w:val="21"/>
+          <w:sz w:val="21"/>
         </w:rPr>
         <w:t xml:space="preserve">1.1 </w:t>
       </w:r>
@@ -1207,7 +1208,8 @@
           <w:rFonts w:eastAsia="黑体"/>
           <w:b/>
           <w:bCs/>
-          <w:szCs w:val="32"/>
+          <w:szCs w:val="21"/>
+          <w:sz w:val="21"/>
         </w:rPr>
         <w:t>问题定义与数据预处理</w:t>
       </w:r>
@@ -2505,7 +2507,8 @@
           <w:rFonts w:eastAsia="黑体"/>
           <w:b/>
           <w:bCs/>
-          <w:szCs w:val="32"/>
+          <w:szCs w:val="21"/>
+          <w:sz w:val="21"/>
         </w:rPr>
         <w:t xml:space="preserve">1.2 </w:t>
       </w:r>
@@ -2514,7 +2517,8 @@
           <w:rFonts w:eastAsia="黑体"/>
           <w:b/>
           <w:bCs/>
-          <w:szCs w:val="32"/>
+          <w:szCs w:val="21"/>
+          <w:sz w:val="21"/>
         </w:rPr>
         <w:t>多尺度序列构造</w:t>
       </w:r>
@@ -3056,7 +3060,8 @@
           <w:rFonts w:eastAsia="黑体"/>
           <w:b/>
           <w:bCs/>
-          <w:szCs w:val="32"/>
+          <w:szCs w:val="21"/>
+          <w:sz w:val="21"/>
         </w:rPr>
         <w:t>1.3 DLinear</w:t>
       </w:r>
@@ -3065,7 +3070,8 @@
           <w:rFonts w:eastAsia="黑体"/>
           <w:b/>
           <w:bCs/>
-          <w:szCs w:val="32"/>
+          <w:szCs w:val="21"/>
+          <w:sz w:val="21"/>
         </w:rPr>
         <w:t>尺度专家</w:t>
       </w:r>
@@ -4425,7 +4431,8 @@
           <w:rFonts w:eastAsia="黑体"/>
           <w:b/>
           <w:bCs/>
-          <w:szCs w:val="32"/>
+          <w:szCs w:val="21"/>
+          <w:sz w:val="21"/>
         </w:rPr>
         <w:lastRenderedPageBreak/>
         <w:t xml:space="preserve">1.4 </w:t>
@@ -4435,7 +4442,8 @@
           <w:rFonts w:eastAsia="黑体"/>
           <w:b/>
           <w:bCs/>
-          <w:szCs w:val="32"/>
+          <w:szCs w:val="21"/>
+          <w:sz w:val="21"/>
         </w:rPr>
         <w:t>样本级自适应尺度加权</w:t>
       </w:r>
@@ -6655,7 +6663,8 @@
           <w:rFonts w:eastAsia="黑体"/>
           <w:b/>
           <w:bCs/>
-          <w:szCs w:val="32"/>
+          <w:szCs w:val="21"/>
+          <w:sz w:val="21"/>
         </w:rPr>
         <w:t xml:space="preserve">1.5 </w:t>
       </w:r>
@@ -6664,7 +6673,8 @@
           <w:rFonts w:eastAsia="黑体"/>
           <w:b/>
           <w:bCs/>
-          <w:szCs w:val="32"/>
+          <w:szCs w:val="21"/>
+          <w:sz w:val="21"/>
         </w:rPr>
         <w:t>辅助频域门控</w:t>
       </w:r>
@@ -8499,7 +8509,8 @@
           <w:rFonts w:eastAsia="黑体"/>
           <w:b/>
           <w:bCs/>
-          <w:szCs w:val="32"/>
+          <w:szCs w:val="21"/>
+          <w:sz w:val="21"/>
         </w:rPr>
         <w:t xml:space="preserve">1.6 </w:t>
       </w:r>
@@ -8508,7 +8519,8 @@
           <w:rFonts w:eastAsia="黑体"/>
           <w:b/>
           <w:bCs/>
-          <w:szCs w:val="32"/>
+          <w:szCs w:val="21"/>
+          <w:sz w:val="21"/>
         </w:rPr>
         <w:t>训练目标与复杂度</w:t>
       </w:r>
@@ -9205,7 +9217,8 @@
           <w:b/>
           <w:bCs/>
           <w:color w:val="000000"/>
-          <w:szCs w:val="32"/>
+          <w:szCs w:val="21"/>
+          <w:sz w:val="21"/>
         </w:rPr>
         <w:t xml:space="preserve">2.1 数据集与实验设置</w:t>
       </w:r>
@@ -10247,7 +10260,8 @@
           <w:b/>
           <w:bCs/>
           <w:color w:val="000000"/>
-          <w:szCs w:val="32"/>
+          <w:szCs w:val="21"/>
+          <w:sz w:val="21"/>
         </w:rPr>
         <w:t xml:space="preserve">2.2 基础模型对比与组件分析</w:t>
       </w:r>
@@ -11632,7 +11646,8 @@
           <w:b/>
           <w:bCs/>
           <w:color w:val="000000"/>
-          <w:szCs w:val="32"/>
+          <w:szCs w:val="21"/>
+          <w:sz w:val="21"/>
         </w:rPr>
         <w:t xml:space="preserve">2.3 自适应尺度权重消融与路由分析</w:t>
       </w:r>
@@ -13378,7 +13393,8 @@
           <w:b/>
           <w:bCs/>
           <w:color w:val="000000"/>
-          <w:szCs w:val="32"/>
+          <w:szCs w:val="21"/>
+          <w:sz w:val="21"/>
         </w:rPr>
         <w:t xml:space="preserve">2.4 频率保留比例敏感性</w:t>
       </w:r>
@@ -14915,7 +14931,8 @@
           <w:b/>
           <w:bCs/>
           <w:color w:val="000000"/>
-          <w:szCs w:val="32"/>
+          <w:szCs w:val="21"/>
+          <w:sz w:val="21"/>
         </w:rPr>
         <w:t xml:space="preserve">2.5 代表性预测与适用范围</w:t>
       </w:r>

</xml_diff>

<commit_message>
apply journal requirement 11 first-page footer
</commit_message>
<xml_diff>
--- a/word_output/2026.09.18v.docx
+++ b/word_output/2026.09.18v.docx
@@ -15550,25 +15550,25 @@
       <w:rPr>
         <w:sz w:val="16"/>
       </w:rPr>
-      <w:t>收稿日期：</w:t>
+      <w:t>收稿日期：[请填写，格式YYYY-MM-DD]</w:t>
     </w:r>
     <w:r>
       <w:rPr>
         <w:sz w:val="16"/>
       </w:rPr>
-      <w:t>[</w:t>
+      <w:t/>
     </w:r>
     <w:r>
       <w:rPr>
         <w:sz w:val="16"/>
       </w:rPr>
-      <w:t>待填写</w:t>
+      <w:t/>
     </w:r>
     <w:r>
       <w:rPr>
         <w:sz w:val="16"/>
       </w:rPr>
-      <w:t>]</w:t>
+      <w:t/>
     </w:r>
   </w:p>
   <w:p>
@@ -15579,79 +15579,79 @@
       <w:rPr>
         <w:sz w:val="16"/>
       </w:rPr>
-      <w:t>基金项目：</w:t>
+      <w:t>基金项目：[基金来源]（[基金项目编号]）</w:t>
     </w:r>
     <w:r>
       <w:rPr>
         <w:sz w:val="16"/>
       </w:rPr>
-      <w:t>[</w:t>
+      <w:t/>
     </w:r>
     <w:r>
       <w:rPr>
         <w:sz w:val="16"/>
       </w:rPr>
-      <w:t>基金来源</w:t>
+      <w:t/>
     </w:r>
     <w:r>
       <w:rPr>
         <w:sz w:val="16"/>
       </w:rPr>
-      <w:t>]</w:t>
+      <w:t/>
     </w:r>
     <w:r>
       <w:rPr>
         <w:sz w:val="16"/>
       </w:rPr>
-      <w:t>（</w:t>
+      <w:t/>
     </w:r>
     <w:r>
       <w:rPr>
         <w:sz w:val="16"/>
       </w:rPr>
-      <w:t>[</w:t>
+      <w:t/>
     </w:r>
     <w:r>
       <w:rPr>
         <w:sz w:val="16"/>
       </w:rPr>
-      <w:t>基金项目编号</w:t>
+      <w:t/>
     </w:r>
     <w:r>
       <w:rPr>
         <w:sz w:val="16"/>
       </w:rPr>
-      <w:t>]</w:t>
+      <w:t/>
     </w:r>
     <w:r>
       <w:rPr>
         <w:sz w:val="16"/>
       </w:rPr>
-      <w:t>）；如无基金项目请填写</w:t>
+      <w:t/>
     </w:r>
     <w:r>
       <w:rPr>
         <w:sz w:val="16"/>
       </w:rPr>
-      <w:t>“</w:t>
+      <w:t/>
     </w:r>
     <w:r>
       <w:rPr>
         <w:sz w:val="16"/>
       </w:rPr>
-      <w:t>无</w:t>
+      <w:t/>
     </w:r>
     <w:r>
       <w:rPr>
         <w:sz w:val="16"/>
       </w:rPr>
-      <w:t>”</w:t>
+      <w:t/>
     </w:r>
     <w:r>
       <w:rPr>
         <w:sz w:val="16"/>
       </w:rPr>
-      <w:t>。</w:t>
+      <w:t/>
     </w:r>
   </w:p>
   <w:p>
@@ -15662,151 +15662,151 @@
       <w:rPr>
         <w:sz w:val="16"/>
       </w:rPr>
-      <w:t>第一作者简介：</w:t>
+      <w:t>第一作者简介：[姓名]（[出生年]—），[性别（民族，汉族可省略）]，[职称]，[学位（若在读请注明）]，研究方向：[方向1]；[方向2]。</w:t>
     </w:r>
     <w:r>
       <w:rPr>
         <w:sz w:val="16"/>
       </w:rPr>
-      <w:t>[</w:t>
+      <w:t/>
     </w:r>
     <w:r>
       <w:rPr>
         <w:sz w:val="16"/>
       </w:rPr>
-      <w:t>姓名</w:t>
+      <w:t/>
     </w:r>
     <w:r>
       <w:rPr>
         <w:sz w:val="16"/>
       </w:rPr>
-      <w:t>]</w:t>
+      <w:t/>
     </w:r>
     <w:r>
       <w:rPr>
         <w:sz w:val="16"/>
       </w:rPr>
-      <w:t>（</w:t>
+      <w:t/>
     </w:r>
     <w:r>
       <w:rPr>
         <w:sz w:val="16"/>
       </w:rPr>
-      <w:t>[</w:t>
+      <w:t/>
     </w:r>
     <w:r>
       <w:rPr>
         <w:sz w:val="16"/>
       </w:rPr>
-      <w:t>出生年</w:t>
+      <w:t/>
     </w:r>
     <w:r>
       <w:rPr>
         <w:sz w:val="16"/>
       </w:rPr>
-      <w:t>]—</w:t>
+      <w:t/>
     </w:r>
     <w:r>
       <w:rPr>
         <w:sz w:val="16"/>
       </w:rPr>
-      <w:t>），</w:t>
+      <w:t/>
     </w:r>
     <w:r>
       <w:rPr>
         <w:sz w:val="16"/>
       </w:rPr>
-      <w:t>[</w:t>
+      <w:t/>
     </w:r>
     <w:r>
       <w:rPr>
         <w:sz w:val="16"/>
       </w:rPr>
-      <w:t>性别</w:t>
+      <w:t/>
     </w:r>
     <w:r>
       <w:rPr>
         <w:sz w:val="16"/>
       </w:rPr>
-      <w:t>]</w:t>
+      <w:t/>
     </w:r>
     <w:r>
       <w:rPr>
         <w:sz w:val="16"/>
       </w:rPr>
-      <w:t>，</w:t>
+      <w:t/>
     </w:r>
     <w:r>
       <w:rPr>
         <w:sz w:val="16"/>
       </w:rPr>
-      <w:t>[</w:t>
+      <w:t/>
     </w:r>
     <w:r>
       <w:rPr>
         <w:sz w:val="16"/>
       </w:rPr>
-      <w:t>职称</w:t>
+      <w:t/>
     </w:r>
     <w:r>
       <w:rPr>
         <w:sz w:val="16"/>
       </w:rPr>
-      <w:t>]</w:t>
+      <w:t/>
     </w:r>
     <w:r>
       <w:rPr>
         <w:sz w:val="16"/>
       </w:rPr>
-      <w:t>，</w:t>
+      <w:t/>
     </w:r>
     <w:r>
       <w:rPr>
         <w:sz w:val="16"/>
       </w:rPr>
-      <w:t>[</w:t>
+      <w:t/>
     </w:r>
     <w:r>
       <w:rPr>
         <w:sz w:val="16"/>
       </w:rPr>
-      <w:t>学位</w:t>
+      <w:t/>
     </w:r>
     <w:r>
       <w:rPr>
         <w:sz w:val="16"/>
       </w:rPr>
-      <w:t>]</w:t>
+      <w:t/>
     </w:r>
     <w:r>
       <w:rPr>
         <w:sz w:val="16"/>
       </w:rPr>
-      <w:t>，研究方向：</w:t>
+      <w:t/>
     </w:r>
     <w:r>
       <w:rPr>
         <w:sz w:val="16"/>
       </w:rPr>
-      <w:t>[</w:t>
+      <w:t/>
     </w:r>
     <w:r>
       <w:rPr>
         <w:sz w:val="16"/>
       </w:rPr>
-      <w:t>请填写</w:t>
+      <w:t/>
     </w:r>
     <w:r>
       <w:rPr>
         <w:sz w:val="16"/>
       </w:rPr>
-      <w:t>]</w:t>
+      <w:t/>
     </w:r>
     <w:r>
       <w:rPr>
         <w:sz w:val="16"/>
       </w:rPr>
-      <w:t>。</w:t>
+      <w:t/>
     </w:r>
   </w:p>
   <w:p>
@@ -15817,175 +15817,175 @@
       <w:rPr>
         <w:sz w:val="16"/>
       </w:rPr>
-      <w:t>通信作者简介：</w:t>
+      <w:t>通信作者简介：[姓名]（[出生年]—），[性别（民族，汉族可省略）]，[职称]，[学位（若在读请注明）]，研究方向：[方向1]；[方向2]，电子邮箱：[邮箱]。</w:t>
     </w:r>
     <w:r>
       <w:rPr>
         <w:sz w:val="16"/>
       </w:rPr>
-      <w:t>[</w:t>
+      <w:t/>
     </w:r>
     <w:r>
       <w:rPr>
         <w:sz w:val="16"/>
       </w:rPr>
-      <w:t>姓名</w:t>
+      <w:t/>
     </w:r>
     <w:r>
       <w:rPr>
         <w:sz w:val="16"/>
       </w:rPr>
-      <w:t>]</w:t>
+      <w:t/>
     </w:r>
     <w:r>
       <w:rPr>
         <w:sz w:val="16"/>
       </w:rPr>
-      <w:t>（</w:t>
+      <w:t/>
     </w:r>
     <w:r>
       <w:rPr>
         <w:sz w:val="16"/>
       </w:rPr>
-      <w:t>[</w:t>
+      <w:t/>
     </w:r>
     <w:r>
       <w:rPr>
         <w:sz w:val="16"/>
       </w:rPr>
-      <w:t>出生年</w:t>
+      <w:t/>
     </w:r>
     <w:r>
       <w:rPr>
         <w:sz w:val="16"/>
       </w:rPr>
-      <w:t>]—</w:t>
+      <w:t/>
     </w:r>
     <w:r>
       <w:rPr>
         <w:sz w:val="16"/>
       </w:rPr>
-      <w:t>），</w:t>
+      <w:t/>
     </w:r>
     <w:r>
       <w:rPr>
         <w:sz w:val="16"/>
       </w:rPr>
-      <w:t>[</w:t>
+      <w:t/>
     </w:r>
     <w:r>
       <w:rPr>
         <w:sz w:val="16"/>
       </w:rPr>
-      <w:t>性别</w:t>
+      <w:t/>
     </w:r>
     <w:r>
       <w:rPr>
         <w:sz w:val="16"/>
       </w:rPr>
-      <w:t>]</w:t>
+      <w:t/>
     </w:r>
     <w:r>
       <w:rPr>
         <w:sz w:val="16"/>
       </w:rPr>
-      <w:t>，</w:t>
+      <w:t/>
     </w:r>
     <w:r>
       <w:rPr>
         <w:sz w:val="16"/>
       </w:rPr>
-      <w:t>[</w:t>
+      <w:t/>
     </w:r>
     <w:r>
       <w:rPr>
         <w:sz w:val="16"/>
       </w:rPr>
-      <w:t>职称</w:t>
+      <w:t/>
     </w:r>
     <w:r>
       <w:rPr>
         <w:sz w:val="16"/>
       </w:rPr>
-      <w:t>]</w:t>
+      <w:t/>
     </w:r>
     <w:r>
       <w:rPr>
         <w:sz w:val="16"/>
       </w:rPr>
-      <w:t>，</w:t>
+      <w:t/>
     </w:r>
     <w:r>
       <w:rPr>
         <w:sz w:val="16"/>
       </w:rPr>
-      <w:t>[</w:t>
+      <w:t/>
     </w:r>
     <w:r>
       <w:rPr>
         <w:sz w:val="16"/>
       </w:rPr>
-      <w:t>学位</w:t>
+      <w:t/>
     </w:r>
     <w:r>
       <w:rPr>
         <w:sz w:val="16"/>
       </w:rPr>
-      <w:t>]</w:t>
+      <w:t/>
     </w:r>
     <w:r>
       <w:rPr>
         <w:sz w:val="16"/>
       </w:rPr>
-      <w:t>，研究方向：</w:t>
+      <w:t/>
     </w:r>
     <w:r>
       <w:rPr>
         <w:sz w:val="16"/>
       </w:rPr>
-      <w:t>[</w:t>
+      <w:t/>
     </w:r>
     <w:r>
       <w:rPr>
         <w:sz w:val="16"/>
       </w:rPr>
-      <w:t>请填写</w:t>
+      <w:t/>
     </w:r>
     <w:r>
       <w:rPr>
         <w:sz w:val="16"/>
       </w:rPr>
-      <w:t>]</w:t>
+      <w:t/>
     </w:r>
     <w:r>
       <w:rPr>
         <w:sz w:val="16"/>
       </w:rPr>
-      <w:t>，电子邮箱：</w:t>
+      <w:t/>
     </w:r>
     <w:r>
       <w:rPr>
         <w:sz w:val="16"/>
       </w:rPr>
-      <w:t>[</w:t>
+      <w:t/>
     </w:r>
     <w:r>
       <w:rPr>
         <w:sz w:val="16"/>
       </w:rPr>
-      <w:t>请填写</w:t>
+      <w:t/>
     </w:r>
     <w:r>
       <w:rPr>
         <w:sz w:val="16"/>
       </w:rPr>
-      <w:t>]</w:t>
+      <w:t/>
     </w:r>
     <w:r>
       <w:rPr>
         <w:sz w:val="16"/>
       </w:rPr>
-      <w:t>。</w:t>
+      <w:t/>
     </w:r>
   </w:p>
 </w:ftr>

</xml_diff>

<commit_message>
align manuscript figures with journal requirements
</commit_message>
<xml_diff>
--- a/word_output/2026.09.18v.docx
+++ b/word_output/2026.09.18v.docx
@@ -11364,7 +11364,7 @@
         </w:rPr>
         <w:drawing>
           <wp:inline distT="0" distB="0" distL="0" distR="0" wp14:anchorId="3E6F0209" wp14:editId="43ADD92D">
-            <wp:extent cx="6115050" cy="4410075"/>
+            <wp:extent cx="6115050" cy="4410194"/>
             <wp:effectExtent l="0" t="0" r="0" b="9525"/>
             <wp:docPr id="20" name="图片 2" descr="已检查的图像"/>
             <wp:cNvGraphicFramePr>
@@ -11395,7 +11395,7 @@
                   <pic:spPr bwMode="auto">
                     <a:xfrm>
                       <a:off x="0" y="0"/>
-                      <a:ext cx="6115050" cy="4410075"/>
+                      <a:ext cx="6115050" cy="4410194"/>
                     </a:xfrm>
                     <a:prstGeom prst="rect">
                       <a:avLst/>
@@ -12929,7 +12929,7 @@
         </w:rPr>
         <w:drawing>
           <wp:inline distT="0" distB="0" distL="0" distR="0" wp14:anchorId="7F717F3E" wp14:editId="402B5CF1">
-            <wp:extent cx="5762625" cy="2543175"/>
+            <wp:extent cx="5762625" cy="2549423"/>
             <wp:effectExtent l="0" t="0" r="9525" b="9525"/>
             <wp:docPr id="21" name="Picture 3"/>
             <wp:cNvGraphicFramePr>
@@ -12960,7 +12960,7 @@
                   <pic:spPr bwMode="auto">
                     <a:xfrm>
                       <a:off x="0" y="0"/>
-                      <a:ext cx="5762625" cy="2543175"/>
+                      <a:ext cx="5762625" cy="2549423"/>
                     </a:xfrm>
                     <a:prstGeom prst="rect">
                       <a:avLst/>
@@ -13261,7 +13261,7 @@
         <w:lastRenderedPageBreak/>
         <w:drawing>
           <wp:inline distT="0" distB="0" distL="0" distR="0" wp14:anchorId="5A996749" wp14:editId="4A1C3E46">
-            <wp:extent cx="5762625" cy="2343150"/>
+            <wp:extent cx="5762625" cy="2338028"/>
             <wp:effectExtent l="0" t="0" r="9525" b="0"/>
             <wp:docPr id="22" name="Picture 4"/>
             <wp:cNvGraphicFramePr>
@@ -13292,7 +13292,7 @@
                   <pic:spPr bwMode="auto">
                     <a:xfrm>
                       <a:off x="0" y="0"/>
-                      <a:ext cx="5762625" cy="2343150"/>
+                      <a:ext cx="5762625" cy="2338028"/>
                     </a:xfrm>
                     <a:prstGeom prst="rect">
                       <a:avLst/>
@@ -14661,7 +14661,7 @@
         <w:lastRenderedPageBreak/>
         <w:drawing>
           <wp:inline distT="0" distB="0" distL="0" distR="0" wp14:anchorId="388DECB4" wp14:editId="37BE9719">
-            <wp:extent cx="6115050" cy="2581275"/>
+            <wp:extent cx="6115050" cy="2570744"/>
             <wp:effectExtent l="0" t="0" r="0" b="9525"/>
             <wp:docPr id="23" name="图片 3" descr="已检查的图像"/>
             <wp:cNvGraphicFramePr>
@@ -14692,7 +14692,7 @@
                   <pic:spPr bwMode="auto">
                     <a:xfrm>
                       <a:off x="0" y="0"/>
-                      <a:ext cx="6115050" cy="2581275"/>
+                      <a:ext cx="6115050" cy="2570744"/>
                     </a:xfrm>
                     <a:prstGeom prst="rect">
                       <a:avLst/>
@@ -15019,7 +15019,7 @@
         </w:rPr>
         <w:drawing>
           <wp:inline distT="0" distB="0" distL="0" distR="0" wp14:anchorId="25B76E87" wp14:editId="0917FFB9">
-            <wp:extent cx="4610100" cy="1866900"/>
+            <wp:extent cx="4610100" cy="1870422"/>
             <wp:effectExtent l="0" t="0" r="0" b="0"/>
             <wp:docPr id="24" name="Picture 6"/>
             <wp:cNvGraphicFramePr>
@@ -15050,7 +15050,7 @@
                   <pic:spPr bwMode="auto">
                     <a:xfrm>
                       <a:off x="0" y="0"/>
-                      <a:ext cx="4610100" cy="1866900"/>
+                      <a:ext cx="4610100" cy="1870422"/>
                     </a:xfrm>
                     <a:prstGeom prst="rect">
                       <a:avLst/>

</xml_diff>

<commit_message>
apply journal requirement 14 equation explanations
</commit_message>
<xml_diff>
--- a/word_output/2026.09.18v.docx
+++ b/word_output/2026.09.18v.docx
@@ -4370,6 +4370,14 @@
       <w:pPr>
         <w:spacing w:line="360" w:lineRule="auto"/>
       </w:pPr>
+      <w:r>
+        <w:rPr>
+          <w:rFonts w:ascii="Times New Roman" w:hAnsi="Times New Roman" w:eastAsia="宋体" w:cs="Times New Roman"/>
+          <w:sz w:val="21"/>
+          <w:szCs w:val="21"/>
+        </w:rPr>
+        <w:t>式中，趋势项线性层和余项线性层分别具有独立的时间映射权重与偏置参数。</w:t>
+      </w:r>
       <w:r>
         <w:rPr>
           <w:rFonts w:eastAsia="宋体"/>
@@ -5842,6 +5850,14 @@
       <w:pPr>
         <w:spacing w:line="360" w:lineRule="auto"/>
       </w:pPr>
+      <w:r>
+        <w:rPr>
+          <w:rFonts w:ascii="Times New Roman" w:hAnsi="Times New Roman" w:eastAsia="宋体" w:cs="Times New Roman"/>
+          <w:sz w:val="21"/>
+          <w:szCs w:val="21"/>
+        </w:rPr>
+        <w:t>式中，两层感知器各自包含权重矩阵和偏置，输出为三个尺度的得分向量。</w:t>
+      </w:r>
       <w:r>
         <w:rPr>
           <w:rFonts w:eastAsia="宋体"/>
@@ -7611,6 +7627,14 @@
       </w:pPr>
       <w:r>
         <w:rPr>
+          <w:rFonts w:ascii="Times New Roman" w:hAnsi="Times New Roman" w:eastAsia="宋体" w:cs="Times New Roman"/>
+          <w:sz w:val="21"/>
+          <w:szCs w:val="21"/>
+        </w:rPr>
+        <w:t>式中，频域系数表示第n个样本在尺度s、频率索引k和变量c处的复数谱值，k为频率索引，j为虚数单位。</w:t>
+      </w:r>
+      <w:r>
+        <w:rPr>
           <w:rFonts w:eastAsia="宋体"/>
           <w:sz w:val="21"/>
           <w:szCs w:val="21"/>
@@ -8393,6 +8417,14 @@
       <w:pPr>
         <w:spacing w:line="360" w:lineRule="auto"/>
       </w:pPr>
+      <w:r>
+        <w:rPr>
+          <w:rFonts w:ascii="Times New Roman" w:hAnsi="Times New Roman" w:eastAsia="宋体" w:cs="Times New Roman"/>
+          <w:sz w:val="21"/>
+          <w:szCs w:val="21"/>
+        </w:rPr>
+        <w:t>式中，可学习门控参数按尺度s和频率索引k定义，用于调节对应保留频率的幅值。</w:t>
+      </w:r>
       <w:r>
         <w:rPr>
           <w:rFonts w:eastAsia="宋体"/>
@@ -9037,6 +9069,14 @@
       <w:pPr>
         <w:spacing w:line="360" w:lineRule="auto"/>
       </w:pPr>
+      <w:r>
+        <w:rPr>
+          <w:rFonts w:ascii="Times New Roman" w:hAnsi="Times New Roman" w:eastAsia="宋体" w:cs="Times New Roman"/>
+          <w:sz w:val="21"/>
+          <w:szCs w:val="21"/>
+        </w:rPr>
+        <w:t>式中，N为训练样本数，损失函数表示训练样本、预测时刻和OD变量上的平均平方误差。</w:t>
+      </w:r>
       <w:r>
         <w:rPr>
           <w:rFonts w:eastAsia="宋体"/>

</xml_diff>

<commit_message>
apply journal requirement 15 quantity typography
</commit_message>
<xml_diff>
--- a/word_output/2026.09.18v.docx
+++ b/word_output/2026.09.18v.docx
@@ -1367,6 +1367,9 @@
           </m:sSubPr>
           <m:e>
             <m:r>
+              <m:rPr>
+                <m:sty m:val="bi"/>
+              </m:rPr>
               <w:rPr>
                 <w:rFonts w:ascii="Cambria Math" w:eastAsia="Cambria Math" w:hAnsi="Cambria Math"/>
                 <w:kern w:val="0"/>
@@ -1509,6 +1512,9 @@
           </m:sSupPr>
           <m:e>
             <m:r>
+              <m:rPr>
+                <m:sty m:val="bi"/>
+              </m:rPr>
               <w:rPr>
                 <w:rFonts w:ascii="Cambria Math" w:eastAsia="Cambria Math" w:hAnsi="Cambria Math"/>
                 <w:kern w:val="0"/>
@@ -1604,6 +1610,9 @@
           </m:sSubPr>
           <m:e>
             <m:r>
+              <m:rPr>
+                <m:sty m:val="bi"/>
+              </m:rPr>
               <w:rPr>
                 <w:rFonts w:ascii="Cambria Math" w:eastAsia="Cambria Math" w:hAnsi="Cambria Math"/>
                 <w:kern w:val="0"/>
@@ -1760,6 +1769,9 @@
           </m:sSupPr>
           <m:e>
             <m:r>
+              <m:rPr>
+                <m:sty m:val="bi"/>
+              </m:rPr>
               <w:rPr>
                 <w:rFonts w:ascii="Cambria Math" w:eastAsia="Cambria Math" w:hAnsi="Cambria Math"/>
                 <w:kern w:val="0"/>
@@ -2304,6 +2316,9 @@
                   </m:dPr>
                   <m:e>
                     <m:r>
+                      <m:rPr>
+                        <m:sty m:val="p"/>
+                      </m:rPr>
                       <w:rPr>
                         <w:rFonts w:ascii="Cambria Math" w:eastAsia="Cambria Math" w:hAnsi="Cambria Math"/>
                         <w:kern w:val="0"/>
@@ -2360,6 +2375,9 @@
                   </m:dPr>
                   <m:e>
                     <m:r>
+                      <m:rPr>
+                        <m:sty m:val="p"/>
+                      </m:rPr>
                       <w:rPr>
                         <w:rFonts w:ascii="Cambria Math" w:eastAsia="Cambria Math" w:hAnsi="Cambria Math"/>
                         <w:kern w:val="0"/>
@@ -2621,6 +2639,9 @@
           </m:sSubSupPr>
           <m:e>
             <m:r>
+              <m:rPr>
+                <m:sty m:val="bi"/>
+              </m:rPr>
               <w:rPr>
                 <w:rFonts w:ascii="Cambria Math" w:eastAsia="Cambria Math" w:hAnsi="Cambria Math"/>
                 <w:kern w:val="0"/>
@@ -2841,6 +2862,9 @@
                   </m:e>
                 </m:d>
                 <m:r>
+                  <m:rPr>
+                    <m:sty m:val="bi"/>
+                  </m:rPr>
                   <w:rPr>
                     <w:rFonts w:ascii="Cambria Math" w:eastAsia="Cambria Math" w:hAnsi="Cambria Math"/>
                     <w:kern w:val="0"/>
@@ -3190,6 +3214,9 @@
           </m:sSubSupPr>
           <m:e>
             <m:r>
+              <m:rPr>
+                <m:sty m:val="bi"/>
+              </m:rPr>
               <w:rPr>
                 <w:rFonts w:ascii="Cambria Math" w:eastAsia="Cambria Math" w:hAnsi="Cambria Math"/>
                 <w:kern w:val="0"/>
@@ -3397,6 +3424,9 @@
                   </m:accPr>
                   <m:e>
                     <m:r>
+                      <m:rPr>
+                        <m:sty m:val="bi"/>
+                      </m:rPr>
                       <w:rPr>
                         <w:rFonts w:ascii="Cambria Math" w:eastAsia="Cambria Math" w:hAnsi="Cambria Math"/>
                         <w:kern w:val="0"/>
@@ -3532,6 +3562,9 @@
           </m:sSubSupPr>
           <m:e>
             <m:r>
+              <m:rPr>
+                <m:sty m:val="bi"/>
+              </m:rPr>
               <w:rPr>
                 <w:rFonts w:ascii="Cambria Math" w:eastAsia="Cambria Math" w:hAnsi="Cambria Math"/>
                 <w:kern w:val="0"/>
@@ -3606,6 +3639,9 @@
           </m:sSubSupPr>
           <m:e>
             <m:r>
+              <m:rPr>
+                <m:sty m:val="bi"/>
+              </m:rPr>
               <w:rPr>
                 <w:rFonts w:ascii="Cambria Math" w:eastAsia="Cambria Math" w:hAnsi="Cambria Math"/>
                 <w:kern w:val="0"/>
@@ -3680,6 +3716,9 @@
           </m:sSubSupPr>
           <m:e>
             <m:r>
+              <m:rPr>
+                <m:sty m:val="bi"/>
+              </m:rPr>
               <w:rPr>
                 <w:rFonts w:ascii="Cambria Math" w:eastAsia="Cambria Math" w:hAnsi="Cambria Math"/>
                 <w:kern w:val="0"/>
@@ -3858,6 +3897,9 @@
           </m:sSubSupPr>
           <m:e>
             <m:r>
+              <m:rPr>
+                <m:sty m:val="bi"/>
+              </m:rPr>
               <w:rPr>
                 <w:rFonts w:ascii="Cambria Math" w:eastAsia="Cambria Math" w:hAnsi="Cambria Math"/>
                 <w:kern w:val="0"/>
@@ -3932,6 +3974,9 @@
           </m:sSubSupPr>
           <m:e>
             <m:r>
+              <m:rPr>
+                <m:sty m:val="bi"/>
+              </m:rPr>
               <w:rPr>
                 <w:rFonts w:ascii="Cambria Math" w:eastAsia="Cambria Math" w:hAnsi="Cambria Math"/>
                 <w:kern w:val="0"/>
@@ -3942,6 +3987,9 @@
           </m:e>
           <m:sub>
             <m:r>
+              <m:rPr>
+                <m:sty m:val="p"/>
+              </m:rPr>
               <w:rPr>
                 <w:rFonts w:ascii="Cambria Math" w:eastAsia="Cambria Math" w:hAnsi="Cambria Math"/>
                 <w:kern w:val="0"/>
@@ -3996,6 +4044,9 @@
               </m:sSubSupPr>
               <m:e>
                 <m:r>
+                  <m:rPr>
+                    <m:sty m:val="bi"/>
+                  </m:rPr>
                   <w:rPr>
                     <w:rFonts w:ascii="Cambria Math" w:eastAsia="Cambria Math" w:hAnsi="Cambria Math"/>
                     <w:kern w:val="0"/>
@@ -4082,6 +4133,9 @@
           </m:e>
           <m:sub>
             <m:r>
+              <m:rPr>
+                <m:sty m:val="p"/>
+              </m:rPr>
               <w:rPr>
                 <w:rFonts w:ascii="Cambria Math" w:eastAsia="Cambria Math" w:hAnsi="Cambria Math"/>
                 <w:kern w:val="0"/>
@@ -4146,6 +4200,9 @@
           </m:sSubSupPr>
           <m:e>
             <m:r>
+              <m:rPr>
+                <m:sty m:val="bi"/>
+              </m:rPr>
               <w:rPr>
                 <w:rFonts w:ascii="Cambria Math" w:eastAsia="Cambria Math" w:hAnsi="Cambria Math"/>
                 <w:kern w:val="0"/>
@@ -4156,6 +4213,9 @@
           </m:e>
           <m:sub>
             <m:r>
+              <m:rPr>
+                <m:sty m:val="p"/>
+              </m:rPr>
               <w:rPr>
                 <w:rFonts w:ascii="Cambria Math" w:eastAsia="Cambria Math" w:hAnsi="Cambria Math"/>
                 <w:kern w:val="0"/>
@@ -4210,6 +4270,9 @@
               </m:sSubSupPr>
               <m:e>
                 <m:r>
+                  <m:rPr>
+                    <m:sty m:val="bi"/>
+                  </m:rPr>
                   <w:rPr>
                     <w:rFonts w:ascii="Cambria Math" w:eastAsia="Cambria Math" w:hAnsi="Cambria Math"/>
                     <w:kern w:val="0"/>
@@ -4296,6 +4359,9 @@
           </m:e>
           <m:sub>
             <m:r>
+              <m:rPr>
+                <m:sty m:val="p"/>
+              </m:rPr>
               <w:rPr>
                 <w:rFonts w:ascii="Cambria Math" w:eastAsia="Cambria Math" w:hAnsi="Cambria Math"/>
                 <w:kern w:val="0"/>
@@ -4660,6 +4726,9 @@
               </m:sSubPr>
               <m:e>
                 <m:r>
+                  <m:rPr>
+                    <m:sty m:val="bi"/>
+                  </m:rPr>
                   <w:rPr>
                     <w:rFonts w:ascii="Cambria Math" w:eastAsia="Cambria Math" w:hAnsi="Cambria Math"/>
                     <w:kern w:val="0"/>
@@ -4858,6 +4927,9 @@
                       </m:sSubPr>
                       <m:e>
                         <m:r>
+                          <m:rPr>
+                            <m:sty m:val="bi"/>
+                          </m:rPr>
                           <w:rPr>
                             <w:rFonts w:ascii="Cambria Math" w:eastAsia="Cambria Math" w:hAnsi="Cambria Math"/>
                             <w:kern w:val="0"/>
@@ -5118,6 +5190,9 @@
               </m:sSubPr>
               <m:e>
                 <m:r>
+                  <m:rPr>
+                    <m:sty m:val="bi"/>
+                  </m:rPr>
                   <w:rPr>
                     <w:rFonts w:ascii="Cambria Math" w:eastAsia="Cambria Math" w:hAnsi="Cambria Math"/>
                     <w:kern w:val="0"/>
@@ -5346,6 +5421,9 @@
                       </m:sSubPr>
                       <m:e>
                         <m:r>
+                          <m:rPr>
+                            <m:sty m:val="bi"/>
+                          </m:rPr>
                           <w:rPr>
                             <w:rFonts w:ascii="Cambria Math" w:eastAsia="Cambria Math" w:hAnsi="Cambria Math"/>
                             <w:kern w:val="0"/>
@@ -5398,6 +5476,9 @@
                       </m:sSubPr>
                       <m:e>
                         <m:r>
+                          <m:rPr>
+                            <m:sty m:val="bi"/>
+                          </m:rPr>
                           <w:rPr>
                             <w:rFonts w:ascii="Cambria Math" w:eastAsia="Cambria Math" w:hAnsi="Cambria Math"/>
                             <w:kern w:val="0"/>
@@ -5654,6 +5735,9 @@
           </m:sSubPr>
           <m:e>
             <m:r>
+              <m:rPr>
+                <m:sty m:val="bi"/>
+              </m:rPr>
               <w:rPr>
                 <w:rFonts w:ascii="Cambria Math" w:eastAsia="Cambria Math" w:hAnsi="Cambria Math"/>
                 <w:kern w:val="0"/>
@@ -5664,6 +5748,9 @@
           </m:e>
           <m:sub>
             <m:r>
+              <m:rPr>
+                <m:sty m:val="p"/>
+              </m:rPr>
               <w:rPr>
                 <w:rFonts w:ascii="Cambria Math" w:eastAsia="Cambria Math" w:hAnsi="Cambria Math"/>
                 <w:kern w:val="0"/>
@@ -5692,6 +5779,9 @@
                   </m:sSubPr>
                   <m:e>
                     <m:r>
+                      <m:rPr>
+                        <m:sty m:val="bi"/>
+                      </m:rPr>
                       <w:rPr>
                         <w:rFonts w:ascii="Cambria Math" w:eastAsia="Cambria Math" w:hAnsi="Cambria Math"/>
                         <w:kern w:val="0"/>
@@ -5720,6 +5810,9 @@
                       </m:sSubPr>
                       <m:e>
                         <m:r>
+                          <m:rPr>
+                            <m:sty m:val="bi"/>
+                          </m:rPr>
                           <w:rPr>
                             <w:rFonts w:ascii="Cambria Math" w:eastAsia="Cambria Math" w:hAnsi="Cambria Math"/>
                             <w:kern w:val="0"/>
@@ -6408,6 +6501,9 @@
           </m:sSubPr>
           <m:e>
             <m:r>
+              <m:rPr>
+                <m:sty m:val="bi"/>
+              </m:rPr>
               <w:rPr>
                 <w:rFonts w:ascii="Cambria Math" w:eastAsia="Cambria Math" w:hAnsi="Cambria Math"/>
                 <w:kern w:val="0"/>
@@ -6530,6 +6626,9 @@
                   </m:sSubSupPr>
                   <m:e>
                     <m:r>
+                      <m:rPr>
+                        <m:sty m:val="bi"/>
+                      </m:rPr>
                       <w:rPr>
                         <w:rFonts w:ascii="Cambria Math" w:eastAsia="Cambria Math" w:hAnsi="Cambria Math"/>
                         <w:kern w:val="0"/>
@@ -6772,6 +6871,9 @@
               </m:accPr>
               <m:e>
                 <m:r>
+                  <m:rPr>
+                    <m:sty m:val="bi"/>
+                  </m:rPr>
                   <w:rPr>
                     <w:rFonts w:ascii="Cambria Math" w:eastAsia="Cambria Math" w:hAnsi="Cambria Math"/>
                     <w:kern w:val="0"/>
@@ -6858,6 +6960,9 @@
               </m:sSubSupPr>
               <m:e>
                 <m:r>
+                  <m:rPr>
+                    <m:sty m:val="bi"/>
+                  </m:rPr>
                   <w:rPr>
                     <w:rFonts w:ascii="Cambria Math" w:eastAsia="Cambria Math" w:hAnsi="Cambria Math"/>
                     <w:kern w:val="0"/>
@@ -7226,6 +7331,9 @@
           </m:sSubSupPr>
           <m:e>
             <m:r>
+              <m:rPr>
+                <m:sty m:val="bi"/>
+              </m:rPr>
               <w:rPr>
                 <w:rFonts w:ascii="Cambria Math" w:eastAsia="Cambria Math" w:hAnsi="Cambria Math"/>
                 <w:kern w:val="0"/>
@@ -7430,6 +7538,9 @@
                       </m:accPr>
                       <m:e>
                         <m:r>
+                          <m:rPr>
+                            <m:sty m:val="bi"/>
+                          </m:rPr>
                           <w:rPr>
                             <w:rFonts w:ascii="Cambria Math" w:eastAsia="Cambria Math" w:hAnsi="Cambria Math"/>
                             <w:kern w:val="0"/>
@@ -7975,6 +8086,9 @@
               </m:accPr>
               <m:e>
                 <m:r>
+                  <m:rPr>
+                    <m:sty m:val="bi"/>
+                  </m:rPr>
                   <w:rPr>
                     <w:rFonts w:ascii="Cambria Math" w:eastAsia="Cambria Math" w:hAnsi="Cambria Math"/>
                     <w:kern w:val="0"/>
@@ -8047,6 +8161,9 @@
           </m:sup>
         </m:sSubSup>
         <m:r>
+          <m:rPr>
+            <m:sty m:val="p"/>
+          </m:rPr>
           <w:rPr>
             <w:rFonts w:ascii="Cambria Math" w:eastAsia="Cambria Math" w:hAnsi="Cambria Math"/>
             <w:kern w:val="0"/>
@@ -8143,6 +8260,9 @@
           </m:sSubSupPr>
           <m:e>
             <m:r>
+              <m:rPr>
+                <m:sty m:val="bi"/>
+              </m:rPr>
               <w:rPr>
                 <w:rFonts w:ascii="Cambria Math" w:eastAsia="Cambria Math" w:hAnsi="Cambria Math"/>
                 <w:kern w:val="0"/>
@@ -8279,6 +8399,9 @@
               </m:accPr>
               <m:e>
                 <m:r>
+                  <m:rPr>
+                    <m:sty m:val="bi"/>
+                  </m:rPr>
                   <w:rPr>
                     <w:rFonts w:ascii="Cambria Math" w:eastAsia="Cambria Math" w:hAnsi="Cambria Math"/>
                     <w:kern w:val="0"/>
@@ -8645,6 +8768,9 @@
               </m:dPr>
               <m:e>
                 <m:r>
+                  <m:rPr>
+                    <m:sty m:val="p"/>
+                  </m:rPr>
                   <w:rPr>
                     <w:rFonts w:ascii="Cambria Math" w:eastAsia="Cambria Math" w:hAnsi="Cambria Math"/>
                     <w:kern w:val="0"/>
@@ -8935,6 +9061,9 @@
                               </m:sSubPr>
                               <m:e>
                                 <m:r>
+                                  <m:rPr>
+                                    <m:sty m:val="bi"/>
+                                  </m:rPr>
                                   <w:rPr>
                                     <w:rFonts w:ascii="Cambria Math" w:eastAsia="Cambria Math" w:hAnsi="Cambria Math"/>
                                     <w:kern w:val="0"/>
@@ -8987,6 +9116,9 @@
                               </m:sSubPr>
                               <m:e>
                                 <m:r>
+                                  <m:rPr>
+                                    <m:sty m:val="bi"/>
+                                  </m:rPr>
                                   <w:rPr>
                                     <w:rFonts w:ascii="Cambria Math" w:eastAsia="Cambria Math" w:hAnsi="Cambria Math"/>
                                     <w:kern w:val="0"/>
@@ -9669,6 +9801,9 @@
       </w:r>
       <m:oMath>
         <m:r>
+          <m:rPr>
+            <m:sty m:val="p"/>
+          </m:rPr>
           <w:rPr>
             <w:rFonts w:ascii="Cambria Math" w:eastAsia="Cambria Math" w:hAnsi="Cambria Math"/>
             <w:kern w:val="0"/>
@@ -9747,6 +9882,9 @@
                       </m:dPr>
                       <m:e>
                         <m:r>
+                          <m:rPr>
+                            <m:sty m:val="p"/>
+                          </m:rPr>
                           <w:rPr>
                             <w:rFonts w:ascii="Cambria Math" w:eastAsia="Cambria Math" w:hAnsi="Cambria Math"/>
                             <w:kern w:val="0"/>
@@ -9843,6 +9981,9 @@
                   </m:sSubPr>
                   <m:e>
                     <m:r>
+                      <m:rPr>
+                        <m:sty m:val="bi"/>
+                      </m:rPr>
                       <w:rPr>
                         <w:rFonts w:ascii="Cambria Math" w:eastAsia="Cambria Math" w:hAnsi="Cambria Math"/>
                         <w:kern w:val="0"/>
@@ -9899,6 +10040,9 @@
                   </m:sSubPr>
                   <m:e>
                     <m:r>
+                      <m:rPr>
+                        <m:sty m:val="bi"/>
+                      </m:rPr>
                       <w:rPr>
                         <w:rFonts w:ascii="Cambria Math" w:eastAsia="Cambria Math" w:hAnsi="Cambria Math"/>
                         <w:kern w:val="0"/>
@@ -9984,6 +10128,9 @@
       </w:r>
       <m:oMath>
         <m:r>
+          <m:rPr>
+            <m:sty m:val="p"/>
+          </m:rPr>
           <w:rPr>
             <w:rFonts w:ascii="Cambria Math" w:eastAsia="Cambria Math" w:hAnsi="Cambria Math"/>
             <w:kern w:val="0"/>
@@ -10006,6 +10153,9 @@
           <m:deg/>
           <m:e>
             <m:r>
+              <m:rPr>
+                <m:sty m:val="p"/>
+              </m:rPr>
               <w:rPr>
                 <w:rFonts w:ascii="Cambria Math" w:eastAsia="Cambria Math" w:hAnsi="Cambria Math"/>
                 <w:kern w:val="0"/>

</xml_diff>

<commit_message>
finish journal requirement 15 quantity and unit typography
</commit_message>
<xml_diff>
--- a/word_output/2026.09.18v.docx
+++ b/word_output/2026.09.18v.docx
@@ -1220,65 +1220,65 @@
       </w:pPr>
       <w:r>
         <w:rPr>
-          <w:rFonts w:eastAsia="宋体"/>
-          <w:sz w:val="21"/>
-          <w:szCs w:val="21"/>
-        </w:rPr>
-        <w:t>设预处理后的多变量流量序列为</w:t>
-      </w:r>
-      <w:r>
-        <w:rPr>
-          <w:rFonts w:eastAsia="宋体"/>
-          <w:sz w:val="21"/>
-          <w:szCs w:val="21"/>
-        </w:rPr>
-        <w:t xml:space="preserve"> </w:t>
-      </w:r>
-      <w:r>
-        <w:rPr>
-          <w:rFonts w:eastAsia="宋体"/>
+          <w:rFonts w:ascii="Times New Roman" w:hAnsi="Times New Roman" w:eastAsia="宋体" w:cs="Times New Roman"/>
+          <w:sz w:val="21"/>
+          <w:szCs w:val="21"/>
+        </w:rPr>
+        <w:t xml:space="preserve">设预处理后的多变量流量序列为 </w:t>
+      </w:r>
+      <w:r>
+        <w:rPr>
+          <w:rFonts w:ascii="Times New Roman" w:hAnsi="Times New Roman" w:eastAsia="宋体" w:cs="Times New Roman"/>
           <w:sz w:val="21"/>
           <w:szCs w:val="21"/>
           <w:i/>
           <w:iCs/>
         </w:rPr>
-        <w:t xml:space="preserve">x</w:t>
-      </w:r>
-      <w:r>
-        <w:rPr>
-          <w:rFonts w:eastAsia="宋体"/>
-          <w:sz w:val="21"/>
-          <w:szCs w:val="21"/>
-        </w:rPr>
-        <w:t xml:space="preserve">_</w:t>
-      </w:r>
-      <w:r>
-        <w:rPr>
-          <w:rFonts w:eastAsia="宋体"/>
+        <w:t>x</w:t>
+      </w:r>
+      <w:r>
+        <w:rPr>
+          <w:rFonts w:ascii="Times New Roman" w:hAnsi="Times New Roman" w:eastAsia="宋体" w:cs="Times New Roman"/>
           <w:sz w:val="21"/>
           <w:szCs w:val="21"/>
           <w:i/>
           <w:iCs/>
-        </w:rPr>
-        <w:t xml:space="preserve">t</w:t>
-      </w:r>
-      <w:r>
-        <w:rPr>
-          <w:rFonts w:ascii="Cambria Math" w:hAnsi="Cambria Math" w:cs="Cambria Math"/>
+          <w:vertAlign w:val="subscript"/>
+        </w:rPr>
+        <w:t>t</w:t>
+      </w:r>
+      <w:r>
+        <w:rPr>
+          <w:rFonts w:ascii="Times New Roman" w:hAnsi="Times New Roman" w:eastAsia="宋体" w:cs="Times New Roman"/>
+          <w:sz w:val="21"/>
+          <w:szCs w:val="21"/>
         </w:rPr>
         <w:t>∈</w:t>
       </w:r>
       <w:r>
         <w:rPr>
-          <w:rFonts w:eastAsia="宋体"/>
-          <w:sz w:val="21"/>
-          <w:szCs w:val="21"/>
-        </w:rPr>
-        <w:t>R^C</w:t>
-      </w:r>
-      <w:r>
-        <w:rPr>
-          <w:rFonts w:eastAsia="宋体"/>
+          <w:rFonts w:ascii="Times New Roman" w:hAnsi="Times New Roman" w:eastAsia="宋体" w:cs="Times New Roman"/>
+          <w:sz w:val="21"/>
+          <w:szCs w:val="21"/>
+          <w:i/>
+          <w:iCs/>
+        </w:rPr>
+        <w:t>R</w:t>
+      </w:r>
+      <w:r>
+        <w:rPr>
+          <w:rFonts w:ascii="Times New Roman" w:hAnsi="Times New Roman" w:eastAsia="宋体" w:cs="Times New Roman"/>
+          <w:sz w:val="21"/>
+          <w:szCs w:val="21"/>
+          <w:i/>
+          <w:iCs/>
+          <w:vertAlign w:val="superscript"/>
+        </w:rPr>
+        <w:t>C</w:t>
+      </w:r>
+      <w:r>
+        <w:rPr>
+          <w:rFonts w:ascii="Times New Roman" w:hAnsi="Times New Roman" w:eastAsia="宋体" w:cs="Times New Roman"/>
           <w:sz w:val="21"/>
           <w:szCs w:val="21"/>
         </w:rPr>
@@ -1286,15 +1286,17 @@
       </w:r>
       <w:r>
         <w:rPr>
-          <w:rFonts w:eastAsia="宋体"/>
-          <w:sz w:val="21"/>
-          <w:szCs w:val="21"/>
+          <w:rFonts w:ascii="Times New Roman" w:hAnsi="Times New Roman" w:eastAsia="宋体" w:cs="Times New Roman"/>
+          <w:sz w:val="21"/>
+          <w:szCs w:val="21"/>
+          <w:i/>
+          <w:iCs/>
         </w:rPr>
         <w:t>t</w:t>
       </w:r>
       <w:r>
         <w:rPr>
-          <w:rFonts w:eastAsia="宋体"/>
+          <w:rFonts w:ascii="Times New Roman" w:hAnsi="Times New Roman" w:eastAsia="宋体" w:cs="Times New Roman"/>
           <w:sz w:val="21"/>
           <w:szCs w:val="21"/>
         </w:rPr>
@@ -1302,60 +1304,39 @@
       </w:r>
       <w:r>
         <w:rPr>
-          <w:rFonts w:eastAsia="宋体"/>
-          <w:sz w:val="21"/>
-          <w:szCs w:val="21"/>
+          <w:rFonts w:ascii="Times New Roman" w:hAnsi="Times New Roman" w:eastAsia="宋体" w:cs="Times New Roman"/>
+          <w:sz w:val="21"/>
+          <w:szCs w:val="21"/>
+          <w:i/>
+          <w:iCs/>
         </w:rPr>
         <w:t>C</w:t>
       </w:r>
       <w:r>
         <w:rPr>
-          <w:rFonts w:eastAsia="宋体"/>
-          <w:sz w:val="21"/>
-          <w:szCs w:val="21"/>
-        </w:rPr>
-        <w:t>为</w:t>
-      </w:r>
-      <w:r>
-        <w:rPr>
-          <w:rFonts w:eastAsia="宋体"/>
-          <w:sz w:val="21"/>
-          <w:szCs w:val="21"/>
-        </w:rPr>
-        <w:t>OD</w:t>
-      </w:r>
-      <w:r>
-        <w:rPr>
-          <w:rFonts w:eastAsia="宋体"/>
-          <w:sz w:val="21"/>
-          <w:szCs w:val="21"/>
-        </w:rPr>
-        <w:t>变量数。第</w:t>
-      </w:r>
-      <w:r>
-        <w:rPr>
-          <w:rFonts w:eastAsia="宋体"/>
-          <w:sz w:val="21"/>
-          <w:szCs w:val="21"/>
+          <w:rFonts w:ascii="Times New Roman" w:hAnsi="Times New Roman" w:eastAsia="宋体" w:cs="Times New Roman"/>
+          <w:sz w:val="21"/>
+          <w:szCs w:val="21"/>
+        </w:rPr>
+        <w:t>为OD变量数。第</w:t>
+      </w:r>
+      <w:r>
+        <w:rPr>
+          <w:rFonts w:ascii="Times New Roman" w:hAnsi="Times New Roman" w:eastAsia="宋体" w:cs="Times New Roman"/>
+          <w:sz w:val="21"/>
+          <w:szCs w:val="21"/>
+          <w:i/>
+          <w:iCs/>
         </w:rPr>
         <w:t>n</w:t>
       </w:r>
       <w:r>
         <w:rPr>
-          <w:rFonts w:eastAsia="宋体"/>
-          <w:sz w:val="21"/>
-          <w:szCs w:val="21"/>
-        </w:rPr>
-        <w:t>个样本的输入</w:t>
-      </w:r>
-      <w:r>
-        <w:rPr>
-          <w:rFonts w:eastAsia="宋体"/>
-          <w:sz w:val="21"/>
-          <w:szCs w:val="21"/>
-        </w:rPr>
-        <w:lastRenderedPageBreak/>
-        <w:t>和目标分别为</w:t>
+          <w:rFonts w:ascii="Times New Roman" w:hAnsi="Times New Roman" w:eastAsia="宋体" w:cs="Times New Roman"/>
+          <w:sz w:val="21"/>
+          <w:szCs w:val="21"/>
+        </w:rPr>
+        <w:t>个样本的输入和目标分别为</w:t>
       </w:r>
     </w:p>
     <w:p>
@@ -1864,7 +1845,7 @@
       </w:pPr>
       <w:r>
         <w:rPr>
-          <w:rFonts w:eastAsia="宋体"/>
+          <w:rFonts w:ascii="Times New Roman" w:hAnsi="Times New Roman" w:eastAsia="宋体" w:cs="Times New Roman"/>
           <w:sz w:val="21"/>
           <w:szCs w:val="21"/>
         </w:rPr>
@@ -1872,7 +1853,7 @@
       </w:r>
       <w:r>
         <w:rPr>
-          <w:rFonts w:eastAsia="宋体"/>
+          <w:rFonts w:ascii="Times New Roman" w:hAnsi="Times New Roman" w:eastAsia="宋体" w:cs="Times New Roman"/>
           <w:sz w:val="21"/>
           <w:szCs w:val="21"/>
           <w:i/>
@@ -1882,23 +1863,15 @@
       </w:r>
       <w:r>
         <w:rPr>
-          <w:rFonts w:eastAsia="宋体"/>
-          <w:sz w:val="21"/>
-          <w:szCs w:val="21"/>
-        </w:rPr>
-        <w:t>=96</w:t>
-      </w:r>
-      <w:r>
-        <w:rPr>
-          <w:rFonts w:eastAsia="宋体"/>
-          <w:sz w:val="21"/>
-          <w:szCs w:val="21"/>
-        </w:rPr>
-        <w:t>、预测长度</w:t>
-      </w:r>
-      <w:r>
-        <w:rPr>
-          <w:rFonts w:eastAsia="宋体"/>
+          <w:rFonts w:ascii="Times New Roman" w:hAnsi="Times New Roman" w:eastAsia="宋体" w:cs="Times New Roman"/>
+          <w:sz w:val="21"/>
+          <w:szCs w:val="21"/>
+        </w:rPr>
+        <w:t>=96、预测长度</w:t>
+      </w:r>
+      <w:r>
+        <w:rPr>
+          <w:rFonts w:ascii="Times New Roman" w:hAnsi="Times New Roman" w:eastAsia="宋体" w:cs="Times New Roman"/>
           <w:sz w:val="21"/>
           <w:szCs w:val="21"/>
           <w:i/>
@@ -1908,23 +1881,15 @@
       </w:r>
       <w:r>
         <w:rPr>
-          <w:rFonts w:eastAsia="宋体"/>
-          <w:sz w:val="21"/>
-          <w:szCs w:val="21"/>
-        </w:rPr>
-        <w:t>=24</w:t>
-      </w:r>
-      <w:r>
-        <w:rPr>
-          <w:rFonts w:eastAsia="宋体"/>
-          <w:sz w:val="21"/>
-          <w:szCs w:val="21"/>
-        </w:rPr>
-        <w:t>、变量数</w:t>
-      </w:r>
-      <w:r>
-        <w:rPr>
-          <w:rFonts w:eastAsia="宋体"/>
+          <w:rFonts w:ascii="Times New Roman" w:hAnsi="Times New Roman" w:eastAsia="宋体" w:cs="Times New Roman"/>
+          <w:sz w:val="21"/>
+          <w:szCs w:val="21"/>
+        </w:rPr>
+        <w:t>=24、变量数</w:t>
+      </w:r>
+      <w:r>
+        <w:rPr>
+          <w:rFonts w:ascii="Times New Roman" w:hAnsi="Times New Roman" w:eastAsia="宋体" w:cs="Times New Roman"/>
           <w:sz w:val="21"/>
           <w:szCs w:val="21"/>
           <w:i/>
@@ -1934,93 +1899,135 @@
       </w:r>
       <w:r>
         <w:rPr>
-          <w:rFonts w:eastAsia="宋体"/>
-          <w:sz w:val="21"/>
-          <w:szCs w:val="21"/>
-        </w:rPr>
-        <w:t>=144</w:t>
-      </w:r>
-      <w:r>
-        <w:rPr>
-          <w:rFonts w:eastAsia="宋体"/>
-          <w:sz w:val="21"/>
-          <w:szCs w:val="21"/>
-        </w:rPr>
-        <w:t>，学习映射</w:t>
-      </w:r>
-      <w:r>
-        <w:rPr>
-          <w:rFonts w:eastAsia="宋体"/>
-          <w:sz w:val="21"/>
-          <w:szCs w:val="21"/>
-        </w:rPr>
-        <w:t>Ŷ_</w:t>
-      </w:r>
-      <w:r>
-        <w:rPr>
-          <w:rFonts w:eastAsia="宋体"/>
+          <w:rFonts w:ascii="Times New Roman" w:hAnsi="Times New Roman" w:eastAsia="宋体" w:cs="Times New Roman"/>
+          <w:sz w:val="21"/>
+          <w:szCs w:val="21"/>
+        </w:rPr>
+        <w:t>=144，学习映射</w:t>
+      </w:r>
+      <w:r>
+        <w:rPr>
+          <w:rFonts w:ascii="Times New Roman" w:hAnsi="Times New Roman" w:eastAsia="宋体" w:cs="Times New Roman"/>
           <w:sz w:val="21"/>
           <w:szCs w:val="21"/>
           <w:i/>
           <w:iCs/>
-        </w:rPr>
-        <w:t>n</w:t>
-      </w:r>
-      <w:r>
-        <w:rPr>
-          <w:rFonts w:eastAsia="宋体"/>
-          <w:sz w:val="21"/>
-          <w:szCs w:val="21"/>
-        </w:rPr>
-        <w:t>=f_θ(X_</w:t>
-      </w:r>
-      <w:r>
-        <w:rPr>
-          <w:rFonts w:eastAsia="宋体"/>
+          <w:b/>
+          <w:bCs/>
+        </w:rPr>
+        <w:t>Ŷ</w:t>
+      </w:r>
+      <w:r>
+        <w:rPr>
+          <w:rFonts w:ascii="Times New Roman" w:hAnsi="Times New Roman" w:eastAsia="宋体" w:cs="Times New Roman"/>
           <w:sz w:val="21"/>
           <w:szCs w:val="21"/>
           <w:i/>
           <w:iCs/>
+          <w:vertAlign w:val="subscript"/>
         </w:rPr>
         <w:t>n</w:t>
       </w:r>
       <w:r>
         <w:rPr>
-          <w:rFonts w:eastAsia="宋体"/>
-          <w:sz w:val="21"/>
-          <w:szCs w:val="21"/>
-        </w:rPr>
-        <w:t>)</w:t>
-      </w:r>
-      <w:r>
-        <w:rPr>
-          <w:rFonts w:eastAsia="宋体"/>
-          <w:sz w:val="21"/>
-          <w:szCs w:val="21"/>
-        </w:rPr>
-        <w:t>。原始非负流量</w:t>
-      </w:r>
-      <w:r>
-        <w:rPr>
-          <w:rFonts w:eastAsia="宋体"/>
+          <w:rFonts w:ascii="Times New Roman" w:hAnsi="Times New Roman" w:eastAsia="宋体" w:cs="Times New Roman"/>
+          <w:sz w:val="21"/>
+          <w:szCs w:val="21"/>
+        </w:rPr>
+        <w:t>=</w:t>
+      </w:r>
+      <w:r>
+        <w:rPr>
+          <w:rFonts w:ascii="Times New Roman" w:hAnsi="Times New Roman" w:eastAsia="宋体" w:cs="Times New Roman"/>
           <w:sz w:val="21"/>
           <w:szCs w:val="21"/>
           <w:i/>
           <w:iCs/>
         </w:rPr>
+        <w:t>f</w:t>
+      </w:r>
+      <w:r>
+        <w:rPr>
+          <w:rFonts w:ascii="Times New Roman" w:hAnsi="Times New Roman" w:eastAsia="宋体" w:cs="Times New Roman"/>
+          <w:sz w:val="21"/>
+          <w:szCs w:val="21"/>
+          <w:i/>
+          <w:iCs/>
+          <w:vertAlign w:val="subscript"/>
+        </w:rPr>
+        <w:t>θ</w:t>
+      </w:r>
+      <w:r>
+        <w:rPr>
+          <w:rFonts w:ascii="Times New Roman" w:hAnsi="Times New Roman" w:eastAsia="宋体" w:cs="Times New Roman"/>
+          <w:sz w:val="21"/>
+          <w:szCs w:val="21"/>
+        </w:rPr>
+        <w:t>(</w:t>
+      </w:r>
+      <w:r>
+        <w:rPr>
+          <w:rFonts w:ascii="Times New Roman" w:hAnsi="Times New Roman" w:eastAsia="宋体" w:cs="Times New Roman"/>
+          <w:sz w:val="21"/>
+          <w:szCs w:val="21"/>
+          <w:i/>
+          <w:iCs/>
+          <w:b/>
+          <w:bCs/>
+        </w:rPr>
+        <w:t>X</w:t>
+      </w:r>
+      <w:r>
+        <w:rPr>
+          <w:rFonts w:ascii="Times New Roman" w:hAnsi="Times New Roman" w:eastAsia="宋体" w:cs="Times New Roman"/>
+          <w:sz w:val="21"/>
+          <w:szCs w:val="21"/>
+          <w:i/>
+          <w:iCs/>
+          <w:vertAlign w:val="subscript"/>
+        </w:rPr>
+        <w:t>n</w:t>
+      </w:r>
+      <w:r>
+        <w:rPr>
+          <w:rFonts w:ascii="Times New Roman" w:hAnsi="Times New Roman" w:eastAsia="宋体" w:cs="Times New Roman"/>
+          <w:sz w:val="21"/>
+          <w:szCs w:val="21"/>
+        </w:rPr>
+        <w:t>)</w:t>
+      </w:r>
+      <w:r>
+        <w:rPr>
+          <w:rFonts w:ascii="Times New Roman" w:hAnsi="Times New Roman" w:eastAsia="宋体" w:cs="Times New Roman"/>
+          <w:sz w:val="21"/>
+          <w:szCs w:val="21"/>
+        </w:rPr>
+        <w:t>。原始非负流量</w:t>
+      </w:r>
+      <w:r>
+        <w:rPr>
+          <w:rFonts w:ascii="Times New Roman" w:hAnsi="Times New Roman" w:eastAsia="宋体" w:cs="Times New Roman"/>
+          <w:sz w:val="21"/>
+          <w:szCs w:val="21"/>
+          <w:i/>
+          <w:iCs/>
+        </w:rPr>
         <w:t>v</w:t>
       </w:r>
       <w:r>
         <w:rPr>
-          <w:rFonts w:eastAsia="宋体"/>
-          <w:sz w:val="21"/>
-          <w:szCs w:val="21"/>
-        </w:rPr>
-        <w:t>_{t,c}</w:t>
-      </w:r>
-      <w:r>
-        <w:rPr>
-          <w:rFonts w:eastAsia="宋体"/>
+          <w:rFonts w:ascii="Times New Roman" w:hAnsi="Times New Roman" w:eastAsia="宋体" w:cs="Times New Roman"/>
+          <w:sz w:val="21"/>
+          <w:szCs w:val="21"/>
+          <w:i/>
+          <w:iCs/>
+          <w:vertAlign w:val="subscript"/>
+        </w:rPr>
+        <w:t>t,c</w:t>
+      </w:r>
+      <w:r>
+        <w:rPr>
+          <w:rFonts w:ascii="Times New Roman" w:hAnsi="Times New Roman" w:eastAsia="宋体" w:cs="Times New Roman"/>
           <w:sz w:val="21"/>
           <w:szCs w:val="21"/>
         </w:rPr>
@@ -2526,7 +2533,7 @@
       </w:pPr>
       <w:r>
         <w:rPr>
-          <w:rFonts w:eastAsia="宋体"/>
+          <w:rFonts w:ascii="Times New Roman" w:hAnsi="Times New Roman" w:eastAsia="宋体" w:cs="Times New Roman"/>
           <w:sz w:val="21"/>
           <w:szCs w:val="21"/>
         </w:rPr>
@@ -2534,115 +2541,79 @@
       </w:r>
       <w:r>
         <w:rPr>
-          <w:rFonts w:eastAsia="宋体"/>
-          <w:sz w:val="21"/>
-          <w:szCs w:val="21"/>
-        </w:rPr>
-        <w:t>μ_</w:t>
-      </w:r>
-      <w:r>
-        <w:rPr>
-          <w:rFonts w:eastAsia="宋体"/>
+          <w:rFonts w:ascii="Times New Roman" w:hAnsi="Times New Roman" w:eastAsia="宋体" w:cs="Times New Roman"/>
           <w:sz w:val="21"/>
           <w:szCs w:val="21"/>
           <w:i/>
           <w:iCs/>
         </w:rPr>
-        <w:t>c</w:t>
-      </w:r>
-      <w:r>
-        <w:rPr>
-          <w:rFonts w:eastAsia="宋体"/>
-          <w:sz w:val="21"/>
-          <w:szCs w:val="21"/>
-        </w:rPr>
-        <w:t>^{tr}</w:t>
-      </w:r>
-      <w:r>
-        <w:rPr>
-          <w:rFonts w:eastAsia="宋体"/>
-          <w:sz w:val="21"/>
-          <w:szCs w:val="21"/>
-        </w:rPr>
-        <w:t>和</w:t>
-      </w:r>
-      <w:r>
-        <w:rPr>
-          <w:rFonts w:eastAsia="宋体"/>
-          <w:sz w:val="21"/>
-          <w:szCs w:val="21"/>
-        </w:rPr>
-        <w:t>σ_</w:t>
-      </w:r>
-      <w:r>
-        <w:rPr>
-          <w:rFonts w:eastAsia="宋体"/>
+        <w:t>μ</w:t>
+      </w:r>
+      <w:r>
+        <w:rPr>
+          <w:rFonts w:ascii="Times New Roman" w:hAnsi="Times New Roman" w:eastAsia="宋体" w:cs="Times New Roman"/>
           <w:sz w:val="21"/>
           <w:szCs w:val="21"/>
           <w:i/>
           <w:iCs/>
+          <w:vertAlign w:val="subscript"/>
         </w:rPr>
         <w:t>c</w:t>
       </w:r>
       <w:r>
         <w:rPr>
-          <w:rFonts w:eastAsia="宋体"/>
-          <w:sz w:val="21"/>
-          <w:szCs w:val="21"/>
-        </w:rPr>
-        <w:t>^{tr}</w:t>
-      </w:r>
-      <w:r>
-        <w:rPr>
-          <w:rFonts w:eastAsia="宋体"/>
-          <w:sz w:val="21"/>
-          <w:szCs w:val="21"/>
-        </w:rPr>
-        <w:t>只由训练集计算，再用于验证集和测试集，避免未来信息进入训练过程。时间点按</w:t>
-      </w:r>
-      <w:r>
-        <w:rPr>
-          <w:rFonts w:eastAsia="宋体"/>
-          <w:sz w:val="21"/>
-          <w:szCs w:val="21"/>
-        </w:rPr>
-        <w:t>6</w:t>
-      </w:r>
-      <w:r>
-        <w:rPr>
-          <w:rFonts w:ascii="Cambria Math" w:hAnsi="Cambria Math" w:cs="Cambria Math"/>
-        </w:rPr>
-        <w:t>∶</w:t>
-      </w:r>
-      <w:r>
-        <w:rPr>
-          <w:rFonts w:eastAsia="宋体"/>
-          <w:sz w:val="21"/>
-          <w:szCs w:val="21"/>
-        </w:rPr>
-        <w:t>2</w:t>
-      </w:r>
-      <w:r>
-        <w:rPr>
-          <w:rFonts w:ascii="Cambria Math" w:hAnsi="Cambria Math" w:cs="Cambria Math"/>
-        </w:rPr>
-        <w:t>∶</w:t>
-      </w:r>
-      <w:r>
-        <w:rPr>
-          <w:rFonts w:eastAsia="宋体"/>
-          <w:sz w:val="21"/>
-          <w:szCs w:val="21"/>
-        </w:rPr>
-        <w:t>2</w:t>
-      </w:r>
-      <w:r>
-        <w:rPr>
-          <w:rFonts w:eastAsia="宋体"/>
-          <w:sz w:val="21"/>
-          <w:szCs w:val="21"/>
-        </w:rPr>
-        <w:t>顺序划分，不随机打乱原始时间位置；每个集合内部独立构造滑动窗口，避免跨边界使用数据。</w:t>
+          <w:rFonts w:ascii="Times New Roman" w:hAnsi="Times New Roman" w:eastAsia="宋体" w:cs="Times New Roman"/>
+          <w:sz w:val="21"/>
+          <w:szCs w:val="21"/>
+          <w:vertAlign w:val="superscript"/>
+        </w:rPr>
+        <w:t>tr</w:t>
+      </w:r>
+      <w:r>
+        <w:rPr>
+          <w:rFonts w:ascii="Times New Roman" w:hAnsi="Times New Roman" w:eastAsia="宋体" w:cs="Times New Roman"/>
+          <w:sz w:val="21"/>
+          <w:szCs w:val="21"/>
+        </w:rPr>
+        <w:t>和</w:t>
+      </w:r>
+      <w:r>
+        <w:rPr>
+          <w:rFonts w:ascii="Times New Roman" w:hAnsi="Times New Roman" w:eastAsia="宋体" w:cs="Times New Roman"/>
+          <w:sz w:val="21"/>
+          <w:szCs w:val="21"/>
+          <w:i/>
+          <w:iCs/>
+        </w:rPr>
+        <w:t>σ</w:t>
+      </w:r>
+      <w:r>
+        <w:rPr>
+          <w:rFonts w:ascii="Times New Roman" w:hAnsi="Times New Roman" w:eastAsia="宋体" w:cs="Times New Roman"/>
+          <w:sz w:val="21"/>
+          <w:szCs w:val="21"/>
+          <w:i/>
+          <w:iCs/>
+          <w:vertAlign w:val="subscript"/>
+        </w:rPr>
+        <w:t>c</w:t>
+      </w:r>
+      <w:r>
+        <w:rPr>
+          <w:rFonts w:ascii="Times New Roman" w:hAnsi="Times New Roman" w:eastAsia="宋体" w:cs="Times New Roman"/>
+          <w:sz w:val="21"/>
+          <w:szCs w:val="21"/>
+          <w:vertAlign w:val="superscript"/>
+        </w:rPr>
+        <w:t>tr</w:t>
+      </w:r>
+      <w:r>
+        <w:rPr>
+          <w:rFonts w:ascii="Times New Roman" w:hAnsi="Times New Roman" w:eastAsia="宋体" w:cs="Times New Roman"/>
+          <w:sz w:val="21"/>
+          <w:szCs w:val="21"/>
+        </w:rPr>
+        <w:t>只由训练集计算，再用于验证集和测试集，避免未来信息进入训练过程。时间点按6∶2∶2顺序划分，不随机打乱原始时间位置；每个集合内部独立构造滑动窗口，避免跨边界使用数据。</w:t>
       </w:r>
     </w:p>
     <w:p>
@@ -3955,7 +3926,7 @@
       </w:pPr>
       <w:r>
         <w:rPr>
-          <w:rFonts w:eastAsia="宋体"/>
+          <w:rFonts w:ascii="Times New Roman" w:hAnsi="Times New Roman" w:eastAsia="宋体" w:cs="Times New Roman"/>
           <w:sz w:val="21"/>
           <w:szCs w:val="21"/>
         </w:rPr>
@@ -3963,15 +3934,48 @@
       </w:r>
       <w:r>
         <w:rPr>
-          <w:rFonts w:eastAsia="宋体"/>
-          <w:sz w:val="21"/>
-          <w:szCs w:val="21"/>
-        </w:rPr>
-        <w:t>T^{(s)}</w:t>
-      </w:r>
-      <w:r>
-        <w:rPr>
-          <w:rFonts w:eastAsia="宋体"/>
+          <w:rFonts w:ascii="Times New Roman" w:hAnsi="Times New Roman" w:eastAsia="宋体" w:cs="Times New Roman"/>
+          <w:sz w:val="21"/>
+          <w:szCs w:val="21"/>
+          <w:i/>
+          <w:iCs/>
+          <w:b/>
+          <w:bCs/>
+        </w:rPr>
+        <w:t>T</w:t>
+      </w:r>
+      <w:r>
+        <w:rPr>
+          <w:rFonts w:ascii="Times New Roman" w:hAnsi="Times New Roman" w:eastAsia="宋体" w:cs="Times New Roman"/>
+          <w:sz w:val="21"/>
+          <w:szCs w:val="21"/>
+          <w:vertAlign w:val="superscript"/>
+        </w:rPr>
+        <w:t>(</w:t>
+      </w:r>
+      <w:r>
+        <w:rPr>
+          <w:rFonts w:ascii="Times New Roman" w:hAnsi="Times New Roman" w:eastAsia="宋体" w:cs="Times New Roman"/>
+          <w:sz w:val="21"/>
+          <w:szCs w:val="21"/>
+          <w:i/>
+          <w:iCs/>
+          <w:vertAlign w:val="superscript"/>
+        </w:rPr>
+        <w:t>s</w:t>
+      </w:r>
+      <w:r>
+        <w:rPr>
+          <w:rFonts w:ascii="Times New Roman" w:hAnsi="Times New Roman" w:eastAsia="宋体" w:cs="Times New Roman"/>
+          <w:sz w:val="21"/>
+          <w:szCs w:val="21"/>
+          <w:vertAlign w:val="superscript"/>
+        </w:rPr>
+        <w:t>)</w:t>
+      </w:r>
+      <w:r>
+        <w:rPr>
+          <w:rFonts w:ascii="Times New Roman" w:hAnsi="Times New Roman" w:eastAsia="宋体" w:cs="Times New Roman"/>
           <w:sz w:val="21"/>
           <w:szCs w:val="21"/>
         </w:rPr>
@@ -3979,15 +3983,48 @@
       </w:r>
       <w:r>
         <w:rPr>
-          <w:rFonts w:eastAsia="宋体"/>
-          <w:sz w:val="21"/>
-          <w:szCs w:val="21"/>
-        </w:rPr>
-        <w:t>R^{(s)}</w:t>
-      </w:r>
-      <w:r>
-        <w:rPr>
-          <w:rFonts w:eastAsia="宋体"/>
+          <w:rFonts w:ascii="Times New Roman" w:hAnsi="Times New Roman" w:eastAsia="宋体" w:cs="Times New Roman"/>
+          <w:sz w:val="21"/>
+          <w:szCs w:val="21"/>
+          <w:i/>
+          <w:iCs/>
+          <w:b/>
+          <w:bCs/>
+        </w:rPr>
+        <w:t>R</w:t>
+      </w:r>
+      <w:r>
+        <w:rPr>
+          <w:rFonts w:ascii="Times New Roman" w:hAnsi="Times New Roman" w:eastAsia="宋体" w:cs="Times New Roman"/>
+          <w:sz w:val="21"/>
+          <w:szCs w:val="21"/>
+          <w:vertAlign w:val="superscript"/>
+        </w:rPr>
+        <w:t>(</w:t>
+      </w:r>
+      <w:r>
+        <w:rPr>
+          <w:rFonts w:ascii="Times New Roman" w:hAnsi="Times New Roman" w:eastAsia="宋体" w:cs="Times New Roman"/>
+          <w:sz w:val="21"/>
+          <w:szCs w:val="21"/>
+          <w:i/>
+          <w:iCs/>
+          <w:vertAlign w:val="superscript"/>
+        </w:rPr>
+        <w:t>s</w:t>
+      </w:r>
+      <w:r>
+        <w:rPr>
+          <w:rFonts w:ascii="Times New Roman" w:hAnsi="Times New Roman" w:eastAsia="宋体" w:cs="Times New Roman"/>
+          <w:sz w:val="21"/>
+          <w:szCs w:val="21"/>
+          <w:vertAlign w:val="superscript"/>
+        </w:rPr>
+        <w:t>)</w:t>
+      </w:r>
+      <w:r>
+        <w:rPr>
+          <w:rFonts w:ascii="Times New Roman" w:hAnsi="Times New Roman" w:eastAsia="宋体" w:cs="Times New Roman"/>
           <w:sz w:val="21"/>
           <w:szCs w:val="21"/>
         </w:rPr>
@@ -3995,15 +4032,17 @@
       </w:r>
       <w:r>
         <w:rPr>
-          <w:rFonts w:eastAsia="宋体"/>
-          <w:sz w:val="21"/>
-          <w:szCs w:val="21"/>
+          <w:rFonts w:ascii="Times New Roman" w:hAnsi="Times New Roman" w:eastAsia="宋体" w:cs="Times New Roman"/>
+          <w:sz w:val="21"/>
+          <w:szCs w:val="21"/>
+          <w:i/>
+          <w:iCs/>
         </w:rPr>
         <w:t>H</w:t>
       </w:r>
       <w:r>
         <w:rPr>
-          <w:rFonts w:eastAsia="宋体"/>
+          <w:rFonts w:ascii="Times New Roman" w:hAnsi="Times New Roman" w:eastAsia="宋体" w:cs="Times New Roman"/>
           <w:sz w:val="21"/>
           <w:szCs w:val="21"/>
         </w:rPr>
@@ -4678,7 +4717,7 @@
       </w:pPr>
       <w:r>
         <w:rPr>
-          <w:rFonts w:eastAsia="宋体"/>
+          <w:rFonts w:ascii="Times New Roman" w:hAnsi="Times New Roman" w:eastAsia="宋体" w:cs="Times New Roman"/>
           <w:sz w:val="21"/>
           <w:szCs w:val="21"/>
         </w:rPr>
@@ -4686,153 +4725,181 @@
       </w:r>
       <w:r>
         <w:rPr>
-          <w:rFonts w:eastAsia="宋体"/>
-          <w:sz w:val="21"/>
-          <w:szCs w:val="21"/>
-        </w:rPr>
-        <w:t>X_</w:t>
-      </w:r>
-      <w:r>
-        <w:rPr>
-          <w:rFonts w:eastAsia="宋体"/>
+          <w:rFonts w:ascii="Times New Roman" w:hAnsi="Times New Roman" w:eastAsia="宋体" w:cs="Times New Roman"/>
           <w:sz w:val="21"/>
           <w:szCs w:val="21"/>
           <w:i/>
           <w:iCs/>
-        </w:rPr>
-        <w:t>n</w:t>
-      </w:r>
-      <w:r>
-        <w:rPr>
-          <w:rFonts w:eastAsia="宋体"/>
-          <w:sz w:val="21"/>
-          <w:szCs w:val="21"/>
-        </w:rPr>
-        <w:t>提取四维统计向量</w:t>
-      </w:r>
-      <w:r>
-        <w:rPr>
-          <w:rFonts w:eastAsia="宋体"/>
-          <w:sz w:val="21"/>
-          <w:szCs w:val="21"/>
-        </w:rPr>
-        <w:t>z_</w:t>
-      </w:r>
-      <w:r>
-        <w:rPr>
-          <w:rFonts w:eastAsia="宋体"/>
+          <w:b/>
+          <w:bCs/>
+        </w:rPr>
+        <w:t>X</w:t>
+      </w:r>
+      <w:r>
+        <w:rPr>
+          <w:rFonts w:ascii="Times New Roman" w:hAnsi="Times New Roman" w:eastAsia="宋体" w:cs="Times New Roman"/>
           <w:sz w:val="21"/>
           <w:szCs w:val="21"/>
           <w:i/>
           <w:iCs/>
+          <w:vertAlign w:val="subscript"/>
         </w:rPr>
         <w:t>n</w:t>
       </w:r>
       <w:r>
         <w:rPr>
-          <w:rFonts w:eastAsia="宋体"/>
-          <w:sz w:val="21"/>
-          <w:szCs w:val="21"/>
-        </w:rPr>
-        <w:t>=[μ_</w:t>
-      </w:r>
-      <w:r>
-        <w:rPr>
-          <w:rFonts w:eastAsia="宋体"/>
+          <w:rFonts w:ascii="Times New Roman" w:hAnsi="Times New Roman" w:eastAsia="宋体" w:cs="Times New Roman"/>
+          <w:sz w:val="21"/>
+          <w:szCs w:val="21"/>
+        </w:rPr>
+        <w:t>提取四维统计向量</w:t>
+      </w:r>
+      <w:r>
+        <w:rPr>
+          <w:rFonts w:ascii="Times New Roman" w:hAnsi="Times New Roman" w:eastAsia="宋体" w:cs="Times New Roman"/>
           <w:sz w:val="21"/>
           <w:szCs w:val="21"/>
           <w:i/>
           <w:iCs/>
-        </w:rPr>
-        <w:t>n</w:t>
-      </w:r>
-      <w:r>
-        <w:rPr>
-          <w:rFonts w:eastAsia="宋体"/>
-          <w:sz w:val="21"/>
-          <w:szCs w:val="21"/>
-        </w:rPr>
-        <w:t>,σ_</w:t>
-      </w:r>
-      <w:r>
-        <w:rPr>
-          <w:rFonts w:eastAsia="宋体"/>
+          <w:b/>
+          <w:bCs/>
+        </w:rPr>
+        <w:t>z</w:t>
+      </w:r>
+      <w:r>
+        <w:rPr>
+          <w:rFonts w:ascii="Times New Roman" w:hAnsi="Times New Roman" w:eastAsia="宋体" w:cs="Times New Roman"/>
           <w:sz w:val="21"/>
           <w:szCs w:val="21"/>
           <w:i/>
           <w:iCs/>
+          <w:vertAlign w:val="subscript"/>
         </w:rPr>
         <w:t>n</w:t>
       </w:r>
       <w:r>
         <w:rPr>
-          <w:rFonts w:eastAsia="宋体"/>
-          <w:sz w:val="21"/>
-          <w:szCs w:val="21"/>
-        </w:rPr>
-        <w:t>,ℓ_</w:t>
-      </w:r>
-      <w:r>
-        <w:rPr>
-          <w:rFonts w:eastAsia="宋体"/>
+          <w:rFonts w:ascii="Times New Roman" w:hAnsi="Times New Roman" w:eastAsia="宋体" w:cs="Times New Roman"/>
+          <w:sz w:val="21"/>
+          <w:szCs w:val="21"/>
+        </w:rPr>
+        <w:t>=[</w:t>
+      </w:r>
+      <w:r>
+        <w:rPr>
+          <w:rFonts w:ascii="Times New Roman" w:hAnsi="Times New Roman" w:eastAsia="宋体" w:cs="Times New Roman"/>
           <w:sz w:val="21"/>
           <w:szCs w:val="21"/>
           <w:i/>
           <w:iCs/>
         </w:rPr>
-        <w:t>n</w:t>
-      </w:r>
-      <w:r>
-        <w:rPr>
-          <w:rFonts w:eastAsia="宋体"/>
-          <w:sz w:val="21"/>
-          <w:szCs w:val="21"/>
-        </w:rPr>
-        <w:t>,</w:t>
-      </w:r>
-      <w:r>
-        <w:rPr>
-          <w:rFonts w:eastAsia="宋体"/>
+        <w:t>μ</w:t>
+      </w:r>
+      <w:r>
+        <w:rPr>
+          <w:rFonts w:ascii="Times New Roman" w:hAnsi="Times New Roman" w:eastAsia="宋体" w:cs="Times New Roman"/>
           <w:sz w:val="21"/>
           <w:szCs w:val="21"/>
           <w:i/>
           <w:iCs/>
-        </w:rPr>
-        <w:t>d</w:t>
-      </w:r>
-      <w:r>
-        <w:rPr>
-          <w:rFonts w:eastAsia="宋体"/>
-          <w:sz w:val="21"/>
-          <w:szCs w:val="21"/>
-        </w:rPr>
-        <w:t>_</w:t>
-      </w:r>
-      <w:r>
-        <w:rPr>
-          <w:rFonts w:eastAsia="宋体"/>
+          <w:vertAlign w:val="subscript"/>
+        </w:rPr>
+        <w:t>n</w:t>
+      </w:r>
+      <w:r>
+        <w:rPr>
+          <w:rFonts w:ascii="Times New Roman" w:hAnsi="Times New Roman" w:eastAsia="宋体" w:cs="Times New Roman"/>
+          <w:sz w:val="21"/>
+          <w:szCs w:val="21"/>
+        </w:rPr>
+        <w:t>,</w:t>
+      </w:r>
+      <w:r>
+        <w:rPr>
+          <w:rFonts w:ascii="Times New Roman" w:hAnsi="Times New Roman" w:eastAsia="宋体" w:cs="Times New Roman"/>
           <w:sz w:val="21"/>
           <w:szCs w:val="21"/>
           <w:i/>
           <w:iCs/>
         </w:rPr>
+        <w:t>σ</w:t>
+      </w:r>
+      <w:r>
+        <w:rPr>
+          <w:rFonts w:ascii="Times New Roman" w:hAnsi="Times New Roman" w:eastAsia="宋体" w:cs="Times New Roman"/>
+          <w:sz w:val="21"/>
+          <w:szCs w:val="21"/>
+          <w:i/>
+          <w:iCs/>
+          <w:vertAlign w:val="subscript"/>
+        </w:rPr>
         <w:t>n</w:t>
       </w:r>
       <w:r>
         <w:rPr>
-          <w:rFonts w:eastAsia="宋体"/>
-          <w:sz w:val="21"/>
-          <w:szCs w:val="21"/>
-        </w:rPr>
-        <w:t>]</w:t>
-      </w:r>
-      <w:r>
-        <w:rPr>
-          <w:rFonts w:eastAsia="宋体"/>
-          <w:sz w:val="21"/>
-          <w:szCs w:val="21"/>
-        </w:rPr>
-        <w:t>，其中</w:t>
+          <w:rFonts w:ascii="Times New Roman" w:hAnsi="Times New Roman" w:eastAsia="宋体" w:cs="Times New Roman"/>
+          <w:sz w:val="21"/>
+          <w:szCs w:val="21"/>
+        </w:rPr>
+        <w:t>,</w:t>
+      </w:r>
+      <w:r>
+        <w:rPr>
+          <w:rFonts w:ascii="Times New Roman" w:hAnsi="Times New Roman" w:eastAsia="宋体" w:cs="Times New Roman"/>
+          <w:sz w:val="21"/>
+          <w:szCs w:val="21"/>
+          <w:i/>
+          <w:iCs/>
+        </w:rPr>
+        <w:t>ℓ</w:t>
+      </w:r>
+      <w:r>
+        <w:rPr>
+          <w:rFonts w:ascii="Times New Roman" w:hAnsi="Times New Roman" w:eastAsia="宋体" w:cs="Times New Roman"/>
+          <w:sz w:val="21"/>
+          <w:szCs w:val="21"/>
+          <w:i/>
+          <w:iCs/>
+          <w:vertAlign w:val="subscript"/>
+        </w:rPr>
+        <w:t>n</w:t>
+      </w:r>
+      <w:r>
+        <w:rPr>
+          <w:rFonts w:ascii="Times New Roman" w:hAnsi="Times New Roman" w:eastAsia="宋体" w:cs="Times New Roman"/>
+          <w:sz w:val="21"/>
+          <w:szCs w:val="21"/>
+        </w:rPr>
+        <w:t>,</w:t>
+      </w:r>
+      <w:r>
+        <w:rPr>
+          <w:rFonts w:ascii="Times New Roman" w:hAnsi="Times New Roman" w:eastAsia="宋体" w:cs="Times New Roman"/>
+          <w:sz w:val="21"/>
+          <w:szCs w:val="21"/>
+          <w:i/>
+          <w:iCs/>
+        </w:rPr>
+        <w:t>d</w:t>
+      </w:r>
+      <w:r>
+        <w:rPr>
+          <w:rFonts w:ascii="Times New Roman" w:hAnsi="Times New Roman" w:eastAsia="宋体" w:cs="Times New Roman"/>
+          <w:sz w:val="21"/>
+          <w:szCs w:val="21"/>
+          <w:i/>
+          <w:iCs/>
+          <w:vertAlign w:val="subscript"/>
+        </w:rPr>
+        <w:t>n</w:t>
+      </w:r>
+      <w:r>
+        <w:rPr>
+          <w:rFonts w:ascii="Times New Roman" w:hAnsi="Times New Roman" w:eastAsia="宋体" w:cs="Times New Roman"/>
+          <w:sz w:val="21"/>
+          <w:szCs w:val="21"/>
+        </w:rPr>
+        <w:t>]，其中</w:t>
       </w:r>
     </w:p>
     <w:p>
@@ -5849,133 +5916,119 @@
       </w:pPr>
       <w:r>
         <w:rPr>
-          <w:rFonts w:eastAsia="宋体"/>
-          <w:sz w:val="21"/>
-          <w:szCs w:val="21"/>
-        </w:rPr>
-        <w:t>μ_</w:t>
-      </w:r>
-      <w:r>
-        <w:rPr>
-          <w:rFonts w:eastAsia="宋体"/>
+          <w:rFonts w:ascii="Times New Roman" w:hAnsi="Times New Roman" w:eastAsia="宋体" w:cs="Times New Roman"/>
           <w:sz w:val="21"/>
           <w:szCs w:val="21"/>
           <w:i/>
           <w:iCs/>
         </w:rPr>
-        <w:t>n</w:t>
-      </w:r>
-      <w:r>
-        <w:rPr>
-          <w:rFonts w:eastAsia="宋体"/>
-          <w:sz w:val="21"/>
-          <w:szCs w:val="21"/>
-        </w:rPr>
-        <w:t>描述窗口总体水平，</w:t>
-      </w:r>
-      <w:r>
-        <w:rPr>
-          <w:rFonts w:eastAsia="宋体"/>
-          <w:sz w:val="21"/>
-          <w:szCs w:val="21"/>
-        </w:rPr>
-        <w:t>σ_</w:t>
-      </w:r>
-      <w:r>
-        <w:rPr>
-          <w:rFonts w:eastAsia="宋体"/>
+        <w:t>μ</w:t>
+      </w:r>
+      <w:r>
+        <w:rPr>
+          <w:rFonts w:ascii="Times New Roman" w:hAnsi="Times New Roman" w:eastAsia="宋体" w:cs="Times New Roman"/>
           <w:sz w:val="21"/>
           <w:szCs w:val="21"/>
           <w:i/>
           <w:iCs/>
+          <w:vertAlign w:val="subscript"/>
         </w:rPr>
         <w:t>n</w:t>
       </w:r>
       <w:r>
         <w:rPr>
-          <w:rFonts w:eastAsia="宋体"/>
-          <w:sz w:val="21"/>
-          <w:szCs w:val="21"/>
-        </w:rPr>
-        <w:t>描述离散程度，</w:t>
-      </w:r>
-      <w:r>
-        <w:rPr>
-          <w:rFonts w:eastAsia="宋体"/>
-          <w:sz w:val="21"/>
-          <w:szCs w:val="21"/>
-        </w:rPr>
-        <w:t>ℓ_</w:t>
-      </w:r>
-      <w:r>
-        <w:rPr>
-          <w:rFonts w:eastAsia="宋体"/>
+          <w:rFonts w:ascii="Times New Roman" w:hAnsi="Times New Roman" w:eastAsia="宋体" w:cs="Times New Roman"/>
+          <w:sz w:val="21"/>
+          <w:szCs w:val="21"/>
+        </w:rPr>
+        <w:t>描述窗口总体水平，</w:t>
+      </w:r>
+      <w:r>
+        <w:rPr>
+          <w:rFonts w:ascii="Times New Roman" w:hAnsi="Times New Roman" w:eastAsia="宋体" w:cs="Times New Roman"/>
           <w:sz w:val="21"/>
           <w:szCs w:val="21"/>
           <w:i/>
           <w:iCs/>
         </w:rPr>
-        <w:t>n</w:t>
-      </w:r>
-      <w:r>
-        <w:rPr>
-          <w:rFonts w:eastAsia="宋体"/>
-          <w:sz w:val="21"/>
-          <w:szCs w:val="21"/>
-        </w:rPr>
-        <w:t>描述最近时刻状态，</w:t>
-      </w:r>
-      <w:r>
-        <w:rPr>
-          <w:rFonts w:eastAsia="宋体"/>
+        <w:t>σ</w:t>
+      </w:r>
+      <w:r>
+        <w:rPr>
+          <w:rFonts w:ascii="Times New Roman" w:hAnsi="Times New Roman" w:eastAsia="宋体" w:cs="Times New Roman"/>
           <w:sz w:val="21"/>
           <w:szCs w:val="21"/>
           <w:i/>
           <w:iCs/>
-        </w:rPr>
-        <w:t>d</w:t>
-      </w:r>
-      <w:r>
-        <w:rPr>
-          <w:rFonts w:eastAsia="宋体"/>
-          <w:sz w:val="21"/>
-          <w:szCs w:val="21"/>
-        </w:rPr>
-        <w:t>_</w:t>
-      </w:r>
-      <w:r>
-        <w:rPr>
-          <w:rFonts w:eastAsia="宋体"/>
+          <w:vertAlign w:val="subscript"/>
+        </w:rPr>
+        <w:t>n</w:t>
+      </w:r>
+      <w:r>
+        <w:rPr>
+          <w:rFonts w:ascii="Times New Roman" w:hAnsi="Times New Roman" w:eastAsia="宋体" w:cs="Times New Roman"/>
+          <w:sz w:val="21"/>
+          <w:szCs w:val="21"/>
+        </w:rPr>
+        <w:t>描述离散程度，</w:t>
+      </w:r>
+      <w:r>
+        <w:rPr>
+          <w:rFonts w:ascii="Times New Roman" w:hAnsi="Times New Roman" w:eastAsia="宋体" w:cs="Times New Roman"/>
           <w:sz w:val="21"/>
           <w:szCs w:val="21"/>
           <w:i/>
           <w:iCs/>
         </w:rPr>
+        <w:t>ℓ</w:t>
+      </w:r>
+      <w:r>
+        <w:rPr>
+          <w:rFonts w:ascii="Times New Roman" w:hAnsi="Times New Roman" w:eastAsia="宋体" w:cs="Times New Roman"/>
+          <w:sz w:val="21"/>
+          <w:szCs w:val="21"/>
+          <w:i/>
+          <w:iCs/>
+          <w:vertAlign w:val="subscript"/>
+        </w:rPr>
         <w:t>n</w:t>
       </w:r>
       <w:r>
         <w:rPr>
-          <w:rFonts w:eastAsia="宋体"/>
-          <w:sz w:val="21"/>
-          <w:szCs w:val="21"/>
-        </w:rPr>
-        <w:t>描述平均变化强度。四维向量经隐藏维数为</w:t>
-      </w:r>
-      <w:r>
-        <w:rPr>
-          <w:rFonts w:eastAsia="宋体"/>
-          <w:sz w:val="21"/>
-          <w:szCs w:val="21"/>
-        </w:rPr>
-        <w:t>16</w:t>
-      </w:r>
-      <w:r>
-        <w:rPr>
-          <w:rFonts w:eastAsia="宋体"/>
-          <w:sz w:val="21"/>
-          <w:szCs w:val="21"/>
-        </w:rPr>
-        <w:t>的两层感知器得到三个尺度分数：</w:t>
+          <w:rFonts w:ascii="Times New Roman" w:hAnsi="Times New Roman" w:eastAsia="宋体" w:cs="Times New Roman"/>
+          <w:sz w:val="21"/>
+          <w:szCs w:val="21"/>
+        </w:rPr>
+        <w:t>描述最近时刻状态，</w:t>
+      </w:r>
+      <w:r>
+        <w:rPr>
+          <w:rFonts w:ascii="Times New Roman" w:hAnsi="Times New Roman" w:eastAsia="宋体" w:cs="Times New Roman"/>
+          <w:sz w:val="21"/>
+          <w:szCs w:val="21"/>
+          <w:i/>
+          <w:iCs/>
+        </w:rPr>
+        <w:t>d</w:t>
+      </w:r>
+      <w:r>
+        <w:rPr>
+          <w:rFonts w:ascii="Times New Roman" w:hAnsi="Times New Roman" w:eastAsia="宋体" w:cs="Times New Roman"/>
+          <w:sz w:val="21"/>
+          <w:szCs w:val="21"/>
+          <w:i/>
+          <w:iCs/>
+          <w:vertAlign w:val="subscript"/>
+        </w:rPr>
+        <w:t>n</w:t>
+      </w:r>
+      <w:r>
+        <w:rPr>
+          <w:rFonts w:ascii="Times New Roman" w:hAnsi="Times New Roman" w:eastAsia="宋体" w:cs="Times New Roman"/>
+          <w:sz w:val="21"/>
+          <w:szCs w:val="21"/>
+        </w:rPr>
+        <w:t>描述平均变化强度。四维向量经隐藏维数为16的两层感知器得到三个尺度分数：</w:t>
       </w:r>
     </w:p>
     <w:p>
@@ -7037,43 +7090,40 @@
       </w:pPr>
       <w:r>
         <w:rPr>
-          <w:rFonts w:eastAsia="宋体"/>
-          <w:sz w:val="21"/>
-          <w:szCs w:val="21"/>
-        </w:rPr>
-        <w:t>每个样本单独生成一组权重，同一样本的全部</w:t>
-      </w:r>
-      <w:r>
-        <w:rPr>
-          <w:rFonts w:eastAsia="宋体"/>
-          <w:sz w:val="21"/>
-          <w:szCs w:val="21"/>
-        </w:rPr>
-        <w:t>OD</w:t>
-      </w:r>
-      <w:r>
-        <w:rPr>
-          <w:rFonts w:eastAsia="宋体"/>
-          <w:sz w:val="21"/>
-          <w:szCs w:val="21"/>
-        </w:rPr>
-        <w:t>变量共享该组权重。这是一种样本级而不是变量级路由，可控制复杂度并便于解释。固定等权消融令</w:t>
-      </w:r>
-      <w:r>
-        <w:rPr>
-          <w:rFonts w:eastAsia="宋体"/>
-          <w:sz w:val="21"/>
-          <w:szCs w:val="21"/>
-        </w:rPr>
-        <w:t>α_{n,s}=1/3</w:t>
-      </w:r>
-      <w:r>
-        <w:rPr>
-          <w:rFonts w:eastAsia="宋体"/>
-          <w:sz w:val="21"/>
-          <w:szCs w:val="21"/>
-        </w:rPr>
-        <w:t>，其他结构和训练过程完全不变，因此固定组与自适应组的误差差异主要反映权重生成方式。</w:t>
+          <w:rFonts w:ascii="Times New Roman" w:hAnsi="Times New Roman" w:eastAsia="宋体" w:cs="Times New Roman"/>
+          <w:sz w:val="21"/>
+          <w:szCs w:val="21"/>
+        </w:rPr>
+        <w:t>每个样本单独生成一组权重，同一样本的全部OD变量共享该组权重。这是一种样本级而不是变量级路由，可控制复杂度并便于解释。固定等权消融令</w:t>
+      </w:r>
+      <w:r>
+        <w:rPr>
+          <w:rFonts w:ascii="Times New Roman" w:hAnsi="Times New Roman" w:eastAsia="宋体" w:cs="Times New Roman"/>
+          <w:sz w:val="21"/>
+          <w:szCs w:val="21"/>
+          <w:i/>
+          <w:iCs/>
+        </w:rPr>
+        <w:t>α</w:t>
+      </w:r>
+      <w:r>
+        <w:rPr>
+          <w:rFonts w:ascii="Times New Roman" w:hAnsi="Times New Roman" w:eastAsia="宋体" w:cs="Times New Roman"/>
+          <w:sz w:val="21"/>
+          <w:szCs w:val="21"/>
+          <w:i/>
+          <w:iCs/>
+          <w:vertAlign w:val="subscript"/>
+        </w:rPr>
+        <w:t>n,s</w:t>
+      </w:r>
+      <w:r>
+        <w:rPr>
+          <w:rFonts w:ascii="Times New Roman" w:hAnsi="Times New Roman" w:eastAsia="宋体" w:cs="Times New Roman"/>
+          <w:sz w:val="21"/>
+          <w:szCs w:val="21"/>
+        </w:rPr>
+        <w:t>=1/3，其他结构和训练过程完全不变，因此固定组与自适应组的误差差异主要反映权重生成方式。</w:t>
       </w:r>
     </w:p>
     <w:p>
@@ -7118,7 +7168,7 @@
       </w:pPr>
       <w:r>
         <w:rPr>
-          <w:rFonts w:eastAsia="宋体"/>
+          <w:rFonts w:ascii="Times New Roman" w:hAnsi="Times New Roman" w:eastAsia="宋体" w:cs="Times New Roman"/>
           <w:sz w:val="21"/>
           <w:szCs w:val="21"/>
         </w:rPr>
@@ -7126,7 +7176,7 @@
       </w:r>
       <w:r>
         <w:rPr>
-          <w:rFonts w:eastAsia="宋体"/>
+          <w:rFonts w:ascii="Times New Roman" w:hAnsi="Times New Roman" w:eastAsia="宋体" w:cs="Times New Roman"/>
           <w:sz w:val="21"/>
           <w:szCs w:val="21"/>
           <w:i/>
@@ -7136,15 +7186,54 @@
       </w:r>
       <w:r>
         <w:rPr>
-          <w:rFonts w:eastAsia="宋体"/>
-          <w:sz w:val="21"/>
-          <w:szCs w:val="21"/>
-        </w:rPr>
-        <w:t>_s=L/s</w:t>
-      </w:r>
-      <w:r>
-        <w:rPr>
-          <w:rFonts w:eastAsia="宋体"/>
+          <w:rFonts w:ascii="Times New Roman" w:hAnsi="Times New Roman" w:eastAsia="宋体" w:cs="Times New Roman"/>
+          <w:sz w:val="21"/>
+          <w:szCs w:val="21"/>
+          <w:i/>
+          <w:iCs/>
+          <w:vertAlign w:val="subscript"/>
+        </w:rPr>
+        <w:t>s</w:t>
+      </w:r>
+      <w:r>
+        <w:rPr>
+          <w:rFonts w:ascii="Times New Roman" w:hAnsi="Times New Roman" w:eastAsia="宋体" w:cs="Times New Roman"/>
+          <w:sz w:val="21"/>
+          <w:szCs w:val="21"/>
+        </w:rPr>
+        <w:t>=</w:t>
+      </w:r>
+      <w:r>
+        <w:rPr>
+          <w:rFonts w:ascii="Times New Roman" w:hAnsi="Times New Roman" w:eastAsia="宋体" w:cs="Times New Roman"/>
+          <w:sz w:val="21"/>
+          <w:szCs w:val="21"/>
+          <w:i/>
+          <w:iCs/>
+        </w:rPr>
+        <w:t>L</w:t>
+      </w:r>
+      <w:r>
+        <w:rPr>
+          <w:rFonts w:ascii="Times New Roman" w:hAnsi="Times New Roman" w:eastAsia="宋体" w:cs="Times New Roman"/>
+          <w:sz w:val="21"/>
+          <w:szCs w:val="21"/>
+        </w:rPr>
+        <w:t>/</w:t>
+      </w:r>
+      <w:r>
+        <w:rPr>
+          <w:rFonts w:ascii="Times New Roman" w:hAnsi="Times New Roman" w:eastAsia="宋体" w:cs="Times New Roman"/>
+          <w:sz w:val="21"/>
+          <w:szCs w:val="21"/>
+          <w:i/>
+          <w:iCs/>
+        </w:rPr>
+        <w:t>s</w:t>
+      </w:r>
+      <w:r>
+        <w:rPr>
+          <w:rFonts w:ascii="Times New Roman" w:hAnsi="Times New Roman" w:eastAsia="宋体" w:cs="Times New Roman"/>
           <w:sz w:val="21"/>
           <w:szCs w:val="21"/>
         </w:rPr>
@@ -8070,61 +8159,158 @@
           <w:sz w:val="21"/>
           <w:szCs w:val="21"/>
         </w:rPr>
-        <w:t>式中，频域系数表示第n个样本在尺度s、频率索引k和变量c处的复数谱值，k为频率索引，j为虚数单位。</w:t>
-      </w:r>
-      <w:r>
-        <w:rPr>
-          <w:rFonts w:eastAsia="宋体"/>
-          <w:sz w:val="21"/>
-          <w:szCs w:val="21"/>
-        </w:rPr>
-        <w:t>实值快速傅里叶变换（real fast Fourier transform，RFFT）</w:t>
-      </w:r>
-      <w:r>
-        <w:rPr>
-          <w:rFonts w:eastAsia="宋体"/>
-          <w:sz w:val="21"/>
-          <w:szCs w:val="21"/>
-        </w:rPr>
-        <w:t>共有</w:t>
-      </w:r>
-      <w:r>
-        <w:rPr>
-          <w:rFonts w:eastAsia="宋体"/>
+        <w:t>式中，频域系数表示第</w:t>
+      </w:r>
+      <w:r>
+        <w:rPr>
+          <w:rFonts w:ascii="Times New Roman" w:hAnsi="Times New Roman" w:eastAsia="宋体" w:cs="Times New Roman"/>
           <w:sz w:val="21"/>
           <w:szCs w:val="21"/>
           <w:i/>
           <w:iCs/>
         </w:rPr>
+        <w:t>n</w:t>
+      </w:r>
+      <w:r>
+        <w:rPr>
+          <w:rFonts w:ascii="Times New Roman" w:hAnsi="Times New Roman" w:eastAsia="宋体" w:cs="Times New Roman"/>
+          <w:sz w:val="21"/>
+          <w:szCs w:val="21"/>
+        </w:rPr>
+        <w:t>个样本在尺度</w:t>
+      </w:r>
+      <w:r>
+        <w:rPr>
+          <w:rFonts w:ascii="Times New Roman" w:hAnsi="Times New Roman" w:eastAsia="宋体" w:cs="Times New Roman"/>
+          <w:sz w:val="21"/>
+          <w:szCs w:val="21"/>
+          <w:i/>
+          <w:iCs/>
+        </w:rPr>
+        <w:t>s</w:t>
+      </w:r>
+      <w:r>
+        <w:rPr>
+          <w:rFonts w:ascii="Times New Roman" w:hAnsi="Times New Roman" w:eastAsia="宋体" w:cs="Times New Roman"/>
+          <w:sz w:val="21"/>
+          <w:szCs w:val="21"/>
+        </w:rPr>
+        <w:t>、频率索引</w:t>
+      </w:r>
+      <w:r>
+        <w:rPr>
+          <w:rFonts w:ascii="Times New Roman" w:hAnsi="Times New Roman" w:eastAsia="宋体" w:cs="Times New Roman"/>
+          <w:sz w:val="21"/>
+          <w:szCs w:val="21"/>
+          <w:i/>
+          <w:iCs/>
+        </w:rPr>
+        <w:t>k</w:t>
+      </w:r>
+      <w:r>
+        <w:rPr>
+          <w:rFonts w:ascii="Times New Roman" w:hAnsi="Times New Roman" w:eastAsia="宋体" w:cs="Times New Roman"/>
+          <w:sz w:val="21"/>
+          <w:szCs w:val="21"/>
+        </w:rPr>
+        <w:t>和变量</w:t>
+      </w:r>
+      <w:r>
+        <w:rPr>
+          <w:rFonts w:ascii="Times New Roman" w:hAnsi="Times New Roman" w:eastAsia="宋体" w:cs="Times New Roman"/>
+          <w:sz w:val="21"/>
+          <w:szCs w:val="21"/>
+          <w:i/>
+          <w:iCs/>
+        </w:rPr>
+        <w:t>c</w:t>
+      </w:r>
+      <w:r>
+        <w:rPr>
+          <w:rFonts w:ascii="Times New Roman" w:hAnsi="Times New Roman" w:eastAsia="宋体" w:cs="Times New Roman"/>
+          <w:sz w:val="21"/>
+          <w:szCs w:val="21"/>
+        </w:rPr>
+        <w:t>处的复数谱值，</w:t>
+      </w:r>
+      <w:r>
+        <w:rPr>
+          <w:rFonts w:ascii="Times New Roman" w:hAnsi="Times New Roman" w:eastAsia="宋体" w:cs="Times New Roman"/>
+          <w:sz w:val="21"/>
+          <w:szCs w:val="21"/>
+          <w:i/>
+          <w:iCs/>
+        </w:rPr>
+        <w:t>k</w:t>
+      </w:r>
+      <w:r>
+        <w:rPr>
+          <w:rFonts w:ascii="Times New Roman" w:hAnsi="Times New Roman" w:eastAsia="宋体" w:cs="Times New Roman"/>
+          <w:sz w:val="21"/>
+          <w:szCs w:val="21"/>
+        </w:rPr>
+        <w:t>为频率索引，</w:t>
+      </w:r>
+      <w:r>
+        <w:rPr>
+          <w:rFonts w:ascii="Times New Roman" w:hAnsi="Times New Roman" w:eastAsia="宋体" w:cs="Times New Roman"/>
+          <w:sz w:val="21"/>
+          <w:szCs w:val="21"/>
+          <w:i/>
+          <w:iCs/>
+        </w:rPr>
+        <w:t>j</w:t>
+      </w:r>
+      <w:r>
+        <w:rPr>
+          <w:rFonts w:ascii="Times New Roman" w:hAnsi="Times New Roman" w:eastAsia="宋体" w:cs="Times New Roman"/>
+          <w:sz w:val="21"/>
+          <w:szCs w:val="21"/>
+        </w:rPr>
+        <w:t>为虚数单位。实值快速傅里叶变换（real fast Fourier transform，RFFT）共有</w:t>
+      </w:r>
+      <w:r>
+        <w:rPr>
+          <w:rFonts w:ascii="Times New Roman" w:hAnsi="Times New Roman" w:eastAsia="宋体" w:cs="Times New Roman"/>
+          <w:sz w:val="21"/>
+          <w:szCs w:val="21"/>
+          <w:i/>
+          <w:iCs/>
+        </w:rPr>
         <w:t>L</w:t>
       </w:r>
       <w:r>
         <w:rPr>
-          <w:rFonts w:eastAsia="宋体"/>
-          <w:sz w:val="21"/>
-          <w:szCs w:val="21"/>
-        </w:rPr>
-        <w:t>_s/2+1</w:t>
-      </w:r>
-      <w:r>
-        <w:rPr>
-          <w:rFonts w:eastAsia="宋体"/>
-          <w:sz w:val="21"/>
-          <w:szCs w:val="21"/>
-        </w:rPr>
-        <w:t>个非负频率。按比例</w:t>
-      </w:r>
-      <w:r>
-        <w:rPr>
-          <w:rFonts w:eastAsia="宋体"/>
-          <w:sz w:val="21"/>
-          <w:szCs w:val="21"/>
+          <w:rFonts w:ascii="Times New Roman" w:hAnsi="Times New Roman" w:eastAsia="宋体" w:cs="Times New Roman"/>
+          <w:sz w:val="21"/>
+          <w:szCs w:val="21"/>
+          <w:i/>
+          <w:iCs/>
+          <w:vertAlign w:val="subscript"/>
+        </w:rPr>
+        <w:t>s</w:t>
+      </w:r>
+      <w:r>
+        <w:rPr>
+          <w:rFonts w:ascii="Times New Roman" w:hAnsi="Times New Roman" w:eastAsia="宋体" w:cs="Times New Roman"/>
+          <w:sz w:val="21"/>
+          <w:szCs w:val="21"/>
+        </w:rPr>
+        <w:t>/2+1个非负频率。按比例</w:t>
+      </w:r>
+      <w:r>
+        <w:rPr>
+          <w:rFonts w:ascii="Times New Roman" w:hAnsi="Times New Roman" w:eastAsia="宋体" w:cs="Times New Roman"/>
+          <w:sz w:val="21"/>
+          <w:szCs w:val="21"/>
+          <w:i/>
+          <w:iCs/>
         </w:rPr>
         <w:t>r</w:t>
       </w:r>
       <w:r>
         <w:rPr>
-          <w:rFonts w:eastAsia="宋体"/>
+          <w:rFonts w:ascii="Times New Roman" w:hAnsi="Times New Roman" w:eastAsia="宋体" w:cs="Times New Roman"/>
           <w:sz w:val="21"/>
           <w:szCs w:val="21"/>
         </w:rPr>
@@ -10152,8 +10338,7 @@
     <w:p>
       <w:r>
         <w:rPr>
-          <w:rFonts w:eastAsia="宋体"/>
-          <w:color w:val="000000"/>
+          <w:rFonts w:ascii="Times New Roman" w:hAnsi="Times New Roman" w:eastAsia="宋体" w:cs="Times New Roman"/>
           <w:sz w:val="21"/>
           <w:szCs w:val="21"/>
         </w:rPr>
@@ -10161,8 +10346,7 @@
       </w:r>
       <w:r>
         <w:rPr>
-          <w:rFonts w:eastAsia="宋体"/>
-          <w:color w:val="000000"/>
+          <w:rFonts w:ascii="Times New Roman" w:hAnsi="Times New Roman" w:eastAsia="宋体" w:cs="Times New Roman"/>
           <w:sz w:val="21"/>
           <w:szCs w:val="21"/>
           <w:i/>
@@ -10172,24 +10356,20 @@
       </w:r>
       <w:r>
         <w:rPr>
-          <w:rFonts w:eastAsia="宋体"/>
-          <w:color w:val="000000"/>
-          <w:sz w:val="21"/>
-          <w:szCs w:val="21"/>
-        </w:rPr>
-        <w:t>_te个窗口，则MAE和RMSE分别为</w:t>
-      </w:r>
-      <w:r>
-        <w:rPr>
-          <w:color w:val="000000"/>
-        </w:rPr>
-        <w:t/>
-      </w:r>
-      <w:r>
-        <w:rPr>
-          <w:color w:val="000000"/>
-        </w:rPr>
-        <w:t/>
+          <w:rFonts w:ascii="Times New Roman" w:hAnsi="Times New Roman" w:eastAsia="宋体" w:cs="Times New Roman"/>
+          <w:sz w:val="21"/>
+          <w:szCs w:val="21"/>
+          <w:vertAlign w:val="subscript"/>
+        </w:rPr>
+        <w:t>te</w:t>
+      </w:r>
+      <w:r>
+        <w:rPr>
+          <w:rFonts w:ascii="Times New Roman" w:hAnsi="Times New Roman" w:eastAsia="宋体" w:cs="Times New Roman"/>
+          <w:sz w:val="21"/>
+          <w:szCs w:val="21"/>
+        </w:rPr>
+        <w:t>个窗口，则MAE和RMSE分别为</w:t>
       </w:r>
     </w:p>
     <w:p>
@@ -10605,286 +10785,74 @@
     <w:p>
       <w:r>
         <w:rPr>
-          <w:rFonts w:eastAsia="宋体"/>
-          <w:color w:val="000000"/>
-          <w:sz w:val="21"/>
-          <w:szCs w:val="21"/>
-        </w:rPr>
-        <w:t xml:space="preserve">上述指标均在标准化空间中计算，数值越小表示预测误差越低。由于RMSE是MSE的单调变换，正文表格主要报告MSE和MAE。各配置结果以3个随机种子的均值±样本标准差表示。固定权重与自适应权重使用相同随机种子进行双侧配对t检验，并报告配对差的95%置信区间（confidence interval，CI）及Cohen's </w:t>
-      </w:r>
-      <w:r>
-        <w:rPr>
-          <w:rFonts w:eastAsia="宋体"/>
-          <w:color w:val="000000"/>
+          <w:rFonts w:ascii="Times New Roman" w:hAnsi="Times New Roman" w:eastAsia="宋体" w:cs="Times New Roman"/>
+          <w:sz w:val="21"/>
+          <w:szCs w:val="21"/>
+        </w:rPr>
+        <w:t>上述指标均在标准化空间中计算，数值越小表示预测误差越低。由于RMSE是MSE的单调变换，正文表格主要报告MSE和MAE。各配置结果以3个随机种子的均值±样本标准差表示。固定权重与自适应权重使用相同随机种子进行双侧配对</w:t>
+      </w:r>
+      <w:r>
+        <w:rPr>
+          <w:rFonts w:ascii="Times New Roman" w:hAnsi="Times New Roman" w:eastAsia="宋体" w:cs="Times New Roman"/>
           <w:sz w:val="21"/>
           <w:szCs w:val="21"/>
           <w:i/>
           <w:iCs/>
         </w:rPr>
-        <w:t>d</w:t>
-      </w:r>
-      <w:r>
-        <w:rPr>
-          <w:rFonts w:eastAsia="宋体"/>
-          <w:color w:val="000000"/>
-          <w:sz w:val="21"/>
-          <w:szCs w:val="21"/>
-        </w:rPr>
-        <w:t>_z；</w:t>
-      </w:r>
-      <w:r>
-        <w:rPr>
-          <w:rFonts w:eastAsia="宋体"/>
-          <w:color w:val="000000"/>
+        <w:t>t</w:t>
+      </w:r>
+      <w:r>
+        <w:rPr>
+          <w:rFonts w:ascii="Times New Roman" w:hAnsi="Times New Roman" w:eastAsia="宋体" w:cs="Times New Roman"/>
+          <w:sz w:val="21"/>
+          <w:szCs w:val="21"/>
+        </w:rPr>
+        <w:t xml:space="preserve">检验，并报告配对差的95%置信区间（confidence interval，CI）及Cohen's </w:t>
+      </w:r>
+      <w:r>
+        <w:rPr>
+          <w:rFonts w:ascii="Times New Roman" w:hAnsi="Times New Roman" w:eastAsia="宋体" w:cs="Times New Roman"/>
           <w:sz w:val="21"/>
           <w:szCs w:val="21"/>
           <w:i/>
           <w:iCs/>
         </w:rPr>
+        <w:t>d</w:t>
+      </w:r>
+      <w:r>
+        <w:rPr>
+          <w:rFonts w:ascii="Times New Roman" w:hAnsi="Times New Roman" w:eastAsia="宋体" w:cs="Times New Roman"/>
+          <w:sz w:val="21"/>
+          <w:szCs w:val="21"/>
+          <w:vertAlign w:val="subscript"/>
+        </w:rPr>
+        <w:t>z</w:t>
+      </w:r>
+      <w:r>
+        <w:rPr>
+          <w:rFonts w:ascii="Times New Roman" w:hAnsi="Times New Roman" w:eastAsia="宋体" w:cs="Times New Roman"/>
+          <w:sz w:val="21"/>
+          <w:szCs w:val="21"/>
+        </w:rPr>
+        <w:t>；</w:t>
+      </w:r>
+      <w:r>
+        <w:rPr>
+          <w:rFonts w:ascii="Times New Roman" w:hAnsi="Times New Roman" w:eastAsia="宋体" w:cs="Times New Roman"/>
+          <w:sz w:val="21"/>
+          <w:szCs w:val="21"/>
+          <w:i/>
+          <w:iCs/>
+        </w:rPr>
         <w:t>r</w:t>
       </w:r>
       <w:r>
         <w:rPr>
-          <w:rFonts w:eastAsia="宋体"/>
-          <w:color w:val="000000"/>
+          <w:rFonts w:ascii="Times New Roman" w:hAnsi="Times New Roman" w:eastAsia="宋体" w:cs="Times New Roman"/>
           <w:sz w:val="21"/>
           <w:szCs w:val="21"/>
         </w:rPr>
         <w:t>=0.50下的两项预设比较采用Holm法校正。鉴于独立重复数仅为3，统计检验仅作为误差均值和离散程度的补充，不将813个测试窗口视为独立重复。</w:t>
-      </w:r>
-      <w:r>
-        <w:rPr>
-          <w:color w:val="000000"/>
-        </w:rPr>
-        <w:t/>
-      </w:r>
-      <w:r>
-        <w:rPr>
-          <w:color w:val="000000"/>
-        </w:rPr>
-        <w:t/>
-      </w:r>
-      <w:r>
-        <w:rPr>
-          <w:color w:val="000000"/>
-        </w:rPr>
-        <w:t/>
-      </w:r>
-      <w:r>
-        <w:rPr>
-          <w:color w:val="000000"/>
-        </w:rPr>
-        <w:t/>
-      </w:r>
-      <w:r>
-        <w:rPr>
-          <w:color w:val="000000"/>
-        </w:rPr>
-        <w:t/>
-      </w:r>
-      <w:r>
-        <w:rPr>
-          <w:color w:val="000000"/>
-        </w:rPr>
-        <w:t/>
-      </w:r>
-      <w:r>
-        <w:rPr>
-          <w:color w:val="000000"/>
-        </w:rPr>
-        <w:t/>
-      </w:r>
-      <w:r>
-        <w:rPr>
-          <w:color w:val="000000"/>
-        </w:rPr>
-        <w:t/>
-      </w:r>
-      <w:r>
-        <w:rPr>
-          <w:color w:val="000000"/>
-        </w:rPr>
-        <w:t/>
-      </w:r>
-      <w:r>
-        <w:rPr>
-          <w:color w:val="000000"/>
-        </w:rPr>
-        <w:t/>
-      </w:r>
-      <w:r>
-        <w:rPr>
-          <w:color w:val="000000"/>
-        </w:rPr>
-        <w:t/>
-      </w:r>
-      <w:r>
-        <w:rPr>
-          <w:color w:val="000000"/>
-        </w:rPr>
-        <w:t/>
-      </w:r>
-      <w:r>
-        <w:rPr>
-          <w:color w:val="000000"/>
-        </w:rPr>
-        <w:t/>
-      </w:r>
-      <w:r>
-        <w:rPr>
-          <w:color w:val="000000"/>
-        </w:rPr>
-        <w:t/>
-      </w:r>
-      <w:r>
-        <w:rPr>
-          <w:color w:val="000000"/>
-        </w:rPr>
-        <w:t/>
-      </w:r>
-      <w:r>
-        <w:rPr>
-          <w:color w:val="000000"/>
-        </w:rPr>
-        <w:t/>
-      </w:r>
-      <w:r>
-        <w:rPr>
-          <w:color w:val="000000"/>
-        </w:rPr>
-        <w:t/>
-      </w:r>
-      <w:r>
-        <w:rPr>
-          <w:color w:val="000000"/>
-        </w:rPr>
-        <w:t/>
-      </w:r>
-      <w:r>
-        <w:rPr>
-          <w:color w:val="000000"/>
-        </w:rPr>
-        <w:t/>
-      </w:r>
-      <w:r>
-        <w:rPr>
-          <w:color w:val="000000"/>
-        </w:rPr>
-        <w:t/>
-      </w:r>
-      <w:r>
-        <w:rPr>
-          <w:color w:val="000000"/>
-        </w:rPr>
-        <w:t/>
-      </w:r>
-      <w:r>
-        <w:rPr>
-          <w:color w:val="000000"/>
-        </w:rPr>
-        <w:t/>
-      </w:r>
-      <w:r>
-        <w:rPr>
-          <w:color w:val="000000"/>
-        </w:rPr>
-        <w:t/>
-      </w:r>
-      <w:r>
-        <w:rPr>
-          <w:color w:val="000000"/>
-        </w:rPr>
-        <w:t/>
-      </w:r>
-      <w:r>
-        <w:rPr>
-          <w:color w:val="000000"/>
-        </w:rPr>
-        <w:t/>
-      </w:r>
-      <w:r>
-        <w:rPr>
-          <w:color w:val="000000"/>
-        </w:rPr>
-        <w:t/>
-      </w:r>
-      <w:r>
-        <w:rPr>
-          <w:color w:val="000000"/>
-        </w:rPr>
-        <w:t/>
-      </w:r>
-      <w:r>
-        <w:rPr>
-          <w:color w:val="000000"/>
-        </w:rPr>
-        <w:t/>
-      </w:r>
-      <w:r>
-        <w:rPr>
-          <w:color w:val="000000"/>
-        </w:rPr>
-        <w:t/>
-      </w:r>
-      <w:r>
-        <w:rPr>
-          <w:color w:val="000000"/>
-        </w:rPr>
-        <w:t/>
-      </w:r>
-      <w:r>
-        <w:rPr>
-          <w:color w:val="000000"/>
-        </w:rPr>
-        <w:t/>
-      </w:r>
-      <w:r>
-        <w:rPr>
-          <w:color w:val="000000"/>
-        </w:rPr>
-        <w:t/>
-      </w:r>
-      <w:r>
-        <w:rPr>
-          <w:color w:val="000000"/>
-        </w:rPr>
-        <w:t/>
-      </w:r>
-      <w:r>
-        <w:rPr>
-          <w:color w:val="000000"/>
-        </w:rPr>
-        <w:t/>
-      </w:r>
-      <w:r>
-        <w:rPr>
-          <w:color w:val="000000"/>
-        </w:rPr>
-        <w:t/>
-      </w:r>
-      <w:r>
-        <w:rPr>
-          <w:color w:val="000000"/>
-        </w:rPr>
-        <w:t/>
-      </w:r>
-      <w:r>
-        <w:rPr>
-          <w:color w:val="000000"/>
-        </w:rPr>
-        <w:t/>
-      </w:r>
-      <w:r>
-        <w:rPr>
-          <w:color w:val="000000"/>
-        </w:rPr>
-        <w:t/>
-      </w:r>
-      <w:r>
-        <w:rPr>
-          <w:color w:val="000000"/>
-        </w:rPr>
-        <w:t/>
       </w:r>
     </w:p>
     <w:p>
@@ -11540,12 +11508,21 @@
             </w:r>
             <w:r>
               <w:rPr>
-                <w:rFonts w:eastAsia="宋体"/>
-                <w:color w:val="000000"/>
+                <w:rFonts w:ascii="Times New Roman" w:hAnsi="Times New Roman" w:eastAsia="宋体" w:cs="Times New Roman"/>
                 <w:sz w:val="21"/>
                 <w:szCs w:val="21"/>
-              </w:rPr>
-              <w:t>r=0.50</w:t>
+                <w:i/>
+                <w:iCs/>
+              </w:rPr>
+              <w:t>r</w:t>
+            </w:r>
+            <w:r>
+              <w:rPr>
+                <w:rFonts w:ascii="Times New Roman" w:hAnsi="Times New Roman" w:eastAsia="宋体" w:cs="Times New Roman"/>
+                <w:sz w:val="21"/>
+                <w:szCs w:val="21"/>
+              </w:rPr>
+              <w:t>=0.50</w:t>
             </w:r>
             <w:r>
               <w:rPr>
@@ -11876,12 +11853,21 @@
             </w:r>
             <w:r>
               <w:rPr>
-                <w:rFonts w:eastAsia="宋体"/>
-                <w:color w:val="000000"/>
+                <w:rFonts w:ascii="Times New Roman" w:hAnsi="Times New Roman" w:eastAsia="宋体" w:cs="Times New Roman"/>
                 <w:sz w:val="21"/>
                 <w:szCs w:val="21"/>
-              </w:rPr>
-              <w:t>r=0.50</w:t>
+                <w:i/>
+                <w:iCs/>
+              </w:rPr>
+              <w:t>r</w:t>
+            </w:r>
+            <w:r>
+              <w:rPr>
+                <w:rFonts w:ascii="Times New Roman" w:hAnsi="Times New Roman" w:eastAsia="宋体" w:cs="Times New Roman"/>
+                <w:sz w:val="21"/>
+                <w:szCs w:val="21"/>
+              </w:rPr>
+              <w:t>=0.50</w:t>
             </w:r>
             <w:r>
               <w:rPr>
@@ -12333,8 +12319,7 @@
     <w:p>
       <w:r>
         <w:rPr>
-          <w:rFonts w:eastAsia="宋体"/>
-          <w:color w:val="000000"/>
+          <w:rFonts w:ascii="Times New Roman" w:hAnsi="Times New Roman" w:eastAsia="宋体" w:cs="Times New Roman"/>
           <w:sz w:val="21"/>
           <w:szCs w:val="21"/>
         </w:rPr>
@@ -12342,8 +12327,7 @@
       </w:r>
       <w:r>
         <w:rPr>
-          <w:rFonts w:eastAsia="宋体"/>
-          <w:color w:val="000000"/>
+          <w:rFonts w:ascii="Times New Roman" w:hAnsi="Times New Roman" w:eastAsia="宋体" w:cs="Times New Roman"/>
           <w:sz w:val="21"/>
           <w:szCs w:val="21"/>
           <w:i/>
@@ -12353,8 +12337,7 @@
       </w:r>
       <w:r>
         <w:rPr>
-          <w:rFonts w:eastAsia="宋体"/>
-          <w:color w:val="000000"/>
+          <w:rFonts w:ascii="Times New Roman" w:hAnsi="Times New Roman" w:eastAsia="宋体" w:cs="Times New Roman"/>
           <w:sz w:val="21"/>
           <w:szCs w:val="21"/>
         </w:rPr>
@@ -12362,8 +12345,7 @@
       </w:r>
       <w:r>
         <w:rPr>
-          <w:rFonts w:eastAsia="宋体"/>
-          <w:color w:val="000000"/>
+          <w:rFonts w:ascii="Times New Roman" w:hAnsi="Times New Roman" w:eastAsia="宋体" w:cs="Times New Roman"/>
           <w:sz w:val="21"/>
           <w:szCs w:val="21"/>
           <w:i/>
@@ -12373,8 +12355,7 @@
       </w:r>
       <w:r>
         <w:rPr>
-          <w:rFonts w:eastAsia="宋体"/>
-          <w:color w:val="000000"/>
+          <w:rFonts w:ascii="Times New Roman" w:hAnsi="Times New Roman" w:eastAsia="宋体" w:cs="Times New Roman"/>
           <w:sz w:val="21"/>
           <w:szCs w:val="21"/>
         </w:rPr>
@@ -12382,8 +12363,7 @@
       </w:r>
       <w:r>
         <w:rPr>
-          <w:rFonts w:eastAsia="宋体"/>
-          <w:color w:val="000000"/>
+          <w:rFonts w:ascii="Times New Roman" w:hAnsi="Times New Roman" w:eastAsia="宋体" w:cs="Times New Roman"/>
           <w:sz w:val="21"/>
           <w:szCs w:val="21"/>
           <w:i/>
@@ -12393,178 +12373,20 @@
       </w:r>
       <w:r>
         <w:rPr>
-          <w:rFonts w:eastAsia="宋体"/>
-          <w:color w:val="000000"/>
-          <w:sz w:val="21"/>
-          <w:szCs w:val="21"/>
-        </w:rPr>
-        <w:t>_z=7.876。三个随机种子的误差变化方向一致，说明在当前主模型设置下，自适应尺度权重比固定等权融合更有利于降低预测误差；受独立重复数限制，效应量和置信区间仍需谨慎解释。同种子配对变化见图3。</w:t>
-      </w:r>
-      <w:r>
-        <w:rPr>
-          <w:color w:val="000000"/>
-        </w:rPr>
-        <w:t/>
-      </w:r>
-      <w:r>
-        <w:rPr>
-          <w:color w:val="000000"/>
-        </w:rPr>
-        <w:t/>
-      </w:r>
-      <w:r>
-        <w:rPr>
-          <w:color w:val="000000"/>
-        </w:rPr>
-        <w:t/>
-      </w:r>
-      <w:r>
-        <w:rPr>
-          <w:color w:val="000000"/>
-        </w:rPr>
-        <w:t/>
-      </w:r>
-      <w:r>
-        <w:rPr>
-          <w:color w:val="000000"/>
-        </w:rPr>
-        <w:t/>
-      </w:r>
-      <w:r>
-        <w:rPr>
-          <w:color w:val="000000"/>
-        </w:rPr>
-        <w:t/>
-      </w:r>
-      <w:r>
-        <w:rPr>
-          <w:color w:val="000000"/>
-        </w:rPr>
-        <w:t/>
-      </w:r>
-      <w:r>
-        <w:rPr>
-          <w:color w:val="000000"/>
-        </w:rPr>
-        <w:t/>
-      </w:r>
-      <w:r>
-        <w:rPr>
-          <w:color w:val="000000"/>
-        </w:rPr>
-        <w:t/>
-      </w:r>
-      <w:r>
-        <w:rPr>
-          <w:color w:val="000000"/>
-        </w:rPr>
-        <w:t/>
-      </w:r>
-      <w:r>
-        <w:rPr>
-          <w:color w:val="000000"/>
-        </w:rPr>
-        <w:t/>
-      </w:r>
-      <w:r>
-        <w:rPr>
-          <w:color w:val="000000"/>
-        </w:rPr>
-        <w:t/>
-      </w:r>
-      <w:r>
-        <w:rPr>
-          <w:color w:val="000000"/>
-        </w:rPr>
-        <w:t/>
-      </w:r>
-      <w:r>
-        <w:rPr>
-          <w:color w:val="000000"/>
-        </w:rPr>
-        <w:t/>
-      </w:r>
-      <w:r>
-        <w:rPr>
-          <w:color w:val="000000"/>
-        </w:rPr>
-        <w:t/>
-      </w:r>
-      <w:r>
-        <w:rPr>
-          <w:color w:val="000000"/>
-        </w:rPr>
-        <w:t/>
-      </w:r>
-      <w:r>
-        <w:rPr>
-          <w:color w:val="000000"/>
-        </w:rPr>
-        <w:t/>
-      </w:r>
-      <w:r>
-        <w:rPr>
-          <w:color w:val="000000"/>
-        </w:rPr>
-        <w:t/>
-      </w:r>
-      <w:r>
-        <w:rPr>
-          <w:color w:val="000000"/>
-        </w:rPr>
-        <w:t/>
-      </w:r>
-      <w:r>
-        <w:rPr>
-          <w:color w:val="000000"/>
-        </w:rPr>
-        <w:t/>
-      </w:r>
-      <w:r>
-        <w:rPr>
-          <w:color w:val="000000"/>
-        </w:rPr>
-        <w:t/>
-      </w:r>
-      <w:r>
-        <w:rPr>
-          <w:color w:val="000000"/>
-        </w:rPr>
-        <w:t/>
-      </w:r>
-      <w:r>
-        <w:rPr>
-          <w:color w:val="000000"/>
-        </w:rPr>
-        <w:t/>
-      </w:r>
-      <w:r>
-        <w:rPr>
-          <w:color w:val="000000"/>
-        </w:rPr>
-        <w:t/>
-      </w:r>
-      <w:r>
-        <w:rPr>
-          <w:color w:val="000000"/>
-        </w:rPr>
-        <w:lastRenderedPageBreak/>
-        <w:t/>
-      </w:r>
-      <w:r>
-        <w:rPr>
-          <w:color w:val="000000"/>
-        </w:rPr>
-        <w:t/>
-      </w:r>
-      <w:r>
-        <w:t/>
-      </w:r>
-      <w:r>
-        <w:t/>
-      </w:r>
-      <w:r>
-        <w:t/>
+          <w:rFonts w:ascii="Times New Roman" w:hAnsi="Times New Roman" w:eastAsia="宋体" w:cs="Times New Roman"/>
+          <w:sz w:val="21"/>
+          <w:szCs w:val="21"/>
+          <w:vertAlign w:val="subscript"/>
+        </w:rPr>
+        <w:t>z</w:t>
+      </w:r>
+      <w:r>
+        <w:rPr>
+          <w:rFonts w:ascii="Times New Roman" w:hAnsi="Times New Roman" w:eastAsia="宋体" w:cs="Times New Roman"/>
+          <w:sz w:val="21"/>
+          <w:szCs w:val="21"/>
+        </w:rPr>
+        <w:t>=7.876。三个随机种子的误差变化方向一致，说明在当前主模型设置下，自适应尺度权重比固定等权融合更有利于降低预测误差；受独立重复数限制，效应量和置信区间仍需谨慎解释。同种子配对变化见图3。</w:t>
       </w:r>
     </w:p>
     <w:p>
@@ -13093,12 +12915,21 @@
             </w:pPr>
             <w:r>
               <w:rPr>
-                <w:rFonts w:eastAsia="宋体"/>
-                <w:color w:val="000000"/>
+                <w:rFonts w:ascii="Times New Roman" w:hAnsi="Times New Roman" w:eastAsia="宋体" w:cs="Times New Roman"/>
                 <w:sz w:val="21"/>
                 <w:szCs w:val="21"/>
-              </w:rPr>
-              <w:t>r=0.50</w:t>
+                <w:i/>
+                <w:iCs/>
+              </w:rPr>
+              <w:t>r</w:t>
+            </w:r>
+            <w:r>
+              <w:rPr>
+                <w:rFonts w:ascii="Times New Roman" w:hAnsi="Times New Roman" w:eastAsia="宋体" w:cs="Times New Roman"/>
+                <w:sz w:val="21"/>
+                <w:szCs w:val="21"/>
+              </w:rPr>
+              <w:t>=0.50</w:t>
             </w:r>
           </w:p>
         </w:tc>
@@ -13239,12 +13070,21 @@
             </w:pPr>
             <w:r>
               <w:rPr>
-                <w:rFonts w:eastAsia="宋体"/>
-                <w:color w:val="000000"/>
+                <w:rFonts w:ascii="Times New Roman" w:hAnsi="Times New Roman" w:eastAsia="宋体" w:cs="Times New Roman"/>
                 <w:sz w:val="21"/>
                 <w:szCs w:val="21"/>
-              </w:rPr>
-              <w:t>r=0.50</w:t>
+                <w:i/>
+                <w:iCs/>
+              </w:rPr>
+              <w:t>r</w:t>
+            </w:r>
+            <w:r>
+              <w:rPr>
+                <w:rFonts w:ascii="Times New Roman" w:hAnsi="Times New Roman" w:eastAsia="宋体" w:cs="Times New Roman"/>
+                <w:sz w:val="21"/>
+                <w:szCs w:val="21"/>
+              </w:rPr>
+              <w:t>=0.50</w:t>
             </w:r>
           </w:p>
         </w:tc>
@@ -13385,12 +13225,21 @@
             </w:pPr>
             <w:r>
               <w:rPr>
-                <w:rFonts w:eastAsia="宋体"/>
-                <w:color w:val="000000"/>
+                <w:rFonts w:ascii="Times New Roman" w:hAnsi="Times New Roman" w:eastAsia="宋体" w:cs="Times New Roman"/>
                 <w:sz w:val="21"/>
                 <w:szCs w:val="21"/>
-              </w:rPr>
-              <w:t>r=0.75</w:t>
+                <w:i/>
+                <w:iCs/>
+              </w:rPr>
+              <w:t>r</w:t>
+            </w:r>
+            <w:r>
+              <w:rPr>
+                <w:rFonts w:ascii="Times New Roman" w:hAnsi="Times New Roman" w:eastAsia="宋体" w:cs="Times New Roman"/>
+                <w:sz w:val="21"/>
+                <w:szCs w:val="21"/>
+              </w:rPr>
+              <w:t>=0.75</w:t>
             </w:r>
           </w:p>
         </w:tc>
@@ -13530,12 +13379,21 @@
             </w:pPr>
             <w:r>
               <w:rPr>
-                <w:rFonts w:eastAsia="宋体"/>
-                <w:color w:val="000000"/>
+                <w:rFonts w:ascii="Times New Roman" w:hAnsi="Times New Roman" w:eastAsia="宋体" w:cs="Times New Roman"/>
                 <w:sz w:val="21"/>
                 <w:szCs w:val="21"/>
-              </w:rPr>
-              <w:t>r=0.75</w:t>
+                <w:i/>
+                <w:iCs/>
+              </w:rPr>
+              <w:t>r</w:t>
+            </w:r>
+            <w:r>
+              <w:rPr>
+                <w:rFonts w:ascii="Times New Roman" w:hAnsi="Times New Roman" w:eastAsia="宋体" w:cs="Times New Roman"/>
+                <w:sz w:val="21"/>
+                <w:szCs w:val="21"/>
+              </w:rPr>
+              <w:t>=0.75</w:t>
             </w:r>
           </w:p>
         </w:tc>
@@ -13742,8 +13600,7 @@
     <w:p>
       <w:r>
         <w:rPr>
-          <w:rFonts w:eastAsia="宋体"/>
-          <w:color w:val="000000"/>
+          <w:rFonts w:ascii="Times New Roman" w:hAnsi="Times New Roman" w:eastAsia="宋体" w:cs="Times New Roman"/>
           <w:sz w:val="21"/>
           <w:szCs w:val="21"/>
         </w:rPr>
@@ -13751,8 +13608,7 @@
       </w:r>
       <w:r>
         <w:rPr>
-          <w:rFonts w:eastAsia="宋体"/>
-          <w:color w:val="000000"/>
+          <w:rFonts w:ascii="Times New Roman" w:hAnsi="Times New Roman" w:eastAsia="宋体" w:cs="Times New Roman"/>
           <w:sz w:val="21"/>
           <w:szCs w:val="21"/>
           <w:i/>
@@ -13762,8 +13618,7 @@
       </w:r>
       <w:r>
         <w:rPr>
-          <w:rFonts w:eastAsia="宋体"/>
-          <w:color w:val="000000"/>
+          <w:rFonts w:ascii="Times New Roman" w:hAnsi="Times New Roman" w:eastAsia="宋体" w:cs="Times New Roman"/>
           <w:sz w:val="21"/>
           <w:szCs w:val="21"/>
         </w:rPr>
@@ -13771,8 +13626,7 @@
       </w:r>
       <w:r>
         <w:rPr>
-          <w:rFonts w:eastAsia="宋体"/>
-          <w:color w:val="000000"/>
+          <w:rFonts w:ascii="Times New Roman" w:hAnsi="Times New Roman" w:eastAsia="宋体" w:cs="Times New Roman"/>
           <w:sz w:val="21"/>
           <w:szCs w:val="21"/>
           <w:i/>
@@ -13782,8 +13636,7 @@
       </w:r>
       <w:r>
         <w:rPr>
-          <w:rFonts w:eastAsia="宋体"/>
-          <w:color w:val="000000"/>
+          <w:rFonts w:ascii="Times New Roman" w:hAnsi="Times New Roman" w:eastAsia="宋体" w:cs="Times New Roman"/>
           <w:sz w:val="21"/>
           <w:szCs w:val="21"/>
         </w:rPr>
@@ -13791,8 +13644,7 @@
       </w:r>
       <w:r>
         <w:rPr>
-          <w:rFonts w:eastAsia="宋体"/>
-          <w:color w:val="000000"/>
+          <w:rFonts w:ascii="Times New Roman" w:hAnsi="Times New Roman" w:eastAsia="宋体" w:cs="Times New Roman"/>
           <w:sz w:val="21"/>
           <w:szCs w:val="21"/>
           <w:i/>
@@ -13802,8 +13654,7 @@
       </w:r>
       <w:r>
         <w:rPr>
-          <w:rFonts w:eastAsia="宋体"/>
-          <w:color w:val="000000"/>
+          <w:rFonts w:ascii="Times New Roman" w:hAnsi="Times New Roman" w:eastAsia="宋体" w:cs="Times New Roman"/>
           <w:sz w:val="21"/>
           <w:szCs w:val="21"/>
         </w:rPr>
@@ -13811,8 +13662,7 @@
       </w:r>
       <w:r>
         <w:rPr>
-          <w:rFonts w:eastAsia="宋体"/>
-          <w:color w:val="000000"/>
+          <w:rFonts w:ascii="Times New Roman" w:hAnsi="Times New Roman" w:eastAsia="宋体" w:cs="Times New Roman"/>
           <w:sz w:val="21"/>
           <w:szCs w:val="21"/>
           <w:i/>
@@ -13822,8 +13672,7 @@
       </w:r>
       <w:r>
         <w:rPr>
-          <w:rFonts w:eastAsia="宋体"/>
-          <w:color w:val="000000"/>
+          <w:rFonts w:ascii="Times New Roman" w:hAnsi="Times New Roman" w:eastAsia="宋体" w:cs="Times New Roman"/>
           <w:sz w:val="21"/>
           <w:szCs w:val="21"/>
         </w:rPr>
@@ -13831,8 +13680,7 @@
       </w:r>
       <w:r>
         <w:rPr>
-          <w:rFonts w:eastAsia="宋体"/>
-          <w:color w:val="000000"/>
+          <w:rFonts w:ascii="Times New Roman" w:hAnsi="Times New Roman" w:eastAsia="宋体" w:cs="Times New Roman"/>
           <w:sz w:val="21"/>
           <w:szCs w:val="21"/>
           <w:i/>
@@ -13842,8 +13690,7 @@
       </w:r>
       <w:r>
         <w:rPr>
-          <w:rFonts w:eastAsia="宋体"/>
-          <w:color w:val="000000"/>
+          <w:rFonts w:ascii="Times New Roman" w:hAnsi="Times New Roman" w:eastAsia="宋体" w:cs="Times New Roman"/>
           <w:sz w:val="21"/>
           <w:szCs w:val="21"/>
         </w:rPr>
@@ -13851,8 +13698,7 @@
       </w:r>
       <w:r>
         <w:rPr>
-          <w:rFonts w:eastAsia="宋体"/>
-          <w:color w:val="000000"/>
+          <w:rFonts w:ascii="Times New Roman" w:hAnsi="Times New Roman" w:eastAsia="宋体" w:cs="Times New Roman"/>
           <w:sz w:val="21"/>
           <w:szCs w:val="21"/>
           <w:i/>
@@ -13862,237 +13708,20 @@
       </w:r>
       <w:r>
         <w:rPr>
-          <w:rFonts w:eastAsia="宋体"/>
-          <w:color w:val="000000"/>
-          <w:sz w:val="21"/>
-          <w:szCs w:val="21"/>
-        </w:rPr>
-        <w:t>_z=2.003。由于两组频域设置下的置信区间均跨越0，因此只能将其视为与无频域结果方向一致的改善趋势，而不能作为显著性结论。路由权重在不同测试窗口中的变化及总体分布见图4。</w:t>
-      </w:r>
-      <w:r>
-        <w:rPr>
-          <w:color w:val="000000"/>
-        </w:rPr>
-        <w:t/>
-      </w:r>
-      <w:r>
-        <w:rPr>
-          <w:color w:val="000000"/>
-        </w:rPr>
-        <w:t/>
-      </w:r>
-      <w:r>
-        <w:rPr>
-          <w:color w:val="000000"/>
-        </w:rPr>
-        <w:t/>
-      </w:r>
-      <w:r>
-        <w:rPr>
-          <w:color w:val="000000"/>
-        </w:rPr>
-        <w:t/>
-      </w:r>
-      <w:r>
-        <w:rPr>
-          <w:color w:val="000000"/>
-        </w:rPr>
-        <w:t/>
-      </w:r>
-      <w:r>
-        <w:rPr>
-          <w:color w:val="000000"/>
-        </w:rPr>
-        <w:t/>
-      </w:r>
-      <w:r>
-        <w:rPr>
-          <w:color w:val="000000"/>
-        </w:rPr>
-        <w:t/>
-      </w:r>
-      <w:r>
-        <w:rPr>
-          <w:color w:val="000000"/>
-        </w:rPr>
-        <w:t/>
-      </w:r>
-      <w:r>
-        <w:rPr>
-          <w:color w:val="000000"/>
-        </w:rPr>
-        <w:t/>
-      </w:r>
-      <w:r>
-        <w:rPr>
-          <w:color w:val="000000"/>
-        </w:rPr>
-        <w:t/>
-      </w:r>
-      <w:r>
-        <w:rPr>
-          <w:color w:val="000000"/>
-        </w:rPr>
-        <w:t/>
-      </w:r>
-      <w:r>
-        <w:rPr>
-          <w:color w:val="000000"/>
-        </w:rPr>
-        <w:t/>
-      </w:r>
-      <w:r>
-        <w:rPr>
-          <w:color w:val="000000"/>
-        </w:rPr>
-        <w:t/>
-      </w:r>
-      <w:r>
-        <w:rPr>
-          <w:color w:val="000000"/>
-        </w:rPr>
-        <w:t/>
-      </w:r>
-      <w:r>
-        <w:rPr>
-          <w:color w:val="000000"/>
-        </w:rPr>
-        <w:t/>
-      </w:r>
-      <w:r>
-        <w:rPr>
-          <w:color w:val="000000"/>
-        </w:rPr>
-        <w:t/>
-      </w:r>
-      <w:r>
-        <w:rPr>
-          <w:color w:val="000000"/>
-        </w:rPr>
-        <w:t/>
-      </w:r>
-      <w:r>
-        <w:rPr>
-          <w:color w:val="000000"/>
-        </w:rPr>
-        <w:t/>
-      </w:r>
-      <w:r>
-        <w:rPr>
-          <w:color w:val="000000"/>
-        </w:rPr>
-        <w:t/>
-      </w:r>
-      <w:r>
-        <w:rPr>
-          <w:color w:val="000000"/>
-        </w:rPr>
-        <w:t/>
-      </w:r>
-      <w:r>
-        <w:rPr>
-          <w:color w:val="000000"/>
-        </w:rPr>
-        <w:t/>
-      </w:r>
-      <w:r>
-        <w:rPr>
-          <w:color w:val="000000"/>
-        </w:rPr>
-        <w:t/>
-      </w:r>
-      <w:r>
-        <w:rPr>
-          <w:color w:val="000000"/>
-        </w:rPr>
-        <w:t/>
-      </w:r>
-      <w:r>
-        <w:rPr>
-          <w:color w:val="000000"/>
-        </w:rPr>
-        <w:t/>
-      </w:r>
-      <w:r>
-        <w:rPr>
-          <w:color w:val="000000"/>
-        </w:rPr>
-        <w:t/>
-      </w:r>
-      <w:r>
-        <w:rPr>
-          <w:color w:val="000000"/>
-        </w:rPr>
-        <w:t/>
-      </w:r>
-      <w:r>
-        <w:rPr>
-          <w:color w:val="000000"/>
-        </w:rPr>
-        <w:t/>
-      </w:r>
-      <w:r>
-        <w:rPr>
-          <w:color w:val="000000"/>
-        </w:rPr>
-        <w:t/>
-      </w:r>
-      <w:r>
-        <w:rPr>
-          <w:color w:val="000000"/>
-        </w:rPr>
-        <w:t/>
-      </w:r>
-      <w:r>
-        <w:rPr>
-          <w:color w:val="000000"/>
-        </w:rPr>
-        <w:t/>
-      </w:r>
-      <w:r>
-        <w:rPr>
-          <w:color w:val="000000"/>
-        </w:rPr>
-        <w:t/>
-      </w:r>
-      <w:r>
-        <w:rPr>
-          <w:color w:val="000000"/>
-        </w:rPr>
-        <w:t/>
-      </w:r>
-      <w:r>
-        <w:rPr>
-          <w:color w:val="000000"/>
-        </w:rPr>
-        <w:t/>
-      </w:r>
-      <w:r>
-        <w:rPr>
-          <w:color w:val="000000"/>
-        </w:rPr>
-        <w:t/>
-      </w:r>
-      <w:r>
-        <w:rPr>
-          <w:color w:val="000000"/>
-        </w:rPr>
-        <w:t/>
-      </w:r>
-      <w:r>
-        <w:rPr>
-          <w:color w:val="000000"/>
-        </w:rPr>
-        <w:t/>
-      </w:r>
-      <w:r>
-        <w:t/>
-      </w:r>
-      <w:r>
-        <w:t/>
-      </w:r>
-      <w:r>
-        <w:t/>
+          <w:rFonts w:ascii="Times New Roman" w:hAnsi="Times New Roman" w:eastAsia="宋体" w:cs="Times New Roman"/>
+          <w:sz w:val="21"/>
+          <w:szCs w:val="21"/>
+          <w:vertAlign w:val="subscript"/>
+        </w:rPr>
+        <w:t>z</w:t>
+      </w:r>
+      <w:r>
+        <w:rPr>
+          <w:rFonts w:ascii="Times New Roman" w:hAnsi="Times New Roman" w:eastAsia="宋体" w:cs="Times New Roman"/>
+          <w:sz w:val="21"/>
+          <w:szCs w:val="21"/>
+        </w:rPr>
+        <w:t>=2.003。由于两组频域设置下的置信区间均跨越0，因此只能将其视为与无频域结果方向一致的改善趋势，而不能作为显著性结论。路由权重在不同测试窗口中的变化及总体分布见图4。</w:t>
       </w:r>
     </w:p>
     <w:p>
@@ -14474,6 +14103,8 @@
                 <w:color w:val="000000"/>
                 <w:sz w:val="21"/>
                 <w:szCs w:val="21"/>
+                <w:i/>
+                <w:iCs/>
               </w:rPr>
               <w:t>r</w:t>
             </w:r>

</xml_diff>

<commit_message>
finish journal requirement 15 vector typography
</commit_message>
<xml_diff>
--- a/word_output/2026.09.18v.docx
+++ b/word_output/2026.09.18v.docx
@@ -4312,6 +4312,9 @@
           </m:sSubSupPr>
           <m:e>
             <m:r>
+              <m:rPr>
+                <m:sty m:val="bi"/>
+              </m:rPr>
               <w:rPr>
                 <w:rFonts w:ascii="Cambria Math" w:eastAsia="Cambria Math" w:hAnsi="Cambria Math"/>
                 <w:kern w:val="0"/>
@@ -4538,6 +4541,9 @@
           </m:sSubSupPr>
           <m:e>
             <m:r>
+              <m:rPr>
+                <m:sty m:val="bi"/>
+              </m:rPr>
               <w:rPr>
                 <w:rFonts w:ascii="Cambria Math" w:eastAsia="Cambria Math" w:hAnsi="Cambria Math"/>
                 <w:kern w:val="0"/>
@@ -6068,6 +6074,9 @@
           </m:sSubPr>
           <m:e>
             <m:r>
+              <m:rPr>
+                <m:sty m:val="bi"/>
+              </m:rPr>
               <w:rPr>
                 <w:rFonts w:ascii="Cambria Math" w:eastAsia="Cambria Math" w:hAnsi="Cambria Math"/>
                 <w:kern w:val="0"/>
@@ -6224,6 +6233,9 @@
                   </m:sSubPr>
                   <m:e>
                     <m:r>
+                      <m:rPr>
+                        <m:sty m:val="bi"/>
+                      </m:rPr>
                       <w:rPr>
                         <w:rFonts w:ascii="Cambria Math" w:eastAsia="Cambria Math" w:hAnsi="Cambria Math"/>
                         <w:kern w:val="0"/>
@@ -6266,6 +6278,9 @@
           </m:sSubPr>
           <m:e>
             <m:r>
+              <m:rPr>
+                <m:sty m:val="bi"/>
+              </m:rPr>
               <w:rPr>
                 <w:rFonts w:ascii="Cambria Math" w:eastAsia="Cambria Math" w:hAnsi="Cambria Math"/>
                 <w:kern w:val="0"/>

</xml_diff>